<commit_message>
Update SRS to v1.1 for Help, RACSI matrix, and OBS linkage
Adds FR-RACSI-01..09 (new 3.15 RACSI Accountability Matrix section) and
FR-HELP-01..05 (new 3.16 Help & User Guide section), extends 3.3 OBS with
FR-OBS-06..08 covering cross-module linkage and per-node linked-item counts,
adds an OBS-tagging requirement to Business Rules/Controls/Risks &
Opportunities (FR-BR-04, FR-CTL-05, FR-RISK-06), and adds NFR-SEC-06 for
server-side enforcement of the one-Accountable-per-activity rule. Updates
the permission catalog appendix (72 codes / 22 modules), screens, REST API
group, data entities, glossary, and user-class tables to match. Renumbers
subsequent functional sections (Alerts through Audit Trail, now 3.17-3.21)
and bumps the document to Version 1.1.

Co-Authored-By: Claude Sonnet 5 <noreply@anthropic.com>
Claude-Session: https://claude.ai/code/session_01JawUecr4zdt3wAKeYty8P7
</commit_message>
<xml_diff>
--- a/ncp-solver/docs/NCP_Solver_SRS.docx
+++ b/ncp-solver/docs/NCP_Solver_SRS.docx
@@ -101,7 +101,7 @@
           <w:sz w:val="22"/>
           <w:szCs w:val="22"/>
         </w:rPr>
-        <w:t xml:space="preserve">Version 1.0</w:t>
+        <w:t xml:space="preserve">Version 1.1</w:t>
       </w:r>
     </w:p>
     <w:p>
@@ -266,7 +266,7 @@
           <w:sz w:val="24"/>
           <w:szCs w:val="24"/>
         </w:rPr>
-        <w:t xml:space="preserve">NCP Solver is a full-stack, multi-tenant, multi-language web application that manages non-conformities and problems (recorded as "NCP Sheets") through a structured seven-stage resolution process (E1-E7), augmented by rule-based AI agents, and surrounded by governance, risk, and compliance (GRC) modules: Business Rules, Controls (COSO framework), and Risks &amp; Opportunities, plus an independently versioned AI Use Cases Library. The application supports both independent-company and group-of-companies tenancy models, role-based access control across nine standard roles, and English/French/Arabic localization including full right-to-left layout.</w:t>
+        <w:t xml:space="preserve">NCP Solver is a full-stack, multi-tenant, multi-language web application that manages non-conformities and problems (recorded as "NCP Sheets") through a structured seven-stage resolution process (E1-E7), augmented by rule-based AI agents, and surrounded by governance, risk, and compliance (GRC) modules: Business Rules, Controls (COSO framework), Risks &amp; Opportunities, and a RACSI (Responsible/Accountable/Consulted/Support/Informed) accountability matrix, plus an independently versioned AI Use Cases Library. An Organizational Breakdown Structure (OBS) of sites/departments/services/teams underlies and links every one of these modules, and an in-app, searchable, multi-language Help guide documents them all. The application supports both independent-company and group-of-companies tenancy models, role-based access control across nine standard roles, and English/French/Arabic localization including full right-to-left layout.</w:t>
       </w:r>
     </w:p>
     <w:p>
@@ -1158,7 +1158,7 @@
                 <w:sz w:val="19"/>
                 <w:szCs w:val="19"/>
               </w:rPr>
-              <w:t xml:space="preserve">Organizational Breakdown Structure - the site/department/service/team tree.</w:t>
+              <w:t xml:space="preserve">Organizational Breakdown Structure - the site/department/service/team tree; the shared source of roles and named people that other modules, including RACSI, point back to.</w:t>
             </w:r>
           </w:p>
         </w:tc>
@@ -1192,6 +1192,72 @@
                 <w:sz w:val="19"/>
                 <w:szCs w:val="19"/>
               </w:rPr>
+              <w:t xml:space="preserve">RACSI</w:t>
+            </w:r>
+          </w:p>
+        </w:tc>
+        <w:tc>
+          <w:tcPr>
+            <w:tcW w:type="dxa" w:w="7346"/>
+            <w:tcBorders>
+              <w:top w:val="single" w:color="E3E3E4" w:sz="2"/>
+              <w:left w:val="single" w:color="E3E3E4" w:sz="2"/>
+              <w:bottom w:val="single" w:color="E3E3E4" w:sz="2"/>
+              <w:right w:val="single" w:color="E3E3E4" w:sz="2"/>
+            </w:tcBorders>
+            <w:shd w:fill="FFFFFF" w:val="clear"/>
+            <w:tcMar>
+              <w:top w:type="dxa" w:w="80"/>
+              <w:left w:type="dxa" w:w="100"/>
+              <w:bottom w:type="dxa" w:w="80"/>
+              <w:right w:type="dxa" w:w="100"/>
+            </w:tcMar>
+            <w:vAlign w:val="center"/>
+          </w:tcPr>
+          <w:p>
+            <w:r>
+              <w:rPr>
+                <w:rFonts w:ascii="Times New Roman" w:cs="Times New Roman" w:eastAsia="Times New Roman" w:hAnsi="Times New Roman"/>
+                <w:b w:val="false"/>
+                <w:bCs w:val="false"/>
+                <w:color w:val="58595B"/>
+                <w:sz w:val="19"/>
+                <w:szCs w:val="19"/>
+              </w:rPr>
+              <w:t xml:space="preserve">Responsible, Accountable, Consulted, Support, Informed - a five-role extension of the classic RACI accountability model; exactly one Accountable per activity, the other four roles allow multiple assignees.</w:t>
+            </w:r>
+          </w:p>
+        </w:tc>
+      </w:tr>
+      <w:tr>
+        <w:tc>
+          <w:tcPr>
+            <w:tcW w:type="dxa" w:w="2400"/>
+            <w:tcBorders>
+              <w:top w:val="single" w:color="E3E3E4" w:sz="2"/>
+              <w:left w:val="single" w:color="E3E3E4" w:sz="2"/>
+              <w:bottom w:val="single" w:color="E3E3E4" w:sz="2"/>
+              <w:right w:val="single" w:color="E3E3E4" w:sz="2"/>
+            </w:tcBorders>
+            <w:shd w:fill="F2F2F3" w:val="clear"/>
+            <w:tcMar>
+              <w:top w:type="dxa" w:w="80"/>
+              <w:left w:type="dxa" w:w="100"/>
+              <w:bottom w:type="dxa" w:w="80"/>
+              <w:right w:type="dxa" w:w="100"/>
+            </w:tcMar>
+            <w:vAlign w:val="center"/>
+          </w:tcPr>
+          <w:p>
+            <w:r>
+              <w:rPr>
+                <w:rFonts w:ascii="Times New Roman" w:cs="Times New Roman" w:eastAsia="Times New Roman" w:hAnsi="Times New Roman"/>
+                <w:b w:val="false"/>
+                <w:bCs w:val="false"/>
+                <w:color w:val="58595B"/>
+                <w:sz w:val="19"/>
+                <w:szCs w:val="19"/>
+              </w:rPr>
               <w:t xml:space="preserve">Multi-Tenant</w:t>
             </w:r>
           </w:p>
@@ -1205,7 +1271,7 @@
               <w:bottom w:val="single" w:color="E3E3E4" w:sz="2"/>
               <w:right w:val="single" w:color="E3E3E4" w:sz="2"/>
             </w:tcBorders>
-            <w:shd w:fill="FFFFFF" w:val="clear"/>
+            <w:shd w:fill="F2F2F3" w:val="clear"/>
             <w:tcMar>
               <w:top w:type="dxa" w:w="80"/>
               <w:left w:type="dxa" w:w="100"/>
@@ -1239,7 +1305,7 @@
               <w:bottom w:val="single" w:color="E3E3E4" w:sz="2"/>
               <w:right w:val="single" w:color="E3E3E4" w:sz="2"/>
             </w:tcBorders>
-            <w:shd w:fill="F2F2F3" w:val="clear"/>
+            <w:shd w:fill="FFFFFF" w:val="clear"/>
             <w:tcMar>
               <w:top w:type="dxa" w:w="80"/>
               <w:left w:type="dxa" w:w="100"/>
@@ -1271,7 +1337,7 @@
               <w:bottom w:val="single" w:color="E3E3E4" w:sz="2"/>
               <w:right w:val="single" w:color="E3E3E4" w:sz="2"/>
             </w:tcBorders>
-            <w:shd w:fill="F2F2F3" w:val="clear"/>
+            <w:shd w:fill="FFFFFF" w:val="clear"/>
             <w:tcMar>
               <w:top w:type="dxa" w:w="80"/>
               <w:left w:type="dxa" w:w="100"/>
@@ -1673,6 +1739,25 @@
           <w:sz w:val="24"/>
           <w:szCs w:val="24"/>
         </w:rPr>
+        <w:t xml:space="preserve">Maintain a RACSI accountability matrix — one Accountable, any number of Responsible/Consulted/Support/Informed, as roles or named people — per NCP process step and per linked governance item.</w:t>
+      </w:r>
+    </w:p>
+    <w:p>
+      <w:pPr>
+        <w:pStyle w:val="ListParagraph"/>
+        <w:numPr>
+          <w:ilvl w:val="0"/>
+          <w:numId w:val="2"/>
+        </w:numPr>
+        <w:spacing w:after="80"/>
+      </w:pPr>
+      <w:r>
+        <w:rPr>
+          <w:rFonts w:ascii="Times New Roman" w:cs="Times New Roman" w:eastAsia="Times New Roman" w:hAnsi="Times New Roman"/>
+          <w:color w:val="58595B"/>
+          <w:sz w:val="24"/>
+          <w:szCs w:val="24"/>
+        </w:rPr>
         <w:t xml:space="preserve">Provide full role-based access control across 9 standard roles and a live permission matrix editor.</w:t>
       </w:r>
     </w:p>
@@ -1692,7 +1777,7 @@
           <w:sz w:val="24"/>
           <w:szCs w:val="24"/>
         </w:rPr>
-        <w:t xml:space="preserve">Provide Group/Organization/Project hierarchy and an Organizational Breakdown Structure (OBS).</w:t>
+        <w:t xml:space="preserve">Provide Group/Organization/Project hierarchy and an Organizational Breakdown Structure (OBS) that links to Sheets, Business Rules, Controls, Risks/Opportunities, RACSI activities, and user role assignments, with live linked-item counts per node.</w:t>
       </w:r>
     </w:p>
     <w:p>
@@ -1735,6 +1820,25 @@
     </w:p>
     <w:p>
       <w:pPr>
+        <w:pStyle w:val="ListParagraph"/>
+        <w:numPr>
+          <w:ilvl w:val="0"/>
+          <w:numId w:val="2"/>
+        </w:numPr>
+        <w:spacing w:after="80"/>
+      </w:pPr>
+      <w:r>
+        <w:rPr>
+          <w:rFonts w:ascii="Times New Roman" w:cs="Times New Roman" w:eastAsia="Times New Roman" w:hAnsi="Times New Roman"/>
+          <w:color w:val="58595B"/>
+          <w:sz w:val="24"/>
+          <w:szCs w:val="24"/>
+        </w:rPr>
+        <w:t xml:space="preserve">Provide a searchable, multi-language in-app Help guide covering every module, open to all authenticated users.</w:t>
+      </w:r>
+    </w:p>
+    <w:p>
+      <w:pPr>
         <w:spacing w:after="120"/>
       </w:pPr>
     </w:p>
@@ -2064,7 +2168,7 @@
                 <w:sz w:val="19"/>
                 <w:szCs w:val="19"/>
               </w:rPr>
-              <w:t xml:space="preserve">Validates and closes Sheets; configures KPI thresholds; owns Controls and Business Rules; compliance reporting.</w:t>
+              <w:t xml:space="preserve">Validates and closes Sheets; configures KPI thresholds; owns Controls and Business Rules; full CRUD on the RACSI matrix; compliance reporting.</w:t>
             </w:r>
           </w:p>
         </w:tc>
@@ -2162,7 +2266,7 @@
                 <w:sz w:val="19"/>
                 <w:szCs w:val="19"/>
               </w:rPr>
-              <w:t xml:space="preserve">Creates/edits/validates Sheets; approves action plans; manages REX; owns Business Rules and Risks/Opportunities in scope.</w:t>
+              <w:t xml:space="preserve">Creates/edits/validates Sheets; approves action plans; manages REX; owns Business Rules and Risks/Opportunities in scope; creates/edits RACSI activities and assignments.</w:t>
             </w:r>
           </w:p>
         </w:tc>
@@ -2554,7 +2658,7 @@
                 <w:sz w:val="19"/>
                 <w:szCs w:val="19"/>
               </w:rPr>
-              <w:t xml:space="preserve">Views all Sheets in own department; department dashboard/reports; receives department-level alerts and risk visibility.</w:t>
+              <w:t xml:space="preserve">Views all Sheets in own department; department dashboard/reports; receives department-level alerts, risk visibility, and RACSI matrix visibility.</w:t>
             </w:r>
           </w:p>
         </w:tc>
@@ -2750,7 +2854,7 @@
                 <w:sz w:val="19"/>
                 <w:szCs w:val="19"/>
               </w:rPr>
-              <w:t xml:space="preserve">Read-only access to Sheets, reports, Business Rules, Controls, Risks/Opportunities, and the full audit trail.</w:t>
+              <w:t xml:space="preserve">Read-only access to Sheets, reports, Business Rules, Controls, Risks/Opportunities, the RACSI matrix, and the full audit trail.</w:t>
             </w:r>
           </w:p>
         </w:tc>
@@ -4075,7 +4179,7 @@
           <w:sz w:val="19"/>
           <w:szCs w:val="19"/>
         </w:rPr>
-        <w:t xml:space="preserve">A hierarchical site/department/service/team tree used to classify where a non-conformity occurred.</w:t>
+        <w:t xml:space="preserve">A hierarchical site/department/service/team tree used to classify where a non-conformity occurred, and the shared "who/where" backbone that Business Rules, Controls, Risks &amp; Opportunities, RACSI activities, and user role assignments all point back to.</w:t>
       </w:r>
     </w:p>
     <w:tbl>
@@ -4489,6 +4593,204 @@
                 <w:szCs w:val="19"/>
               </w:rPr>
               <w:t xml:space="preserve">The system shall prevent deleting an OBS node from breaking referential integrity by cascading or reassigning dependent records per the data model.</w:t>
+            </w:r>
+          </w:p>
+        </w:tc>
+      </w:tr>
+      <w:tr>
+        <w:tc>
+          <w:tcPr>
+            <w:tcW w:type="dxa" w:w="1500"/>
+            <w:tcBorders>
+              <w:top w:val="single" w:color="E3E3E4" w:sz="2"/>
+              <w:left w:val="single" w:color="E3E3E4" w:sz="2"/>
+              <w:bottom w:val="single" w:color="E3E3E4" w:sz="2"/>
+              <w:right w:val="single" w:color="E3E3E4" w:sz="2"/>
+            </w:tcBorders>
+            <w:shd w:fill="F2F2F3" w:val="clear"/>
+            <w:tcMar>
+              <w:top w:type="dxa" w:w="80"/>
+              <w:left w:type="dxa" w:w="100"/>
+              <w:bottom w:type="dxa" w:w="80"/>
+              <w:right w:type="dxa" w:w="100"/>
+            </w:tcMar>
+            <w:vAlign w:val="center"/>
+          </w:tcPr>
+          <w:p>
+            <w:r>
+              <w:rPr>
+                <w:rFonts w:ascii="Times New Roman" w:cs="Times New Roman" w:eastAsia="Times New Roman" w:hAnsi="Times New Roman"/>
+                <w:b w:val="false"/>
+                <w:bCs w:val="false"/>
+                <w:color w:val="58595B"/>
+                <w:sz w:val="19"/>
+                <w:szCs w:val="19"/>
+              </w:rPr>
+              <w:t xml:space="preserve">FR-OBS-06</w:t>
+            </w:r>
+          </w:p>
+        </w:tc>
+        <w:tc>
+          <w:tcPr>
+            <w:tcW w:type="dxa" w:w="8246"/>
+            <w:tcBorders>
+              <w:top w:val="single" w:color="E3E3E4" w:sz="2"/>
+              <w:left w:val="single" w:color="E3E3E4" w:sz="2"/>
+              <w:bottom w:val="single" w:color="E3E3E4" w:sz="2"/>
+              <w:right w:val="single" w:color="E3E3E4" w:sz="2"/>
+            </w:tcBorders>
+            <w:shd w:fill="F2F2F3" w:val="clear"/>
+            <w:tcMar>
+              <w:top w:type="dxa" w:w="80"/>
+              <w:left w:type="dxa" w:w="100"/>
+              <w:bottom w:type="dxa" w:w="80"/>
+              <w:right w:type="dxa" w:w="100"/>
+            </w:tcMar>
+            <w:vAlign w:val="center"/>
+          </w:tcPr>
+          <w:p>
+            <w:r>
+              <w:rPr>
+                <w:rFonts w:ascii="Times New Roman" w:cs="Times New Roman" w:eastAsia="Times New Roman" w:hAnsi="Times New Roman"/>
+                <w:b w:val="false"/>
+                <w:bCs w:val="false"/>
+                <w:color w:val="58595B"/>
+                <w:sz w:val="19"/>
+                <w:szCs w:val="19"/>
+              </w:rPr>
+              <w:t xml:space="preserve">The system shall allow a Business Rule, a Control, a Risk/Opportunity, and a RACSI Activity to each be optionally tagged with the OBS node that owns them.</w:t>
+            </w:r>
+          </w:p>
+        </w:tc>
+      </w:tr>
+      <w:tr>
+        <w:tc>
+          <w:tcPr>
+            <w:tcW w:type="dxa" w:w="1500"/>
+            <w:tcBorders>
+              <w:top w:val="single" w:color="E3E3E4" w:sz="2"/>
+              <w:left w:val="single" w:color="E3E3E4" w:sz="2"/>
+              <w:bottom w:val="single" w:color="E3E3E4" w:sz="2"/>
+              <w:right w:val="single" w:color="E3E3E4" w:sz="2"/>
+            </w:tcBorders>
+            <w:shd w:fill="FFFFFF" w:val="clear"/>
+            <w:tcMar>
+              <w:top w:type="dxa" w:w="80"/>
+              <w:left w:type="dxa" w:w="100"/>
+              <w:bottom w:type="dxa" w:w="80"/>
+              <w:right w:type="dxa" w:w="100"/>
+            </w:tcMar>
+            <w:vAlign w:val="center"/>
+          </w:tcPr>
+          <w:p>
+            <w:r>
+              <w:rPr>
+                <w:rFonts w:ascii="Times New Roman" w:cs="Times New Roman" w:eastAsia="Times New Roman" w:hAnsi="Times New Roman"/>
+                <w:b w:val="false"/>
+                <w:bCs w:val="false"/>
+                <w:color w:val="58595B"/>
+                <w:sz w:val="19"/>
+                <w:szCs w:val="19"/>
+              </w:rPr>
+              <w:t xml:space="preserve">FR-OBS-07</w:t>
+            </w:r>
+          </w:p>
+        </w:tc>
+        <w:tc>
+          <w:tcPr>
+            <w:tcW w:type="dxa" w:w="8246"/>
+            <w:tcBorders>
+              <w:top w:val="single" w:color="E3E3E4" w:sz="2"/>
+              <w:left w:val="single" w:color="E3E3E4" w:sz="2"/>
+              <w:bottom w:val="single" w:color="E3E3E4" w:sz="2"/>
+              <w:right w:val="single" w:color="E3E3E4" w:sz="2"/>
+            </w:tcBorders>
+            <w:shd w:fill="FFFFFF" w:val="clear"/>
+            <w:tcMar>
+              <w:top w:type="dxa" w:w="80"/>
+              <w:left w:type="dxa" w:w="100"/>
+              <w:bottom w:type="dxa" w:w="80"/>
+              <w:right w:type="dxa" w:w="100"/>
+            </w:tcMar>
+            <w:vAlign w:val="center"/>
+          </w:tcPr>
+          <w:p>
+            <w:r>
+              <w:rPr>
+                <w:rFonts w:ascii="Times New Roman" w:cs="Times New Roman" w:eastAsia="Times New Roman" w:hAnsi="Times New Roman"/>
+                <w:b w:val="false"/>
+                <w:bCs w:val="false"/>
+                <w:color w:val="58595B"/>
+                <w:sz w:val="19"/>
+                <w:szCs w:val="19"/>
+              </w:rPr>
+              <w:t xml:space="preserve">The system shall allow a user's role assignment to be scoped to a specific OBS node, giving that node a "home" set of people in addition to organizational units.</w:t>
+            </w:r>
+          </w:p>
+        </w:tc>
+      </w:tr>
+      <w:tr>
+        <w:tc>
+          <w:tcPr>
+            <w:tcW w:type="dxa" w:w="1500"/>
+            <w:tcBorders>
+              <w:top w:val="single" w:color="E3E3E4" w:sz="2"/>
+              <w:left w:val="single" w:color="E3E3E4" w:sz="2"/>
+              <w:bottom w:val="single" w:color="E3E3E4" w:sz="2"/>
+              <w:right w:val="single" w:color="E3E3E4" w:sz="2"/>
+            </w:tcBorders>
+            <w:shd w:fill="F2F2F3" w:val="clear"/>
+            <w:tcMar>
+              <w:top w:type="dxa" w:w="80"/>
+              <w:left w:type="dxa" w:w="100"/>
+              <w:bottom w:type="dxa" w:w="80"/>
+              <w:right w:type="dxa" w:w="100"/>
+            </w:tcMar>
+            <w:vAlign w:val="center"/>
+          </w:tcPr>
+          <w:p>
+            <w:r>
+              <w:rPr>
+                <w:rFonts w:ascii="Times New Roman" w:cs="Times New Roman" w:eastAsia="Times New Roman" w:hAnsi="Times New Roman"/>
+                <w:b w:val="false"/>
+                <w:bCs w:val="false"/>
+                <w:color w:val="58595B"/>
+                <w:sz w:val="19"/>
+                <w:szCs w:val="19"/>
+              </w:rPr>
+              <w:t xml:space="preserve">FR-OBS-08</w:t>
+            </w:r>
+          </w:p>
+        </w:tc>
+        <w:tc>
+          <w:tcPr>
+            <w:tcW w:type="dxa" w:w="8246"/>
+            <w:tcBorders>
+              <w:top w:val="single" w:color="E3E3E4" w:sz="2"/>
+              <w:left w:val="single" w:color="E3E3E4" w:sz="2"/>
+              <w:bottom w:val="single" w:color="E3E3E4" w:sz="2"/>
+              <w:right w:val="single" w:color="E3E3E4" w:sz="2"/>
+            </w:tcBorders>
+            <w:shd w:fill="F2F2F3" w:val="clear"/>
+            <w:tcMar>
+              <w:top w:type="dxa" w:w="80"/>
+              <w:left w:type="dxa" w:w="100"/>
+              <w:bottom w:type="dxa" w:w="80"/>
+              <w:right w:type="dxa" w:w="100"/>
+            </w:tcMar>
+            <w:vAlign w:val="center"/>
+          </w:tcPr>
+          <w:p>
+            <w:r>
+              <w:rPr>
+                <w:rFonts w:ascii="Times New Roman" w:cs="Times New Roman" w:eastAsia="Times New Roman" w:hAnsi="Times New Roman"/>
+                <w:b w:val="false"/>
+                <w:bCs w:val="false"/>
+                <w:color w:val="58595B"/>
+                <w:sz w:val="19"/>
+                <w:szCs w:val="19"/>
+              </w:rPr>
+              <w:t xml:space="preserve">The system shall display, for every OBS node, a live count of every linked item type (people, NCP Sheets, Business Rules, Controls, Risks &amp; Opportunities, RACSI Activities) so accountability and activity concentration are visible at a glance.</w:t>
             </w:r>
           </w:p>
         </w:tc>
@@ -10361,6 +10663,72 @@
           </w:p>
         </w:tc>
       </w:tr>
+      <w:tr>
+        <w:tc>
+          <w:tcPr>
+            <w:tcW w:type="dxa" w:w="1500"/>
+            <w:tcBorders>
+              <w:top w:val="single" w:color="E3E3E4" w:sz="2"/>
+              <w:left w:val="single" w:color="E3E3E4" w:sz="2"/>
+              <w:bottom w:val="single" w:color="E3E3E4" w:sz="2"/>
+              <w:right w:val="single" w:color="E3E3E4" w:sz="2"/>
+            </w:tcBorders>
+            <w:shd w:fill="F2F2F3" w:val="clear"/>
+            <w:tcMar>
+              <w:top w:type="dxa" w:w="80"/>
+              <w:left w:type="dxa" w:w="100"/>
+              <w:bottom w:type="dxa" w:w="80"/>
+              <w:right w:type="dxa" w:w="100"/>
+            </w:tcMar>
+            <w:vAlign w:val="center"/>
+          </w:tcPr>
+          <w:p>
+            <w:r>
+              <w:rPr>
+                <w:rFonts w:ascii="Times New Roman" w:cs="Times New Roman" w:eastAsia="Times New Roman" w:hAnsi="Times New Roman"/>
+                <w:b w:val="false"/>
+                <w:bCs w:val="false"/>
+                <w:color w:val="58595B"/>
+                <w:sz w:val="19"/>
+                <w:szCs w:val="19"/>
+              </w:rPr>
+              <w:t xml:space="preserve">FR-BR-04</w:t>
+            </w:r>
+          </w:p>
+        </w:tc>
+        <w:tc>
+          <w:tcPr>
+            <w:tcW w:type="dxa" w:w="8246"/>
+            <w:tcBorders>
+              <w:top w:val="single" w:color="E3E3E4" w:sz="2"/>
+              <w:left w:val="single" w:color="E3E3E4" w:sz="2"/>
+              <w:bottom w:val="single" w:color="E3E3E4" w:sz="2"/>
+              <w:right w:val="single" w:color="E3E3E4" w:sz="2"/>
+            </w:tcBorders>
+            <w:shd w:fill="F2F2F3" w:val="clear"/>
+            <w:tcMar>
+              <w:top w:type="dxa" w:w="80"/>
+              <w:left w:type="dxa" w:w="100"/>
+              <w:bottom w:type="dxa" w:w="80"/>
+              <w:right w:type="dxa" w:w="100"/>
+            </w:tcMar>
+            <w:vAlign w:val="center"/>
+          </w:tcPr>
+          <w:p>
+            <w:r>
+              <w:rPr>
+                <w:rFonts w:ascii="Times New Roman" w:cs="Times New Roman" w:eastAsia="Times New Roman" w:hAnsi="Times New Roman"/>
+                <w:b w:val="false"/>
+                <w:bCs w:val="false"/>
+                <w:color w:val="58595B"/>
+                <w:sz w:val="19"/>
+                <w:szCs w:val="19"/>
+              </w:rPr>
+              <w:t xml:space="preserve">The system shall allow a Business Rule to be tagged with the owning OBS node and, via the RACSI matrix, with a named Accountable owner.</w:t>
+            </w:r>
+          </w:p>
+        </w:tc>
+      </w:tr>
     </w:tbl>
     <w:p>
       <w:pPr>
@@ -10749,6 +11117,72 @@
           </w:p>
         </w:tc>
       </w:tr>
+      <w:tr>
+        <w:tc>
+          <w:tcPr>
+            <w:tcW w:type="dxa" w:w="1500"/>
+            <w:tcBorders>
+              <w:top w:val="single" w:color="E3E3E4" w:sz="2"/>
+              <w:left w:val="single" w:color="E3E3E4" w:sz="2"/>
+              <w:bottom w:val="single" w:color="E3E3E4" w:sz="2"/>
+              <w:right w:val="single" w:color="E3E3E4" w:sz="2"/>
+            </w:tcBorders>
+            <w:shd w:fill="FFFFFF" w:val="clear"/>
+            <w:tcMar>
+              <w:top w:type="dxa" w:w="80"/>
+              <w:left w:type="dxa" w:w="100"/>
+              <w:bottom w:type="dxa" w:w="80"/>
+              <w:right w:type="dxa" w:w="100"/>
+            </w:tcMar>
+            <w:vAlign w:val="center"/>
+          </w:tcPr>
+          <w:p>
+            <w:r>
+              <w:rPr>
+                <w:rFonts w:ascii="Times New Roman" w:cs="Times New Roman" w:eastAsia="Times New Roman" w:hAnsi="Times New Roman"/>
+                <w:b w:val="false"/>
+                <w:bCs w:val="false"/>
+                <w:color w:val="58595B"/>
+                <w:sz w:val="19"/>
+                <w:szCs w:val="19"/>
+              </w:rPr>
+              <w:t xml:space="preserve">FR-CTL-05</w:t>
+            </w:r>
+          </w:p>
+        </w:tc>
+        <w:tc>
+          <w:tcPr>
+            <w:tcW w:type="dxa" w:w="8246"/>
+            <w:tcBorders>
+              <w:top w:val="single" w:color="E3E3E4" w:sz="2"/>
+              <w:left w:val="single" w:color="E3E3E4" w:sz="2"/>
+              <w:bottom w:val="single" w:color="E3E3E4" w:sz="2"/>
+              <w:right w:val="single" w:color="E3E3E4" w:sz="2"/>
+            </w:tcBorders>
+            <w:shd w:fill="FFFFFF" w:val="clear"/>
+            <w:tcMar>
+              <w:top w:type="dxa" w:w="80"/>
+              <w:left w:type="dxa" w:w="100"/>
+              <w:bottom w:type="dxa" w:w="80"/>
+              <w:right w:type="dxa" w:w="100"/>
+            </w:tcMar>
+            <w:vAlign w:val="center"/>
+          </w:tcPr>
+          <w:p>
+            <w:r>
+              <w:rPr>
+                <w:rFonts w:ascii="Times New Roman" w:cs="Times New Roman" w:eastAsia="Times New Roman" w:hAnsi="Times New Roman"/>
+                <w:b w:val="false"/>
+                <w:bCs w:val="false"/>
+                <w:color w:val="58595B"/>
+                <w:sz w:val="19"/>
+                <w:szCs w:val="19"/>
+              </w:rPr>
+              <w:t xml:space="preserve">The system shall allow a Control to be tagged with the owning OBS node and, via the RACSI matrix, with a named accountability structure for its periodic testing.</w:t>
+            </w:r>
+          </w:p>
+        </w:tc>
+      </w:tr>
     </w:tbl>
     <w:p>
       <w:pPr>
@@ -11203,6 +11637,72 @@
           </w:p>
         </w:tc>
       </w:tr>
+      <w:tr>
+        <w:tc>
+          <w:tcPr>
+            <w:tcW w:type="dxa" w:w="1500"/>
+            <w:tcBorders>
+              <w:top w:val="single" w:color="E3E3E4" w:sz="2"/>
+              <w:left w:val="single" w:color="E3E3E4" w:sz="2"/>
+              <w:bottom w:val="single" w:color="E3E3E4" w:sz="2"/>
+              <w:right w:val="single" w:color="E3E3E4" w:sz="2"/>
+            </w:tcBorders>
+            <w:shd w:fill="F2F2F3" w:val="clear"/>
+            <w:tcMar>
+              <w:top w:type="dxa" w:w="80"/>
+              <w:left w:type="dxa" w:w="100"/>
+              <w:bottom w:type="dxa" w:w="80"/>
+              <w:right w:type="dxa" w:w="100"/>
+            </w:tcMar>
+            <w:vAlign w:val="center"/>
+          </w:tcPr>
+          <w:p>
+            <w:r>
+              <w:rPr>
+                <w:rFonts w:ascii="Times New Roman" w:cs="Times New Roman" w:eastAsia="Times New Roman" w:hAnsi="Times New Roman"/>
+                <w:b w:val="false"/>
+                <w:bCs w:val="false"/>
+                <w:color w:val="58595B"/>
+                <w:sz w:val="19"/>
+                <w:szCs w:val="19"/>
+              </w:rPr>
+              <w:t xml:space="preserve">FR-RISK-06</w:t>
+            </w:r>
+          </w:p>
+        </w:tc>
+        <w:tc>
+          <w:tcPr>
+            <w:tcW w:type="dxa" w:w="8246"/>
+            <w:tcBorders>
+              <w:top w:val="single" w:color="E3E3E4" w:sz="2"/>
+              <w:left w:val="single" w:color="E3E3E4" w:sz="2"/>
+              <w:bottom w:val="single" w:color="E3E3E4" w:sz="2"/>
+              <w:right w:val="single" w:color="E3E3E4" w:sz="2"/>
+            </w:tcBorders>
+            <w:shd w:fill="F2F2F3" w:val="clear"/>
+            <w:tcMar>
+              <w:top w:type="dxa" w:w="80"/>
+              <w:left w:type="dxa" w:w="100"/>
+              <w:bottom w:type="dxa" w:w="80"/>
+              <w:right w:type="dxa" w:w="100"/>
+            </w:tcMar>
+            <w:vAlign w:val="center"/>
+          </w:tcPr>
+          <w:p>
+            <w:r>
+              <w:rPr>
+                <w:rFonts w:ascii="Times New Roman" w:cs="Times New Roman" w:eastAsia="Times New Roman" w:hAnsi="Times New Roman"/>
+                <w:b w:val="false"/>
+                <w:bCs w:val="false"/>
+                <w:color w:val="58595B"/>
+                <w:sz w:val="19"/>
+                <w:szCs w:val="19"/>
+              </w:rPr>
+              <w:t xml:space="preserve">The system shall allow a Risk/Opportunity to be tagged with the owning OBS node and, via the RACSI matrix, with a named accountability structure for its mitigation plan.</w:t>
+            </w:r>
+          </w:p>
+        </w:tc>
+      </w:tr>
     </w:tbl>
     <w:p>
       <w:pPr>
@@ -11223,7 +11723,1179 @@
           <w:sz w:val="27"/>
           <w:szCs w:val="27"/>
         </w:rPr>
-        <w:t xml:space="preserve">3.15 Alerts &amp; Notifications</w:t>
+        <w:t xml:space="preserve">3.15 RACSI Accountability Matrix</w:t>
+      </w:r>
+    </w:p>
+    <w:p>
+      <w:pPr>
+        <w:spacing w:after="200" w:before="60"/>
+      </w:pPr>
+      <w:r>
+        <w:rPr>
+          <w:rFonts w:ascii="Times New Roman" w:cs="Times New Roman" w:eastAsia="Times New Roman" w:hAnsi="Times New Roman"/>
+          <w:i/>
+          <w:iCs/>
+          <w:color w:val="58595B"/>
+          <w:sz w:val="19"/>
+          <w:szCs w:val="19"/>
+        </w:rPr>
+        <w:t xml:space="preserve">A Responsible/Accountable/Consulted/Support/Informed matrix assigning OBS-sourced roles or named people to each of the seven NCP process steps and to selected governance items, with full CRUD via RBAC.</w:t>
+      </w:r>
+    </w:p>
+    <w:tbl>
+      <w:tblPr>
+        <w:tblW w:type="dxa" w:w="9746"/>
+        <w:tblBorders>
+          <w:top w:val="single" w:color="auto" w:sz="4"/>
+          <w:left w:val="single" w:color="auto" w:sz="4"/>
+          <w:bottom w:val="single" w:color="auto" w:sz="4"/>
+          <w:right w:val="single" w:color="auto" w:sz="4"/>
+          <w:insideH w:val="single" w:color="auto" w:sz="4"/>
+          <w:insideV w:val="single" w:color="auto" w:sz="4"/>
+        </w:tblBorders>
+      </w:tblPr>
+      <w:tblGrid>
+        <w:gridCol w:w="1500"/>
+        <w:gridCol w:w="8246"/>
+      </w:tblGrid>
+      <w:tr>
+        <w:trPr>
+          <w:tblHeader/>
+        </w:trPr>
+        <w:tc>
+          <w:tcPr>
+            <w:tcW w:type="dxa" w:w="1500"/>
+            <w:tcBorders>
+              <w:top w:val="single" w:color="E3E3E4" w:sz="2"/>
+              <w:left w:val="single" w:color="E3E3E4" w:sz="2"/>
+              <w:bottom w:val="single" w:color="E3E3E4" w:sz="2"/>
+              <w:right w:val="single" w:color="E3E3E4" w:sz="2"/>
+            </w:tcBorders>
+            <w:shd w:fill="F8931D" w:val="clear"/>
+            <w:tcMar>
+              <w:top w:type="dxa" w:w="80"/>
+              <w:left w:type="dxa" w:w="100"/>
+              <w:bottom w:type="dxa" w:w="80"/>
+              <w:right w:type="dxa" w:w="100"/>
+            </w:tcMar>
+            <w:vAlign w:val="center"/>
+          </w:tcPr>
+          <w:p>
+            <w:r>
+              <w:rPr>
+                <w:rFonts w:ascii="Times New Roman" w:cs="Times New Roman" w:eastAsia="Times New Roman" w:hAnsi="Times New Roman"/>
+                <w:b/>
+                <w:bCs/>
+                <w:color w:val="FFFFFF"/>
+                <w:sz w:val="19"/>
+                <w:szCs w:val="19"/>
+              </w:rPr>
+              <w:t xml:space="preserve">ID</w:t>
+            </w:r>
+          </w:p>
+        </w:tc>
+        <w:tc>
+          <w:tcPr>
+            <w:tcW w:type="dxa" w:w="8246"/>
+            <w:tcBorders>
+              <w:top w:val="single" w:color="E3E3E4" w:sz="2"/>
+              <w:left w:val="single" w:color="E3E3E4" w:sz="2"/>
+              <w:bottom w:val="single" w:color="E3E3E4" w:sz="2"/>
+              <w:right w:val="single" w:color="E3E3E4" w:sz="2"/>
+            </w:tcBorders>
+            <w:shd w:fill="F8931D" w:val="clear"/>
+            <w:tcMar>
+              <w:top w:type="dxa" w:w="80"/>
+              <w:left w:type="dxa" w:w="100"/>
+              <w:bottom w:type="dxa" w:w="80"/>
+              <w:right w:type="dxa" w:w="100"/>
+            </w:tcMar>
+            <w:vAlign w:val="center"/>
+          </w:tcPr>
+          <w:p>
+            <w:r>
+              <w:rPr>
+                <w:rFonts w:ascii="Times New Roman" w:cs="Times New Roman" w:eastAsia="Times New Roman" w:hAnsi="Times New Roman"/>
+                <w:b/>
+                <w:bCs/>
+                <w:color w:val="FFFFFF"/>
+                <w:sz w:val="19"/>
+                <w:szCs w:val="19"/>
+              </w:rPr>
+              <w:t xml:space="preserve">Requirement</w:t>
+            </w:r>
+          </w:p>
+        </w:tc>
+      </w:tr>
+      <w:tr>
+        <w:tc>
+          <w:tcPr>
+            <w:tcW w:type="dxa" w:w="1500"/>
+            <w:tcBorders>
+              <w:top w:val="single" w:color="E3E3E4" w:sz="2"/>
+              <w:left w:val="single" w:color="E3E3E4" w:sz="2"/>
+              <w:bottom w:val="single" w:color="E3E3E4" w:sz="2"/>
+              <w:right w:val="single" w:color="E3E3E4" w:sz="2"/>
+            </w:tcBorders>
+            <w:shd w:fill="FFFFFF" w:val="clear"/>
+            <w:tcMar>
+              <w:top w:type="dxa" w:w="80"/>
+              <w:left w:type="dxa" w:w="100"/>
+              <w:bottom w:type="dxa" w:w="80"/>
+              <w:right w:type="dxa" w:w="100"/>
+            </w:tcMar>
+            <w:vAlign w:val="center"/>
+          </w:tcPr>
+          <w:p>
+            <w:r>
+              <w:rPr>
+                <w:rFonts w:ascii="Times New Roman" w:cs="Times New Roman" w:eastAsia="Times New Roman" w:hAnsi="Times New Roman"/>
+                <w:b w:val="false"/>
+                <w:bCs w:val="false"/>
+                <w:color w:val="58595B"/>
+                <w:sz w:val="19"/>
+                <w:szCs w:val="19"/>
+              </w:rPr>
+              <w:t xml:space="preserve">FR-RACSI-01</w:t>
+            </w:r>
+          </w:p>
+        </w:tc>
+        <w:tc>
+          <w:tcPr>
+            <w:tcW w:type="dxa" w:w="8246"/>
+            <w:tcBorders>
+              <w:top w:val="single" w:color="E3E3E4" w:sz="2"/>
+              <w:left w:val="single" w:color="E3E3E4" w:sz="2"/>
+              <w:bottom w:val="single" w:color="E3E3E4" w:sz="2"/>
+              <w:right w:val="single" w:color="E3E3E4" w:sz="2"/>
+            </w:tcBorders>
+            <w:shd w:fill="FFFFFF" w:val="clear"/>
+            <w:tcMar>
+              <w:top w:type="dxa" w:w="80"/>
+              <w:left w:type="dxa" w:w="100"/>
+              <w:bottom w:type="dxa" w:w="80"/>
+              <w:right w:type="dxa" w:w="100"/>
+            </w:tcMar>
+            <w:vAlign w:val="center"/>
+          </w:tcPr>
+          <w:p>
+            <w:r>
+              <w:rPr>
+                <w:rFonts w:ascii="Times New Roman" w:cs="Times New Roman" w:eastAsia="Times New Roman" w:hAnsi="Times New Roman"/>
+                <w:b w:val="false"/>
+                <w:bCs w:val="false"/>
+                <w:color w:val="58595B"/>
+                <w:sz w:val="19"/>
+                <w:szCs w:val="19"/>
+              </w:rPr>
+              <w:t xml:space="preserve">The system shall support full CRUD on RACSI Activities, each with a code, title, description, a reference type (NCP Process Step / Business Rule / Control / Risk-Opportunity / General), and an owning OBS node.</w:t>
+            </w:r>
+          </w:p>
+        </w:tc>
+      </w:tr>
+      <w:tr>
+        <w:tc>
+          <w:tcPr>
+            <w:tcW w:type="dxa" w:w="1500"/>
+            <w:tcBorders>
+              <w:top w:val="single" w:color="E3E3E4" w:sz="2"/>
+              <w:left w:val="single" w:color="E3E3E4" w:sz="2"/>
+              <w:bottom w:val="single" w:color="E3E3E4" w:sz="2"/>
+              <w:right w:val="single" w:color="E3E3E4" w:sz="2"/>
+            </w:tcBorders>
+            <w:shd w:fill="F2F2F3" w:val="clear"/>
+            <w:tcMar>
+              <w:top w:type="dxa" w:w="80"/>
+              <w:left w:type="dxa" w:w="100"/>
+              <w:bottom w:type="dxa" w:w="80"/>
+              <w:right w:type="dxa" w:w="100"/>
+            </w:tcMar>
+            <w:vAlign w:val="center"/>
+          </w:tcPr>
+          <w:p>
+            <w:r>
+              <w:rPr>
+                <w:rFonts w:ascii="Times New Roman" w:cs="Times New Roman" w:eastAsia="Times New Roman" w:hAnsi="Times New Roman"/>
+                <w:b w:val="false"/>
+                <w:bCs w:val="false"/>
+                <w:color w:val="58595B"/>
+                <w:sz w:val="19"/>
+                <w:szCs w:val="19"/>
+              </w:rPr>
+              <w:t xml:space="preserve">FR-RACSI-02</w:t>
+            </w:r>
+          </w:p>
+        </w:tc>
+        <w:tc>
+          <w:tcPr>
+            <w:tcW w:type="dxa" w:w="8246"/>
+            <w:tcBorders>
+              <w:top w:val="single" w:color="E3E3E4" w:sz="2"/>
+              <w:left w:val="single" w:color="E3E3E4" w:sz="2"/>
+              <w:bottom w:val="single" w:color="E3E3E4" w:sz="2"/>
+              <w:right w:val="single" w:color="E3E3E4" w:sz="2"/>
+            </w:tcBorders>
+            <w:shd w:fill="F2F2F3" w:val="clear"/>
+            <w:tcMar>
+              <w:top w:type="dxa" w:w="80"/>
+              <w:left w:type="dxa" w:w="100"/>
+              <w:bottom w:type="dxa" w:w="80"/>
+              <w:right w:type="dxa" w:w="100"/>
+            </w:tcMar>
+            <w:vAlign w:val="center"/>
+          </w:tcPr>
+          <w:p>
+            <w:r>
+              <w:rPr>
+                <w:rFonts w:ascii="Times New Roman" w:cs="Times New Roman" w:eastAsia="Times New Roman" w:hAnsi="Times New Roman"/>
+                <w:b w:val="false"/>
+                <w:bCs w:val="false"/>
+                <w:color w:val="58595B"/>
+                <w:sz w:val="19"/>
+                <w:szCs w:val="19"/>
+              </w:rPr>
+              <w:t xml:space="preserve">The system shall allow a RACSI Activity referencing the NCP process to be tagged with exactly one stage (E1-E7).</w:t>
+            </w:r>
+          </w:p>
+        </w:tc>
+      </w:tr>
+      <w:tr>
+        <w:tc>
+          <w:tcPr>
+            <w:tcW w:type="dxa" w:w="1500"/>
+            <w:tcBorders>
+              <w:top w:val="single" w:color="E3E3E4" w:sz="2"/>
+              <w:left w:val="single" w:color="E3E3E4" w:sz="2"/>
+              <w:bottom w:val="single" w:color="E3E3E4" w:sz="2"/>
+              <w:right w:val="single" w:color="E3E3E4" w:sz="2"/>
+            </w:tcBorders>
+            <w:shd w:fill="FFFFFF" w:val="clear"/>
+            <w:tcMar>
+              <w:top w:type="dxa" w:w="80"/>
+              <w:left w:type="dxa" w:w="100"/>
+              <w:bottom w:type="dxa" w:w="80"/>
+              <w:right w:type="dxa" w:w="100"/>
+            </w:tcMar>
+            <w:vAlign w:val="center"/>
+          </w:tcPr>
+          <w:p>
+            <w:r>
+              <w:rPr>
+                <w:rFonts w:ascii="Times New Roman" w:cs="Times New Roman" w:eastAsia="Times New Roman" w:hAnsi="Times New Roman"/>
+                <w:b w:val="false"/>
+                <w:bCs w:val="false"/>
+                <w:color w:val="58595B"/>
+                <w:sz w:val="19"/>
+                <w:szCs w:val="19"/>
+              </w:rPr>
+              <w:t xml:space="preserve">FR-RACSI-03</w:t>
+            </w:r>
+          </w:p>
+        </w:tc>
+        <w:tc>
+          <w:tcPr>
+            <w:tcW w:type="dxa" w:w="8246"/>
+            <w:tcBorders>
+              <w:top w:val="single" w:color="E3E3E4" w:sz="2"/>
+              <w:left w:val="single" w:color="E3E3E4" w:sz="2"/>
+              <w:bottom w:val="single" w:color="E3E3E4" w:sz="2"/>
+              <w:right w:val="single" w:color="E3E3E4" w:sz="2"/>
+            </w:tcBorders>
+            <w:shd w:fill="FFFFFF" w:val="clear"/>
+            <w:tcMar>
+              <w:top w:type="dxa" w:w="80"/>
+              <w:left w:type="dxa" w:w="100"/>
+              <w:bottom w:type="dxa" w:w="80"/>
+              <w:right w:type="dxa" w:w="100"/>
+            </w:tcMar>
+            <w:vAlign w:val="center"/>
+          </w:tcPr>
+          <w:p>
+            <w:r>
+              <w:rPr>
+                <w:rFonts w:ascii="Times New Roman" w:cs="Times New Roman" w:eastAsia="Times New Roman" w:hAnsi="Times New Roman"/>
+                <w:b w:val="false"/>
+                <w:bCs w:val="false"/>
+                <w:color w:val="58595B"/>
+                <w:sz w:val="19"/>
+                <w:szCs w:val="19"/>
+              </w:rPr>
+              <w:t xml:space="preserve">The system shall allow a RACSI Activity to be linked directly to a specific Business Rule, Control, or Risk/Opportunity record, so governance accountability is traceable to a concrete item rather than stated abstractly.</w:t>
+            </w:r>
+          </w:p>
+        </w:tc>
+      </w:tr>
+      <w:tr>
+        <w:tc>
+          <w:tcPr>
+            <w:tcW w:type="dxa" w:w="1500"/>
+            <w:tcBorders>
+              <w:top w:val="single" w:color="E3E3E4" w:sz="2"/>
+              <w:left w:val="single" w:color="E3E3E4" w:sz="2"/>
+              <w:bottom w:val="single" w:color="E3E3E4" w:sz="2"/>
+              <w:right w:val="single" w:color="E3E3E4" w:sz="2"/>
+            </w:tcBorders>
+            <w:shd w:fill="F2F2F3" w:val="clear"/>
+            <w:tcMar>
+              <w:top w:type="dxa" w:w="80"/>
+              <w:left w:type="dxa" w:w="100"/>
+              <w:bottom w:type="dxa" w:w="80"/>
+              <w:right w:type="dxa" w:w="100"/>
+            </w:tcMar>
+            <w:vAlign w:val="center"/>
+          </w:tcPr>
+          <w:p>
+            <w:r>
+              <w:rPr>
+                <w:rFonts w:ascii="Times New Roman" w:cs="Times New Roman" w:eastAsia="Times New Roman" w:hAnsi="Times New Roman"/>
+                <w:b w:val="false"/>
+                <w:bCs w:val="false"/>
+                <w:color w:val="58595B"/>
+                <w:sz w:val="19"/>
+                <w:szCs w:val="19"/>
+              </w:rPr>
+              <w:t xml:space="preserve">FR-RACSI-04</w:t>
+            </w:r>
+          </w:p>
+        </w:tc>
+        <w:tc>
+          <w:tcPr>
+            <w:tcW w:type="dxa" w:w="8246"/>
+            <w:tcBorders>
+              <w:top w:val="single" w:color="E3E3E4" w:sz="2"/>
+              <w:left w:val="single" w:color="E3E3E4" w:sz="2"/>
+              <w:bottom w:val="single" w:color="E3E3E4" w:sz="2"/>
+              <w:right w:val="single" w:color="E3E3E4" w:sz="2"/>
+            </w:tcBorders>
+            <w:shd w:fill="F2F2F3" w:val="clear"/>
+            <w:tcMar>
+              <w:top w:type="dxa" w:w="80"/>
+              <w:left w:type="dxa" w:w="100"/>
+              <w:bottom w:type="dxa" w:w="80"/>
+              <w:right w:type="dxa" w:w="100"/>
+            </w:tcMar>
+            <w:vAlign w:val="center"/>
+          </w:tcPr>
+          <w:p>
+            <w:r>
+              <w:rPr>
+                <w:rFonts w:ascii="Times New Roman" w:cs="Times New Roman" w:eastAsia="Times New Roman" w:hAnsi="Times New Roman"/>
+                <w:b w:val="false"/>
+                <w:bCs w:val="false"/>
+                <w:color w:val="58595B"/>
+                <w:sz w:val="19"/>
+                <w:szCs w:val="19"/>
+              </w:rPr>
+              <w:t xml:space="preserve">The system shall support full CRUD on RACSI Assignments against an Activity, each assigning exactly one of the five RACSI types (Responsible, Accountable, Consulted, Support, Informed) to exactly one assignee.</w:t>
+            </w:r>
+          </w:p>
+        </w:tc>
+      </w:tr>
+      <w:tr>
+        <w:tc>
+          <w:tcPr>
+            <w:tcW w:type="dxa" w:w="1500"/>
+            <w:tcBorders>
+              <w:top w:val="single" w:color="E3E3E4" w:sz="2"/>
+              <w:left w:val="single" w:color="E3E3E4" w:sz="2"/>
+              <w:bottom w:val="single" w:color="E3E3E4" w:sz="2"/>
+              <w:right w:val="single" w:color="E3E3E4" w:sz="2"/>
+            </w:tcBorders>
+            <w:shd w:fill="FFFFFF" w:val="clear"/>
+            <w:tcMar>
+              <w:top w:type="dxa" w:w="80"/>
+              <w:left w:type="dxa" w:w="100"/>
+              <w:bottom w:type="dxa" w:w="80"/>
+              <w:right w:type="dxa" w:w="100"/>
+            </w:tcMar>
+            <w:vAlign w:val="center"/>
+          </w:tcPr>
+          <w:p>
+            <w:r>
+              <w:rPr>
+                <w:rFonts w:ascii="Times New Roman" w:cs="Times New Roman" w:eastAsia="Times New Roman" w:hAnsi="Times New Roman"/>
+                <w:b w:val="false"/>
+                <w:bCs w:val="false"/>
+                <w:color w:val="58595B"/>
+                <w:sz w:val="19"/>
+                <w:szCs w:val="19"/>
+              </w:rPr>
+              <w:t xml:space="preserve">FR-RACSI-05</w:t>
+            </w:r>
+          </w:p>
+        </w:tc>
+        <w:tc>
+          <w:tcPr>
+            <w:tcW w:type="dxa" w:w="8246"/>
+            <w:tcBorders>
+              <w:top w:val="single" w:color="E3E3E4" w:sz="2"/>
+              <w:left w:val="single" w:color="E3E3E4" w:sz="2"/>
+              <w:bottom w:val="single" w:color="E3E3E4" w:sz="2"/>
+              <w:right w:val="single" w:color="E3E3E4" w:sz="2"/>
+            </w:tcBorders>
+            <w:shd w:fill="FFFFFF" w:val="clear"/>
+            <w:tcMar>
+              <w:top w:type="dxa" w:w="80"/>
+              <w:left w:type="dxa" w:w="100"/>
+              <w:bottom w:type="dxa" w:w="80"/>
+              <w:right w:type="dxa" w:w="100"/>
+            </w:tcMar>
+            <w:vAlign w:val="center"/>
+          </w:tcPr>
+          <w:p>
+            <w:r>
+              <w:rPr>
+                <w:rFonts w:ascii="Times New Roman" w:cs="Times New Roman" w:eastAsia="Times New Roman" w:hAnsi="Times New Roman"/>
+                <w:b w:val="false"/>
+                <w:bCs w:val="false"/>
+                <w:color w:val="58595B"/>
+                <w:sz w:val="19"/>
+                <w:szCs w:val="19"/>
+              </w:rPr>
+              <w:t xml:space="preserve">The system shall allow a RACSI Assignment's assignee to be given either as a Role (an org-wide accountability drawn from the RBAC role catalog) or as a specific Named Person (a user), sourced from the Organizational Breakdown Structure.</w:t>
+            </w:r>
+          </w:p>
+        </w:tc>
+      </w:tr>
+      <w:tr>
+        <w:tc>
+          <w:tcPr>
+            <w:tcW w:type="dxa" w:w="1500"/>
+            <w:tcBorders>
+              <w:top w:val="single" w:color="E3E3E4" w:sz="2"/>
+              <w:left w:val="single" w:color="E3E3E4" w:sz="2"/>
+              <w:bottom w:val="single" w:color="E3E3E4" w:sz="2"/>
+              <w:right w:val="single" w:color="E3E3E4" w:sz="2"/>
+            </w:tcBorders>
+            <w:shd w:fill="F2F2F3" w:val="clear"/>
+            <w:tcMar>
+              <w:top w:type="dxa" w:w="80"/>
+              <w:left w:type="dxa" w:w="100"/>
+              <w:bottom w:type="dxa" w:w="80"/>
+              <w:right w:type="dxa" w:w="100"/>
+            </w:tcMar>
+            <w:vAlign w:val="center"/>
+          </w:tcPr>
+          <w:p>
+            <w:r>
+              <w:rPr>
+                <w:rFonts w:ascii="Times New Roman" w:cs="Times New Roman" w:eastAsia="Times New Roman" w:hAnsi="Times New Roman"/>
+                <w:b w:val="false"/>
+                <w:bCs w:val="false"/>
+                <w:color w:val="58595B"/>
+                <w:sz w:val="19"/>
+                <w:szCs w:val="19"/>
+              </w:rPr>
+              <w:t xml:space="preserve">FR-RACSI-06</w:t>
+            </w:r>
+          </w:p>
+        </w:tc>
+        <w:tc>
+          <w:tcPr>
+            <w:tcW w:type="dxa" w:w="8246"/>
+            <w:tcBorders>
+              <w:top w:val="single" w:color="E3E3E4" w:sz="2"/>
+              <w:left w:val="single" w:color="E3E3E4" w:sz="2"/>
+              <w:bottom w:val="single" w:color="E3E3E4" w:sz="2"/>
+              <w:right w:val="single" w:color="E3E3E4" w:sz="2"/>
+            </w:tcBorders>
+            <w:shd w:fill="F2F2F3" w:val="clear"/>
+            <w:tcMar>
+              <w:top w:type="dxa" w:w="80"/>
+              <w:left w:type="dxa" w:w="100"/>
+              <w:bottom w:type="dxa" w:w="80"/>
+              <w:right w:type="dxa" w:w="100"/>
+            </w:tcMar>
+            <w:vAlign w:val="center"/>
+          </w:tcPr>
+          <w:p>
+            <w:r>
+              <w:rPr>
+                <w:rFonts w:ascii="Times New Roman" w:cs="Times New Roman" w:eastAsia="Times New Roman" w:hAnsi="Times New Roman"/>
+                <w:b w:val="false"/>
+                <w:bCs w:val="false"/>
+                <w:color w:val="58595B"/>
+                <w:sz w:val="19"/>
+                <w:szCs w:val="19"/>
+              </w:rPr>
+              <w:t xml:space="preserve">The system shall enforce that a RACSI Activity has at most one Accountable (A) assignment at any time, both in the create-assignment form (the "A" option is disabled once an Accountable exists) and at the data-persistence layer (a database constraint); a request that would create a second Accountable shall be rejected with HTTP 409.</w:t>
+            </w:r>
+          </w:p>
+        </w:tc>
+      </w:tr>
+      <w:tr>
+        <w:tc>
+          <w:tcPr>
+            <w:tcW w:type="dxa" w:w="1500"/>
+            <w:tcBorders>
+              <w:top w:val="single" w:color="E3E3E4" w:sz="2"/>
+              <w:left w:val="single" w:color="E3E3E4" w:sz="2"/>
+              <w:bottom w:val="single" w:color="E3E3E4" w:sz="2"/>
+              <w:right w:val="single" w:color="E3E3E4" w:sz="2"/>
+            </w:tcBorders>
+            <w:shd w:fill="FFFFFF" w:val="clear"/>
+            <w:tcMar>
+              <w:top w:type="dxa" w:w="80"/>
+              <w:left w:type="dxa" w:w="100"/>
+              <w:bottom w:type="dxa" w:w="80"/>
+              <w:right w:type="dxa" w:w="100"/>
+            </w:tcMar>
+            <w:vAlign w:val="center"/>
+          </w:tcPr>
+          <w:p>
+            <w:r>
+              <w:rPr>
+                <w:rFonts w:ascii="Times New Roman" w:cs="Times New Roman" w:eastAsia="Times New Roman" w:hAnsi="Times New Roman"/>
+                <w:b w:val="false"/>
+                <w:bCs w:val="false"/>
+                <w:color w:val="58595B"/>
+                <w:sz w:val="19"/>
+                <w:szCs w:val="19"/>
+              </w:rPr>
+              <w:t xml:space="preserve">FR-RACSI-07</w:t>
+            </w:r>
+          </w:p>
+        </w:tc>
+        <w:tc>
+          <w:tcPr>
+            <w:tcW w:type="dxa" w:w="8246"/>
+            <w:tcBorders>
+              <w:top w:val="single" w:color="E3E3E4" w:sz="2"/>
+              <w:left w:val="single" w:color="E3E3E4" w:sz="2"/>
+              <w:bottom w:val="single" w:color="E3E3E4" w:sz="2"/>
+              <w:right w:val="single" w:color="E3E3E4" w:sz="2"/>
+            </w:tcBorders>
+            <w:shd w:fill="FFFFFF" w:val="clear"/>
+            <w:tcMar>
+              <w:top w:type="dxa" w:w="80"/>
+              <w:left w:type="dxa" w:w="100"/>
+              <w:bottom w:type="dxa" w:w="80"/>
+              <w:right w:type="dxa" w:w="100"/>
+            </w:tcMar>
+            <w:vAlign w:val="center"/>
+          </w:tcPr>
+          <w:p>
+            <w:r>
+              <w:rPr>
+                <w:rFonts w:ascii="Times New Roman" w:cs="Times New Roman" w:eastAsia="Times New Roman" w:hAnsi="Times New Roman"/>
+                <w:b w:val="false"/>
+                <w:bCs w:val="false"/>
+                <w:color w:val="58595B"/>
+                <w:sz w:val="19"/>
+                <w:szCs w:val="19"/>
+              </w:rPr>
+              <w:t xml:space="preserve">The system shall allow a RACSI Activity's Responsible, Consulted, Support, and Informed types to each carry zero, one, or multiple assignments, freely mixing Role-based and Named-Person-based assignees.</w:t>
+            </w:r>
+          </w:p>
+        </w:tc>
+      </w:tr>
+      <w:tr>
+        <w:tc>
+          <w:tcPr>
+            <w:tcW w:type="dxa" w:w="1500"/>
+            <w:tcBorders>
+              <w:top w:val="single" w:color="E3E3E4" w:sz="2"/>
+              <w:left w:val="single" w:color="E3E3E4" w:sz="2"/>
+              <w:bottom w:val="single" w:color="E3E3E4" w:sz="2"/>
+              <w:right w:val="single" w:color="E3E3E4" w:sz="2"/>
+            </w:tcBorders>
+            <w:shd w:fill="F2F2F3" w:val="clear"/>
+            <w:tcMar>
+              <w:top w:type="dxa" w:w="80"/>
+              <w:left w:type="dxa" w:w="100"/>
+              <w:bottom w:type="dxa" w:w="80"/>
+              <w:right w:type="dxa" w:w="100"/>
+            </w:tcMar>
+            <w:vAlign w:val="center"/>
+          </w:tcPr>
+          <w:p>
+            <w:r>
+              <w:rPr>
+                <w:rFonts w:ascii="Times New Roman" w:cs="Times New Roman" w:eastAsia="Times New Roman" w:hAnsi="Times New Roman"/>
+                <w:b w:val="false"/>
+                <w:bCs w:val="false"/>
+                <w:color w:val="58595B"/>
+                <w:sz w:val="19"/>
+                <w:szCs w:val="19"/>
+              </w:rPr>
+              <w:t xml:space="preserve">FR-RACSI-08</w:t>
+            </w:r>
+          </w:p>
+        </w:tc>
+        <w:tc>
+          <w:tcPr>
+            <w:tcW w:type="dxa" w:w="8246"/>
+            <w:tcBorders>
+              <w:top w:val="single" w:color="E3E3E4" w:sz="2"/>
+              <w:left w:val="single" w:color="E3E3E4" w:sz="2"/>
+              <w:bottom w:val="single" w:color="E3E3E4" w:sz="2"/>
+              <w:right w:val="single" w:color="E3E3E4" w:sz="2"/>
+            </w:tcBorders>
+            <w:shd w:fill="F2F2F3" w:val="clear"/>
+            <w:tcMar>
+              <w:top w:type="dxa" w:w="80"/>
+              <w:left w:type="dxa" w:w="100"/>
+              <w:bottom w:type="dxa" w:w="80"/>
+              <w:right w:type="dxa" w:w="100"/>
+            </w:tcMar>
+            <w:vAlign w:val="center"/>
+          </w:tcPr>
+          <w:p>
+            <w:r>
+              <w:rPr>
+                <w:rFonts w:ascii="Times New Roman" w:cs="Times New Roman" w:eastAsia="Times New Roman" w:hAnsi="Times New Roman"/>
+                <w:b w:val="false"/>
+                <w:bCs w:val="false"/>
+                <w:color w:val="58595B"/>
+                <w:sz w:val="19"/>
+                <w:szCs w:val="19"/>
+              </w:rPr>
+              <w:t xml:space="preserve">The system shall allow an authorized user to remove an individual RACSI Assignment without deleting the parent Activity.</w:t>
+            </w:r>
+          </w:p>
+        </w:tc>
+      </w:tr>
+      <w:tr>
+        <w:tc>
+          <w:tcPr>
+            <w:tcW w:type="dxa" w:w="1500"/>
+            <w:tcBorders>
+              <w:top w:val="single" w:color="E3E3E4" w:sz="2"/>
+              <w:left w:val="single" w:color="E3E3E4" w:sz="2"/>
+              <w:bottom w:val="single" w:color="E3E3E4" w:sz="2"/>
+              <w:right w:val="single" w:color="E3E3E4" w:sz="2"/>
+            </w:tcBorders>
+            <w:shd w:fill="FFFFFF" w:val="clear"/>
+            <w:tcMar>
+              <w:top w:type="dxa" w:w="80"/>
+              <w:left w:type="dxa" w:w="100"/>
+              <w:bottom w:type="dxa" w:w="80"/>
+              <w:right w:type="dxa" w:w="100"/>
+            </w:tcMar>
+            <w:vAlign w:val="center"/>
+          </w:tcPr>
+          <w:p>
+            <w:r>
+              <w:rPr>
+                <w:rFonts w:ascii="Times New Roman" w:cs="Times New Roman" w:eastAsia="Times New Roman" w:hAnsi="Times New Roman"/>
+                <w:b w:val="false"/>
+                <w:bCs w:val="false"/>
+                <w:color w:val="58595B"/>
+                <w:sz w:val="19"/>
+                <w:szCs w:val="19"/>
+              </w:rPr>
+              <w:t xml:space="preserve">FR-RACSI-09</w:t>
+            </w:r>
+          </w:p>
+        </w:tc>
+        <w:tc>
+          <w:tcPr>
+            <w:tcW w:type="dxa" w:w="8246"/>
+            <w:tcBorders>
+              <w:top w:val="single" w:color="E3E3E4" w:sz="2"/>
+              <w:left w:val="single" w:color="E3E3E4" w:sz="2"/>
+              <w:bottom w:val="single" w:color="E3E3E4" w:sz="2"/>
+              <w:right w:val="single" w:color="E3E3E4" w:sz="2"/>
+            </w:tcBorders>
+            <w:shd w:fill="FFFFFF" w:val="clear"/>
+            <w:tcMar>
+              <w:top w:type="dxa" w:w="80"/>
+              <w:left w:type="dxa" w:w="100"/>
+              <w:bottom w:type="dxa" w:w="80"/>
+              <w:right w:type="dxa" w:w="100"/>
+            </w:tcMar>
+            <w:vAlign w:val="center"/>
+          </w:tcPr>
+          <w:p>
+            <w:r>
+              <w:rPr>
+                <w:rFonts w:ascii="Times New Roman" w:cs="Times New Roman" w:eastAsia="Times New Roman" w:hAnsi="Times New Roman"/>
+                <w:b w:val="false"/>
+                <w:bCs w:val="false"/>
+                <w:color w:val="58595B"/>
+                <w:sz w:val="19"/>
+                <w:szCs w:val="19"/>
+              </w:rPr>
+              <w:t xml:space="preserve">The system shall allow the RACSI Activity list to be filtered by reference type (NCP Process Step / Business Rule / Control / Risk-Opportunity / General).</w:t>
+            </w:r>
+          </w:p>
+        </w:tc>
+      </w:tr>
+    </w:tbl>
+    <w:p>
+      <w:pPr>
+        <w:spacing w:after="120"/>
+      </w:pPr>
+    </w:p>
+    <w:p>
+      <w:pPr>
+        <w:pStyle w:val="Heading2"/>
+        <w:spacing w:after="140" w:before="300"/>
+      </w:pPr>
+      <w:r>
+        <w:rPr>
+          <w:rFonts w:ascii="Times New Roman" w:cs="Times New Roman" w:eastAsia="Times New Roman" w:hAnsi="Times New Roman"/>
+          <w:b/>
+          <w:bCs/>
+          <w:color w:val="3A3A3C"/>
+          <w:sz w:val="27"/>
+          <w:szCs w:val="27"/>
+        </w:rPr>
+        <w:t xml:space="preserve">3.16 Help &amp; User Guide</w:t>
+      </w:r>
+    </w:p>
+    <w:p>
+      <w:pPr>
+        <w:spacing w:after="200" w:before="60"/>
+      </w:pPr>
+      <w:r>
+        <w:rPr>
+          <w:rFonts w:ascii="Times New Roman" w:cs="Times New Roman" w:eastAsia="Times New Roman" w:hAnsi="Times New Roman"/>
+          <w:i/>
+          <w:iCs/>
+          <w:color w:val="58595B"/>
+          <w:sz w:val="19"/>
+          <w:szCs w:val="19"/>
+        </w:rPr>
+        <w:t xml:space="preserve">An in-app, searchable, multi-language reference covering every module, available to every authenticated user regardless of role.</w:t>
+      </w:r>
+    </w:p>
+    <w:tbl>
+      <w:tblPr>
+        <w:tblW w:type="dxa" w:w="9746"/>
+        <w:tblBorders>
+          <w:top w:val="single" w:color="auto" w:sz="4"/>
+          <w:left w:val="single" w:color="auto" w:sz="4"/>
+          <w:bottom w:val="single" w:color="auto" w:sz="4"/>
+          <w:right w:val="single" w:color="auto" w:sz="4"/>
+          <w:insideH w:val="single" w:color="auto" w:sz="4"/>
+          <w:insideV w:val="single" w:color="auto" w:sz="4"/>
+        </w:tblBorders>
+      </w:tblPr>
+      <w:tblGrid>
+        <w:gridCol w:w="1500"/>
+        <w:gridCol w:w="8246"/>
+      </w:tblGrid>
+      <w:tr>
+        <w:trPr>
+          <w:tblHeader/>
+        </w:trPr>
+        <w:tc>
+          <w:tcPr>
+            <w:tcW w:type="dxa" w:w="1500"/>
+            <w:tcBorders>
+              <w:top w:val="single" w:color="E3E3E4" w:sz="2"/>
+              <w:left w:val="single" w:color="E3E3E4" w:sz="2"/>
+              <w:bottom w:val="single" w:color="E3E3E4" w:sz="2"/>
+              <w:right w:val="single" w:color="E3E3E4" w:sz="2"/>
+            </w:tcBorders>
+            <w:shd w:fill="F8931D" w:val="clear"/>
+            <w:tcMar>
+              <w:top w:type="dxa" w:w="80"/>
+              <w:left w:type="dxa" w:w="100"/>
+              <w:bottom w:type="dxa" w:w="80"/>
+              <w:right w:type="dxa" w:w="100"/>
+            </w:tcMar>
+            <w:vAlign w:val="center"/>
+          </w:tcPr>
+          <w:p>
+            <w:r>
+              <w:rPr>
+                <w:rFonts w:ascii="Times New Roman" w:cs="Times New Roman" w:eastAsia="Times New Roman" w:hAnsi="Times New Roman"/>
+                <w:b/>
+                <w:bCs/>
+                <w:color w:val="FFFFFF"/>
+                <w:sz w:val="19"/>
+                <w:szCs w:val="19"/>
+              </w:rPr>
+              <w:t xml:space="preserve">ID</w:t>
+            </w:r>
+          </w:p>
+        </w:tc>
+        <w:tc>
+          <w:tcPr>
+            <w:tcW w:type="dxa" w:w="8246"/>
+            <w:tcBorders>
+              <w:top w:val="single" w:color="E3E3E4" w:sz="2"/>
+              <w:left w:val="single" w:color="E3E3E4" w:sz="2"/>
+              <w:bottom w:val="single" w:color="E3E3E4" w:sz="2"/>
+              <w:right w:val="single" w:color="E3E3E4" w:sz="2"/>
+            </w:tcBorders>
+            <w:shd w:fill="F8931D" w:val="clear"/>
+            <w:tcMar>
+              <w:top w:type="dxa" w:w="80"/>
+              <w:left w:type="dxa" w:w="100"/>
+              <w:bottom w:type="dxa" w:w="80"/>
+              <w:right w:type="dxa" w:w="100"/>
+            </w:tcMar>
+            <w:vAlign w:val="center"/>
+          </w:tcPr>
+          <w:p>
+            <w:r>
+              <w:rPr>
+                <w:rFonts w:ascii="Times New Roman" w:cs="Times New Roman" w:eastAsia="Times New Roman" w:hAnsi="Times New Roman"/>
+                <w:b/>
+                <w:bCs/>
+                <w:color w:val="FFFFFF"/>
+                <w:sz w:val="19"/>
+                <w:szCs w:val="19"/>
+              </w:rPr>
+              <w:t xml:space="preserve">Requirement</w:t>
+            </w:r>
+          </w:p>
+        </w:tc>
+      </w:tr>
+      <w:tr>
+        <w:tc>
+          <w:tcPr>
+            <w:tcW w:type="dxa" w:w="1500"/>
+            <w:tcBorders>
+              <w:top w:val="single" w:color="E3E3E4" w:sz="2"/>
+              <w:left w:val="single" w:color="E3E3E4" w:sz="2"/>
+              <w:bottom w:val="single" w:color="E3E3E4" w:sz="2"/>
+              <w:right w:val="single" w:color="E3E3E4" w:sz="2"/>
+            </w:tcBorders>
+            <w:shd w:fill="FFFFFF" w:val="clear"/>
+            <w:tcMar>
+              <w:top w:type="dxa" w:w="80"/>
+              <w:left w:type="dxa" w:w="100"/>
+              <w:bottom w:type="dxa" w:w="80"/>
+              <w:right w:type="dxa" w:w="100"/>
+            </w:tcMar>
+            <w:vAlign w:val="center"/>
+          </w:tcPr>
+          <w:p>
+            <w:r>
+              <w:rPr>
+                <w:rFonts w:ascii="Times New Roman" w:cs="Times New Roman" w:eastAsia="Times New Roman" w:hAnsi="Times New Roman"/>
+                <w:b w:val="false"/>
+                <w:bCs w:val="false"/>
+                <w:color w:val="58595B"/>
+                <w:sz w:val="19"/>
+                <w:szCs w:val="19"/>
+              </w:rPr>
+              <w:t xml:space="preserve">FR-HELP-01</w:t>
+            </w:r>
+          </w:p>
+        </w:tc>
+        <w:tc>
+          <w:tcPr>
+            <w:tcW w:type="dxa" w:w="8246"/>
+            <w:tcBorders>
+              <w:top w:val="single" w:color="E3E3E4" w:sz="2"/>
+              <w:left w:val="single" w:color="E3E3E4" w:sz="2"/>
+              <w:bottom w:val="single" w:color="E3E3E4" w:sz="2"/>
+              <w:right w:val="single" w:color="E3E3E4" w:sz="2"/>
+            </w:tcBorders>
+            <w:shd w:fill="FFFFFF" w:val="clear"/>
+            <w:tcMar>
+              <w:top w:type="dxa" w:w="80"/>
+              <w:left w:type="dxa" w:w="100"/>
+              <w:bottom w:type="dxa" w:w="80"/>
+              <w:right w:type="dxa" w:w="100"/>
+            </w:tcMar>
+            <w:vAlign w:val="center"/>
+          </w:tcPr>
+          <w:p>
+            <w:r>
+              <w:rPr>
+                <w:rFonts w:ascii="Times New Roman" w:cs="Times New Roman" w:eastAsia="Times New Roman" w:hAnsi="Times New Roman"/>
+                <w:b w:val="false"/>
+                <w:bCs w:val="false"/>
+                <w:color w:val="58595B"/>
+                <w:sz w:val="19"/>
+                <w:szCs w:val="19"/>
+              </w:rPr>
+              <w:t xml:space="preserve">The system shall provide an in-app Help screen presenting a set of topic articles covering: getting started, the E1-E7 NCP process, Hierarchy &amp; OBS, Identity &amp; RBAC, Governance/Risk/Compliance, the RACSI matrix, the AI Use Cases Library, the Capitalization Library &amp; AI agents, Alerts &amp; Reports, and a FAQ.</w:t>
+            </w:r>
+          </w:p>
+        </w:tc>
+      </w:tr>
+      <w:tr>
+        <w:tc>
+          <w:tcPr>
+            <w:tcW w:type="dxa" w:w="1500"/>
+            <w:tcBorders>
+              <w:top w:val="single" w:color="E3E3E4" w:sz="2"/>
+              <w:left w:val="single" w:color="E3E3E4" w:sz="2"/>
+              <w:bottom w:val="single" w:color="E3E3E4" w:sz="2"/>
+              <w:right w:val="single" w:color="E3E3E4" w:sz="2"/>
+            </w:tcBorders>
+            <w:shd w:fill="F2F2F3" w:val="clear"/>
+            <w:tcMar>
+              <w:top w:type="dxa" w:w="80"/>
+              <w:left w:type="dxa" w:w="100"/>
+              <w:bottom w:type="dxa" w:w="80"/>
+              <w:right w:type="dxa" w:w="100"/>
+            </w:tcMar>
+            <w:vAlign w:val="center"/>
+          </w:tcPr>
+          <w:p>
+            <w:r>
+              <w:rPr>
+                <w:rFonts w:ascii="Times New Roman" w:cs="Times New Roman" w:eastAsia="Times New Roman" w:hAnsi="Times New Roman"/>
+                <w:b w:val="false"/>
+                <w:bCs w:val="false"/>
+                <w:color w:val="58595B"/>
+                <w:sz w:val="19"/>
+                <w:szCs w:val="19"/>
+              </w:rPr>
+              <w:t xml:space="preserve">FR-HELP-02</w:t>
+            </w:r>
+          </w:p>
+        </w:tc>
+        <w:tc>
+          <w:tcPr>
+            <w:tcW w:type="dxa" w:w="8246"/>
+            <w:tcBorders>
+              <w:top w:val="single" w:color="E3E3E4" w:sz="2"/>
+              <w:left w:val="single" w:color="E3E3E4" w:sz="2"/>
+              <w:bottom w:val="single" w:color="E3E3E4" w:sz="2"/>
+              <w:right w:val="single" w:color="E3E3E4" w:sz="2"/>
+            </w:tcBorders>
+            <w:shd w:fill="F2F2F3" w:val="clear"/>
+            <w:tcMar>
+              <w:top w:type="dxa" w:w="80"/>
+              <w:left w:type="dxa" w:w="100"/>
+              <w:bottom w:type="dxa" w:w="80"/>
+              <w:right w:type="dxa" w:w="100"/>
+            </w:tcMar>
+            <w:vAlign w:val="center"/>
+          </w:tcPr>
+          <w:p>
+            <w:r>
+              <w:rPr>
+                <w:rFonts w:ascii="Times New Roman" w:cs="Times New Roman" w:eastAsia="Times New Roman" w:hAnsi="Times New Roman"/>
+                <w:b w:val="false"/>
+                <w:bCs w:val="false"/>
+                <w:color w:val="58595B"/>
+                <w:sz w:val="19"/>
+                <w:szCs w:val="19"/>
+              </w:rPr>
+              <w:t xml:space="preserve">The system shall render Help content in the user's currently selected display language (English, French, or Arabic), matching the article set 1:1 across languages.</w:t>
+            </w:r>
+          </w:p>
+        </w:tc>
+      </w:tr>
+      <w:tr>
+        <w:tc>
+          <w:tcPr>
+            <w:tcW w:type="dxa" w:w="1500"/>
+            <w:tcBorders>
+              <w:top w:val="single" w:color="E3E3E4" w:sz="2"/>
+              <w:left w:val="single" w:color="E3E3E4" w:sz="2"/>
+              <w:bottom w:val="single" w:color="E3E3E4" w:sz="2"/>
+              <w:right w:val="single" w:color="E3E3E4" w:sz="2"/>
+            </w:tcBorders>
+            <w:shd w:fill="FFFFFF" w:val="clear"/>
+            <w:tcMar>
+              <w:top w:type="dxa" w:w="80"/>
+              <w:left w:type="dxa" w:w="100"/>
+              <w:bottom w:type="dxa" w:w="80"/>
+              <w:right w:type="dxa" w:w="100"/>
+            </w:tcMar>
+            <w:vAlign w:val="center"/>
+          </w:tcPr>
+          <w:p>
+            <w:r>
+              <w:rPr>
+                <w:rFonts w:ascii="Times New Roman" w:cs="Times New Roman" w:eastAsia="Times New Roman" w:hAnsi="Times New Roman"/>
+                <w:b w:val="false"/>
+                <w:bCs w:val="false"/>
+                <w:color w:val="58595B"/>
+                <w:sz w:val="19"/>
+                <w:szCs w:val="19"/>
+              </w:rPr>
+              <w:t xml:space="preserve">FR-HELP-03</w:t>
+            </w:r>
+          </w:p>
+        </w:tc>
+        <w:tc>
+          <w:tcPr>
+            <w:tcW w:type="dxa" w:w="8246"/>
+            <w:tcBorders>
+              <w:top w:val="single" w:color="E3E3E4" w:sz="2"/>
+              <w:left w:val="single" w:color="E3E3E4" w:sz="2"/>
+              <w:bottom w:val="single" w:color="E3E3E4" w:sz="2"/>
+              <w:right w:val="single" w:color="E3E3E4" w:sz="2"/>
+            </w:tcBorders>
+            <w:shd w:fill="FFFFFF" w:val="clear"/>
+            <w:tcMar>
+              <w:top w:type="dxa" w:w="80"/>
+              <w:left w:type="dxa" w:w="100"/>
+              <w:bottom w:type="dxa" w:w="80"/>
+              <w:right w:type="dxa" w:w="100"/>
+            </w:tcMar>
+            <w:vAlign w:val="center"/>
+          </w:tcPr>
+          <w:p>
+            <w:r>
+              <w:rPr>
+                <w:rFonts w:ascii="Times New Roman" w:cs="Times New Roman" w:eastAsia="Times New Roman" w:hAnsi="Times New Roman"/>
+                <w:b w:val="false"/>
+                <w:bCs w:val="false"/>
+                <w:color w:val="58595B"/>
+                <w:sz w:val="19"/>
+                <w:szCs w:val="19"/>
+              </w:rPr>
+              <w:t xml:space="preserve">The system shall provide a free-text search box on the Help screen that filters topics by a case-insensitive match against the topic title or body.</w:t>
+            </w:r>
+          </w:p>
+        </w:tc>
+      </w:tr>
+      <w:tr>
+        <w:tc>
+          <w:tcPr>
+            <w:tcW w:type="dxa" w:w="1500"/>
+            <w:tcBorders>
+              <w:top w:val="single" w:color="E3E3E4" w:sz="2"/>
+              <w:left w:val="single" w:color="E3E3E4" w:sz="2"/>
+              <w:bottom w:val="single" w:color="E3E3E4" w:sz="2"/>
+              <w:right w:val="single" w:color="E3E3E4" w:sz="2"/>
+            </w:tcBorders>
+            <w:shd w:fill="F2F2F3" w:val="clear"/>
+            <w:tcMar>
+              <w:top w:type="dxa" w:w="80"/>
+              <w:left w:type="dxa" w:w="100"/>
+              <w:bottom w:type="dxa" w:w="80"/>
+              <w:right w:type="dxa" w:w="100"/>
+            </w:tcMar>
+            <w:vAlign w:val="center"/>
+          </w:tcPr>
+          <w:p>
+            <w:r>
+              <w:rPr>
+                <w:rFonts w:ascii="Times New Roman" w:cs="Times New Roman" w:eastAsia="Times New Roman" w:hAnsi="Times New Roman"/>
+                <w:b w:val="false"/>
+                <w:bCs w:val="false"/>
+                <w:color w:val="58595B"/>
+                <w:sz w:val="19"/>
+                <w:szCs w:val="19"/>
+              </w:rPr>
+              <w:t xml:space="preserve">FR-HELP-04</w:t>
+            </w:r>
+          </w:p>
+        </w:tc>
+        <w:tc>
+          <w:tcPr>
+            <w:tcW w:type="dxa" w:w="8246"/>
+            <w:tcBorders>
+              <w:top w:val="single" w:color="E3E3E4" w:sz="2"/>
+              <w:left w:val="single" w:color="E3E3E4" w:sz="2"/>
+              <w:bottom w:val="single" w:color="E3E3E4" w:sz="2"/>
+              <w:right w:val="single" w:color="E3E3E4" w:sz="2"/>
+            </w:tcBorders>
+            <w:shd w:fill="F2F2F3" w:val="clear"/>
+            <w:tcMar>
+              <w:top w:type="dxa" w:w="80"/>
+              <w:left w:type="dxa" w:w="100"/>
+              <w:bottom w:type="dxa" w:w="80"/>
+              <w:right w:type="dxa" w:w="100"/>
+            </w:tcMar>
+            <w:vAlign w:val="center"/>
+          </w:tcPr>
+          <w:p>
+            <w:r>
+              <w:rPr>
+                <w:rFonts w:ascii="Times New Roman" w:cs="Times New Roman" w:eastAsia="Times New Roman" w:hAnsi="Times New Roman"/>
+                <w:b w:val="false"/>
+                <w:bCs w:val="false"/>
+                <w:color w:val="58595B"/>
+                <w:sz w:val="19"/>
+                <w:szCs w:val="19"/>
+              </w:rPr>
+              <w:t xml:space="preserve">The system shall make the Help screen accessible to every authenticated user independent of role or permission grants, consistent with the Dashboard.</w:t>
+            </w:r>
+          </w:p>
+        </w:tc>
+      </w:tr>
+      <w:tr>
+        <w:tc>
+          <w:tcPr>
+            <w:tcW w:type="dxa" w:w="1500"/>
+            <w:tcBorders>
+              <w:top w:val="single" w:color="E3E3E4" w:sz="2"/>
+              <w:left w:val="single" w:color="E3E3E4" w:sz="2"/>
+              <w:bottom w:val="single" w:color="E3E3E4" w:sz="2"/>
+              <w:right w:val="single" w:color="E3E3E4" w:sz="2"/>
+            </w:tcBorders>
+            <w:shd w:fill="FFFFFF" w:val="clear"/>
+            <w:tcMar>
+              <w:top w:type="dxa" w:w="80"/>
+              <w:left w:type="dxa" w:w="100"/>
+              <w:bottom w:type="dxa" w:w="80"/>
+              <w:right w:type="dxa" w:w="100"/>
+            </w:tcMar>
+            <w:vAlign w:val="center"/>
+          </w:tcPr>
+          <w:p>
+            <w:r>
+              <w:rPr>
+                <w:rFonts w:ascii="Times New Roman" w:cs="Times New Roman" w:eastAsia="Times New Roman" w:hAnsi="Times New Roman"/>
+                <w:b w:val="false"/>
+                <w:bCs w:val="false"/>
+                <w:color w:val="58595B"/>
+                <w:sz w:val="19"/>
+                <w:szCs w:val="19"/>
+              </w:rPr>
+              <w:t xml:space="preserve">FR-HELP-05</w:t>
+            </w:r>
+          </w:p>
+        </w:tc>
+        <w:tc>
+          <w:tcPr>
+            <w:tcW w:type="dxa" w:w="8246"/>
+            <w:tcBorders>
+              <w:top w:val="single" w:color="E3E3E4" w:sz="2"/>
+              <w:left w:val="single" w:color="E3E3E4" w:sz="2"/>
+              <w:bottom w:val="single" w:color="E3E3E4" w:sz="2"/>
+              <w:right w:val="single" w:color="E3E3E4" w:sz="2"/>
+            </w:tcBorders>
+            <w:shd w:fill="FFFFFF" w:val="clear"/>
+            <w:tcMar>
+              <w:top w:type="dxa" w:w="80"/>
+              <w:left w:type="dxa" w:w="100"/>
+              <w:bottom w:type="dxa" w:w="80"/>
+              <w:right w:type="dxa" w:w="100"/>
+            </w:tcMar>
+            <w:vAlign w:val="center"/>
+          </w:tcPr>
+          <w:p>
+            <w:r>
+              <w:rPr>
+                <w:rFonts w:ascii="Times New Roman" w:cs="Times New Roman" w:eastAsia="Times New Roman" w:hAnsi="Times New Roman"/>
+                <w:b w:val="false"/>
+                <w:bCs w:val="false"/>
+                <w:color w:val="58595B"/>
+                <w:sz w:val="19"/>
+                <w:szCs w:val="19"/>
+              </w:rPr>
+              <w:t xml:space="preserve">The system shall present each Help topic as an expandable/collapsible section so a user can scan titles before reading full content.</w:t>
+            </w:r>
+          </w:p>
+        </w:tc>
+      </w:tr>
+    </w:tbl>
+    <w:p>
+      <w:pPr>
+        <w:spacing w:after="120"/>
+      </w:pPr>
+    </w:p>
+    <w:p>
+      <w:pPr>
+        <w:pStyle w:val="Heading2"/>
+        <w:spacing w:after="140" w:before="300"/>
+      </w:pPr>
+      <w:r>
+        <w:rPr>
+          <w:rFonts w:ascii="Times New Roman" w:cs="Times New Roman" w:eastAsia="Times New Roman" w:hAnsi="Times New Roman"/>
+          <w:b/>
+          <w:bCs/>
+          <w:color w:val="3A3A3C"/>
+          <w:sz w:val="27"/>
+          <w:szCs w:val="27"/>
+        </w:rPr>
+        <w:t xml:space="preserve">3.17 Alerts &amp; Notifications</w:t>
       </w:r>
     </w:p>
     <w:p>
@@ -11677,7 +13349,7 @@
           <w:sz w:val="27"/>
           <w:szCs w:val="27"/>
         </w:rPr>
-        <w:t xml:space="preserve">3.16 Reports &amp; KPIs</w:t>
+        <w:t xml:space="preserve">3.18 Reports &amp; KPIs</w:t>
       </w:r>
     </w:p>
     <w:p>
@@ -12131,7 +13803,7 @@
           <w:sz w:val="27"/>
           <w:szCs w:val="27"/>
         </w:rPr>
-        <w:t xml:space="preserve">3.17 Multi-Language &amp; Localization</w:t>
+        <w:t xml:space="preserve">3.19 Multi-Language &amp; Localization</w:t>
       </w:r>
     </w:p>
     <w:p>
@@ -12585,7 +14257,7 @@
           <w:sz w:val="27"/>
           <w:szCs w:val="27"/>
         </w:rPr>
-        <w:t xml:space="preserve">3.18 Multi-Tenancy</w:t>
+        <w:t xml:space="preserve">3.20 Multi-Tenancy</w:t>
       </w:r>
     </w:p>
     <w:p>
@@ -12907,7 +14579,7 @@
           <w:sz w:val="27"/>
           <w:szCs w:val="27"/>
         </w:rPr>
-        <w:t xml:space="preserve">3.19 Audit Trail</w:t>
+        <w:t xml:space="preserve">3.21 Audit Trail</w:t>
       </w:r>
     </w:p>
     <w:p>
@@ -14244,6 +15916,72 @@
                 <w:sz w:val="19"/>
                 <w:szCs w:val="19"/>
               </w:rPr>
+              <w:t xml:space="preserve">RACSI Matrix</w:t>
+            </w:r>
+          </w:p>
+        </w:tc>
+        <w:tc>
+          <w:tcPr>
+            <w:tcW w:type="dxa" w:w="7146"/>
+            <w:tcBorders>
+              <w:top w:val="single" w:color="E3E3E4" w:sz="2"/>
+              <w:left w:val="single" w:color="E3E3E4" w:sz="2"/>
+              <w:bottom w:val="single" w:color="E3E3E4" w:sz="2"/>
+              <w:right w:val="single" w:color="E3E3E4" w:sz="2"/>
+            </w:tcBorders>
+            <w:shd w:fill="F2F2F3" w:val="clear"/>
+            <w:tcMar>
+              <w:top w:type="dxa" w:w="80"/>
+              <w:left w:type="dxa" w:w="100"/>
+              <w:bottom w:type="dxa" w:w="80"/>
+              <w:right w:type="dxa" w:w="100"/>
+            </w:tcMar>
+            <w:vAlign w:val="center"/>
+          </w:tcPr>
+          <w:p>
+            <w:r>
+              <w:rPr>
+                <w:rFonts w:ascii="Times New Roman" w:cs="Times New Roman" w:eastAsia="Times New Roman" w:hAnsi="Times New Roman"/>
+                <w:b w:val="false"/>
+                <w:bCs w:val="false"/>
+                <w:color w:val="58595B"/>
+                <w:sz w:val="19"/>
+                <w:szCs w:val="19"/>
+              </w:rPr>
+              <w:t xml:space="preserve">Per-activity R/A/C/S/I assignment manager (roles or named people), filterable by reference type.</w:t>
+            </w:r>
+          </w:p>
+        </w:tc>
+      </w:tr>
+      <w:tr>
+        <w:tc>
+          <w:tcPr>
+            <w:tcW w:type="dxa" w:w="2600"/>
+            <w:tcBorders>
+              <w:top w:val="single" w:color="E3E3E4" w:sz="2"/>
+              <w:left w:val="single" w:color="E3E3E4" w:sz="2"/>
+              <w:bottom w:val="single" w:color="E3E3E4" w:sz="2"/>
+              <w:right w:val="single" w:color="E3E3E4" w:sz="2"/>
+            </w:tcBorders>
+            <w:shd w:fill="FFFFFF" w:val="clear"/>
+            <w:tcMar>
+              <w:top w:type="dxa" w:w="80"/>
+              <w:left w:type="dxa" w:w="100"/>
+              <w:bottom w:type="dxa" w:w="80"/>
+              <w:right w:type="dxa" w:w="100"/>
+            </w:tcMar>
+            <w:vAlign w:val="center"/>
+          </w:tcPr>
+          <w:p>
+            <w:r>
+              <w:rPr>
+                <w:rFonts w:ascii="Times New Roman" w:cs="Times New Roman" w:eastAsia="Times New Roman" w:hAnsi="Times New Roman"/>
+                <w:b w:val="false"/>
+                <w:bCs w:val="false"/>
+                <w:color w:val="58595B"/>
+                <w:sz w:val="19"/>
+                <w:szCs w:val="19"/>
+              </w:rPr>
               <w:t xml:space="preserve">Reports</w:t>
             </w:r>
           </w:p>
@@ -14257,7 +15995,7 @@
               <w:bottom w:val="single" w:color="E3E3E4" w:sz="2"/>
               <w:right w:val="single" w:color="E3E3E4" w:sz="2"/>
             </w:tcBorders>
-            <w:shd w:fill="F2F2F3" w:val="clear"/>
+            <w:shd w:fill="FFFFFF" w:val="clear"/>
             <w:tcMar>
               <w:top w:type="dxa" w:w="80"/>
               <w:left w:type="dxa" w:w="100"/>
@@ -14291,7 +16029,7 @@
               <w:bottom w:val="single" w:color="E3E3E4" w:sz="2"/>
               <w:right w:val="single" w:color="E3E3E4" w:sz="2"/>
             </w:tcBorders>
-            <w:shd w:fill="FFFFFF" w:val="clear"/>
+            <w:shd w:fill="F2F2F3" w:val="clear"/>
             <w:tcMar>
               <w:top w:type="dxa" w:w="80"/>
               <w:left w:type="dxa" w:w="100"/>
@@ -14323,7 +16061,7 @@
               <w:bottom w:val="single" w:color="E3E3E4" w:sz="2"/>
               <w:right w:val="single" w:color="E3E3E4" w:sz="2"/>
             </w:tcBorders>
-            <w:shd w:fill="FFFFFF" w:val="clear"/>
+            <w:shd w:fill="F2F2F3" w:val="clear"/>
             <w:tcMar>
               <w:top w:type="dxa" w:w="80"/>
               <w:left w:type="dxa" w:w="100"/>
@@ -14357,7 +16095,7 @@
               <w:bottom w:val="single" w:color="E3E3E4" w:sz="2"/>
               <w:right w:val="single" w:color="E3E3E4" w:sz="2"/>
             </w:tcBorders>
-            <w:shd w:fill="F2F2F3" w:val="clear"/>
+            <w:shd w:fill="FFFFFF" w:val="clear"/>
             <w:tcMar>
               <w:top w:type="dxa" w:w="80"/>
               <w:left w:type="dxa" w:w="100"/>
@@ -14389,7 +16127,7 @@
               <w:bottom w:val="single" w:color="E3E3E4" w:sz="2"/>
               <w:right w:val="single" w:color="E3E3E4" w:sz="2"/>
             </w:tcBorders>
-            <w:shd w:fill="F2F2F3" w:val="clear"/>
+            <w:shd w:fill="FFFFFF" w:val="clear"/>
             <w:tcMar>
               <w:top w:type="dxa" w:w="80"/>
               <w:left w:type="dxa" w:w="100"/>
@@ -14423,7 +16161,7 @@
               <w:bottom w:val="single" w:color="E3E3E4" w:sz="2"/>
               <w:right w:val="single" w:color="E3E3E4" w:sz="2"/>
             </w:tcBorders>
-            <w:shd w:fill="FFFFFF" w:val="clear"/>
+            <w:shd w:fill="F2F2F3" w:val="clear"/>
             <w:tcMar>
               <w:top w:type="dxa" w:w="80"/>
               <w:left w:type="dxa" w:w="100"/>
@@ -14455,26 +16193,26 @@
               <w:bottom w:val="single" w:color="E3E3E4" w:sz="2"/>
               <w:right w:val="single" w:color="E3E3E4" w:sz="2"/>
             </w:tcBorders>
-            <w:shd w:fill="FFFFFF" w:val="clear"/>
-            <w:tcMar>
-              <w:top w:type="dxa" w:w="80"/>
-              <w:left w:type="dxa" w:w="100"/>
-              <w:bottom w:type="dxa" w:w="80"/>
-              <w:right w:type="dxa" w:w="100"/>
-            </w:tcMar>
-            <w:vAlign w:val="center"/>
-          </w:tcPr>
-          <w:p>
-            <w:r>
-              <w:rPr>
-                <w:rFonts w:ascii="Times New Roman" w:cs="Times New Roman" w:eastAsia="Times New Roman" w:hAnsi="Times New Roman"/>
-                <w:b w:val="false"/>
-                <w:bCs w:val="false"/>
-                <w:color w:val="58595B"/>
-                <w:sz w:val="19"/>
-                <w:szCs w:val="19"/>
-              </w:rPr>
-              <w:t xml:space="preserve">Site/department/service/team tree management.</w:t>
+            <w:shd w:fill="F2F2F3" w:val="clear"/>
+            <w:tcMar>
+              <w:top w:type="dxa" w:w="80"/>
+              <w:left w:type="dxa" w:w="100"/>
+              <w:bottom w:type="dxa" w:w="80"/>
+              <w:right w:type="dxa" w:w="100"/>
+            </w:tcMar>
+            <w:vAlign w:val="center"/>
+          </w:tcPr>
+          <w:p>
+            <w:r>
+              <w:rPr>
+                <w:rFonts w:ascii="Times New Roman" w:cs="Times New Roman" w:eastAsia="Times New Roman" w:hAnsi="Times New Roman"/>
+                <w:b w:val="false"/>
+                <w:bCs w:val="false"/>
+                <w:color w:val="58595B"/>
+                <w:sz w:val="19"/>
+                <w:szCs w:val="19"/>
+              </w:rPr>
+              <w:t xml:space="preserve">Site/department/service/team tree management, with live linked-item counts per node.</w:t>
             </w:r>
           </w:p>
         </w:tc>
@@ -14489,7 +16227,7 @@
               <w:bottom w:val="single" w:color="E3E3E4" w:sz="2"/>
               <w:right w:val="single" w:color="E3E3E4" w:sz="2"/>
             </w:tcBorders>
-            <w:shd w:fill="F2F2F3" w:val="clear"/>
+            <w:shd w:fill="FFFFFF" w:val="clear"/>
             <w:tcMar>
               <w:top w:type="dxa" w:w="80"/>
               <w:left w:type="dxa" w:w="100"/>
@@ -14521,26 +16259,26 @@
               <w:bottom w:val="single" w:color="E3E3E4" w:sz="2"/>
               <w:right w:val="single" w:color="E3E3E4" w:sz="2"/>
             </w:tcBorders>
-            <w:shd w:fill="F2F2F3" w:val="clear"/>
-            <w:tcMar>
-              <w:top w:type="dxa" w:w="80"/>
-              <w:left w:type="dxa" w:w="100"/>
-              <w:bottom w:type="dxa" w:w="80"/>
-              <w:right w:type="dxa" w:w="100"/>
-            </w:tcMar>
-            <w:vAlign w:val="center"/>
-          </w:tcPr>
-          <w:p>
-            <w:r>
-              <w:rPr>
-                <w:rFonts w:ascii="Times New Roman" w:cs="Times New Roman" w:eastAsia="Times New Roman" w:hAnsi="Times New Roman"/>
-                <w:b w:val="false"/>
-                <w:bCs w:val="false"/>
-                <w:color w:val="58595B"/>
-                <w:sz w:val="19"/>
-                <w:szCs w:val="19"/>
-              </w:rPr>
-              <w:t xml:space="preserve">User directory and role assignment.</w:t>
+            <w:shd w:fill="FFFFFF" w:val="clear"/>
+            <w:tcMar>
+              <w:top w:type="dxa" w:w="80"/>
+              <w:left w:type="dxa" w:w="100"/>
+              <w:bottom w:type="dxa" w:w="80"/>
+              <w:right w:type="dxa" w:w="100"/>
+            </w:tcMar>
+            <w:vAlign w:val="center"/>
+          </w:tcPr>
+          <w:p>
+            <w:r>
+              <w:rPr>
+                <w:rFonts w:ascii="Times New Roman" w:cs="Times New Roman" w:eastAsia="Times New Roman" w:hAnsi="Times New Roman"/>
+                <w:b w:val="false"/>
+                <w:bCs w:val="false"/>
+                <w:color w:val="58595B"/>
+                <w:sz w:val="19"/>
+                <w:szCs w:val="19"/>
+              </w:rPr>
+              <w:t xml:space="preserve">User directory and role assignment, scoped to an OBS node.</w:t>
             </w:r>
           </w:p>
         </w:tc>
@@ -14555,7 +16293,7 @@
               <w:bottom w:val="single" w:color="E3E3E4" w:sz="2"/>
               <w:right w:val="single" w:color="E3E3E4" w:sz="2"/>
             </w:tcBorders>
-            <w:shd w:fill="FFFFFF" w:val="clear"/>
+            <w:shd w:fill="F2F2F3" w:val="clear"/>
             <w:tcMar>
               <w:top w:type="dxa" w:w="80"/>
               <w:left w:type="dxa" w:w="100"/>
@@ -14587,7 +16325,7 @@
               <w:bottom w:val="single" w:color="E3E3E4" w:sz="2"/>
               <w:right w:val="single" w:color="E3E3E4" w:sz="2"/>
             </w:tcBorders>
-            <w:shd w:fill="FFFFFF" w:val="clear"/>
+            <w:shd w:fill="F2F2F3" w:val="clear"/>
             <w:tcMar>
               <w:top w:type="dxa" w:w="80"/>
               <w:left w:type="dxa" w:w="100"/>
@@ -14621,7 +16359,7 @@
               <w:bottom w:val="single" w:color="E3E3E4" w:sz="2"/>
               <w:right w:val="single" w:color="E3E3E4" w:sz="2"/>
             </w:tcBorders>
-            <w:shd w:fill="F2F2F3" w:val="clear"/>
+            <w:shd w:fill="FFFFFF" w:val="clear"/>
             <w:tcMar>
               <w:top w:type="dxa" w:w="80"/>
               <w:left w:type="dxa" w:w="100"/>
@@ -14653,7 +16391,7 @@
               <w:bottom w:val="single" w:color="E3E3E4" w:sz="2"/>
               <w:right w:val="single" w:color="E3E3E4" w:sz="2"/>
             </w:tcBorders>
-            <w:shd w:fill="F2F2F3" w:val="clear"/>
+            <w:shd w:fill="FFFFFF" w:val="clear"/>
             <w:tcMar>
               <w:top w:type="dxa" w:w="80"/>
               <w:left w:type="dxa" w:w="100"/>
@@ -14687,7 +16425,7 @@
               <w:bottom w:val="single" w:color="E3E3E4" w:sz="2"/>
               <w:right w:val="single" w:color="E3E3E4" w:sz="2"/>
             </w:tcBorders>
-            <w:shd w:fill="FFFFFF" w:val="clear"/>
+            <w:shd w:fill="F2F2F3" w:val="clear"/>
             <w:tcMar>
               <w:top w:type="dxa" w:w="80"/>
               <w:left w:type="dxa" w:w="100"/>
@@ -14719,7 +16457,7 @@
               <w:bottom w:val="single" w:color="E3E3E4" w:sz="2"/>
               <w:right w:val="single" w:color="E3E3E4" w:sz="2"/>
             </w:tcBorders>
-            <w:shd w:fill="FFFFFF" w:val="clear"/>
+            <w:shd w:fill="F2F2F3" w:val="clear"/>
             <w:tcMar>
               <w:top w:type="dxa" w:w="80"/>
               <w:left w:type="dxa" w:w="100"/>
@@ -14739,6 +16477,72 @@
                 <w:szCs w:val="19"/>
               </w:rPr>
               <w:t xml:space="preserve">Plan tier, deployment model, seats, billing.</w:t>
+            </w:r>
+          </w:p>
+        </w:tc>
+      </w:tr>
+      <w:tr>
+        <w:tc>
+          <w:tcPr>
+            <w:tcW w:type="dxa" w:w="2600"/>
+            <w:tcBorders>
+              <w:top w:val="single" w:color="E3E3E4" w:sz="2"/>
+              <w:left w:val="single" w:color="E3E3E4" w:sz="2"/>
+              <w:bottom w:val="single" w:color="E3E3E4" w:sz="2"/>
+              <w:right w:val="single" w:color="E3E3E4" w:sz="2"/>
+            </w:tcBorders>
+            <w:shd w:fill="FFFFFF" w:val="clear"/>
+            <w:tcMar>
+              <w:top w:type="dxa" w:w="80"/>
+              <w:left w:type="dxa" w:w="100"/>
+              <w:bottom w:type="dxa" w:w="80"/>
+              <w:right w:type="dxa" w:w="100"/>
+            </w:tcMar>
+            <w:vAlign w:val="center"/>
+          </w:tcPr>
+          <w:p>
+            <w:r>
+              <w:rPr>
+                <w:rFonts w:ascii="Times New Roman" w:cs="Times New Roman" w:eastAsia="Times New Roman" w:hAnsi="Times New Roman"/>
+                <w:b w:val="false"/>
+                <w:bCs w:val="false"/>
+                <w:color w:val="58595B"/>
+                <w:sz w:val="19"/>
+                <w:szCs w:val="19"/>
+              </w:rPr>
+              <w:t xml:space="preserve">Help</w:t>
+            </w:r>
+          </w:p>
+        </w:tc>
+        <w:tc>
+          <w:tcPr>
+            <w:tcW w:type="dxa" w:w="7146"/>
+            <w:tcBorders>
+              <w:top w:val="single" w:color="E3E3E4" w:sz="2"/>
+              <w:left w:val="single" w:color="E3E3E4" w:sz="2"/>
+              <w:bottom w:val="single" w:color="E3E3E4" w:sz="2"/>
+              <w:right w:val="single" w:color="E3E3E4" w:sz="2"/>
+            </w:tcBorders>
+            <w:shd w:fill="FFFFFF" w:val="clear"/>
+            <w:tcMar>
+              <w:top w:type="dxa" w:w="80"/>
+              <w:left w:type="dxa" w:w="100"/>
+              <w:bottom w:type="dxa" w:w="80"/>
+              <w:right w:type="dxa" w:w="100"/>
+            </w:tcMar>
+            <w:vAlign w:val="center"/>
+          </w:tcPr>
+          <w:p>
+            <w:r>
+              <w:rPr>
+                <w:rFonts w:ascii="Times New Roman" w:cs="Times New Roman" w:eastAsia="Times New Roman" w:hAnsi="Times New Roman"/>
+                <w:b w:val="false"/>
+                <w:bCs w:val="false"/>
+                <w:color w:val="58595B"/>
+                <w:sz w:val="19"/>
+                <w:szCs w:val="19"/>
+              </w:rPr>
+              <w:t xml:space="preserve">Searchable, multi-language user guide covering every module; open to all authenticated users.</w:t>
             </w:r>
           </w:p>
         </w:tc>
@@ -15191,7 +16995,7 @@
                 <w:sz w:val="19"/>
                 <w:szCs w:val="19"/>
               </w:rPr>
-              <w:t xml:space="preserve">GET|POST /api/roles, PUT|DELETE /api/roles/:id, GET /api/roles/permissions/catalog, GET /api/roles/permissions/matrix, PUT /api/roles/:id/permissions</w:t>
+              <w:t xml:space="preserve">GET|POST /api/roles, PUT|DELETE /api/roles/:id, GET /api/roles/directory, GET /api/roles/permissions/catalog, GET /api/roles/permissions/matrix, PUT /api/roles/:id/permissions</w:t>
             </w:r>
           </w:p>
         </w:tc>
@@ -16017,6 +17821,72 @@
                 <w:sz w:val="19"/>
                 <w:szCs w:val="19"/>
               </w:rPr>
+              <w:t xml:space="preserve">RACSI</w:t>
+            </w:r>
+          </w:p>
+        </w:tc>
+        <w:tc>
+          <w:tcPr>
+            <w:tcW w:type="dxa" w:w="7746"/>
+            <w:tcBorders>
+              <w:top w:val="single" w:color="E3E3E4" w:sz="2"/>
+              <w:left w:val="single" w:color="E3E3E4" w:sz="2"/>
+              <w:bottom w:val="single" w:color="E3E3E4" w:sz="2"/>
+              <w:right w:val="single" w:color="E3E3E4" w:sz="2"/>
+            </w:tcBorders>
+            <w:shd w:fill="F2F2F3" w:val="clear"/>
+            <w:tcMar>
+              <w:top w:type="dxa" w:w="80"/>
+              <w:left w:type="dxa" w:w="100"/>
+              <w:bottom w:type="dxa" w:w="80"/>
+              <w:right w:type="dxa" w:w="100"/>
+            </w:tcMar>
+            <w:vAlign w:val="center"/>
+          </w:tcPr>
+          <w:p>
+            <w:r>
+              <w:rPr>
+                <w:rFonts w:ascii="Times New Roman" w:cs="Times New Roman" w:eastAsia="Times New Roman" w:hAnsi="Times New Roman"/>
+                <w:b w:val="false"/>
+                <w:bCs w:val="false"/>
+                <w:color w:val="58595B"/>
+                <w:sz w:val="19"/>
+                <w:szCs w:val="19"/>
+              </w:rPr>
+              <w:t xml:space="preserve">GET|POST /api/racsi, GET|PUT|DELETE /api/racsi/:id, POST /api/racsi/:id/assignments, DELETE /api/racsi/:id/assignments/:assignmentId</w:t>
+            </w:r>
+          </w:p>
+        </w:tc>
+      </w:tr>
+      <w:tr>
+        <w:tc>
+          <w:tcPr>
+            <w:tcW w:type="dxa" w:w="2000"/>
+            <w:tcBorders>
+              <w:top w:val="single" w:color="E3E3E4" w:sz="2"/>
+              <w:left w:val="single" w:color="E3E3E4" w:sz="2"/>
+              <w:bottom w:val="single" w:color="E3E3E4" w:sz="2"/>
+              <w:right w:val="single" w:color="E3E3E4" w:sz="2"/>
+            </w:tcBorders>
+            <w:shd w:fill="FFFFFF" w:val="clear"/>
+            <w:tcMar>
+              <w:top w:type="dxa" w:w="80"/>
+              <w:left w:type="dxa" w:w="100"/>
+              <w:bottom w:type="dxa" w:w="80"/>
+              <w:right w:type="dxa" w:w="100"/>
+            </w:tcMar>
+            <w:vAlign w:val="center"/>
+          </w:tcPr>
+          <w:p>
+            <w:r>
+              <w:rPr>
+                <w:rFonts w:ascii="Times New Roman" w:cs="Times New Roman" w:eastAsia="Times New Roman" w:hAnsi="Times New Roman"/>
+                <w:b w:val="false"/>
+                <w:bCs w:val="false"/>
+                <w:color w:val="58595B"/>
+                <w:sz w:val="19"/>
+                <w:szCs w:val="19"/>
+              </w:rPr>
               <w:t xml:space="preserve">Reports</w:t>
             </w:r>
           </w:p>
@@ -16030,7 +17900,7 @@
               <w:bottom w:val="single" w:color="E3E3E4" w:sz="2"/>
               <w:right w:val="single" w:color="E3E3E4" w:sz="2"/>
             </w:tcBorders>
-            <w:shd w:fill="F2F2F3" w:val="clear"/>
+            <w:shd w:fill="FFFFFF" w:val="clear"/>
             <w:tcMar>
               <w:top w:type="dxa" w:w="80"/>
               <w:left w:type="dxa" w:w="100"/>
@@ -16064,7 +17934,7 @@
               <w:bottom w:val="single" w:color="E3E3E4" w:sz="2"/>
               <w:right w:val="single" w:color="E3E3E4" w:sz="2"/>
             </w:tcBorders>
-            <w:shd w:fill="FFFFFF" w:val="clear"/>
+            <w:shd w:fill="F2F2F3" w:val="clear"/>
             <w:tcMar>
               <w:top w:type="dxa" w:w="80"/>
               <w:left w:type="dxa" w:w="100"/>
@@ -16096,7 +17966,7 @@
               <w:bottom w:val="single" w:color="E3E3E4" w:sz="2"/>
               <w:right w:val="single" w:color="E3E3E4" w:sz="2"/>
             </w:tcBorders>
-            <w:shd w:fill="FFFFFF" w:val="clear"/>
+            <w:shd w:fill="F2F2F3" w:val="clear"/>
             <w:tcMar>
               <w:top w:type="dxa" w:w="80"/>
               <w:left w:type="dxa" w:w="100"/>
@@ -16995,6 +18865,72 @@
           </w:p>
         </w:tc>
       </w:tr>
+      <w:tr>
+        <w:tc>
+          <w:tcPr>
+            <w:tcW w:type="dxa" w:w="1500"/>
+            <w:tcBorders>
+              <w:top w:val="single" w:color="E3E3E4" w:sz="2"/>
+              <w:left w:val="single" w:color="E3E3E4" w:sz="2"/>
+              <w:bottom w:val="single" w:color="E3E3E4" w:sz="2"/>
+              <w:right w:val="single" w:color="E3E3E4" w:sz="2"/>
+            </w:tcBorders>
+            <w:shd w:fill="F2F2F3" w:val="clear"/>
+            <w:tcMar>
+              <w:top w:type="dxa" w:w="80"/>
+              <w:left w:type="dxa" w:w="100"/>
+              <w:bottom w:type="dxa" w:w="80"/>
+              <w:right w:type="dxa" w:w="100"/>
+            </w:tcMar>
+            <w:vAlign w:val="center"/>
+          </w:tcPr>
+          <w:p>
+            <w:r>
+              <w:rPr>
+                <w:rFonts w:ascii="Times New Roman" w:cs="Times New Roman" w:eastAsia="Times New Roman" w:hAnsi="Times New Roman"/>
+                <w:b w:val="false"/>
+                <w:bCs w:val="false"/>
+                <w:color w:val="58595B"/>
+                <w:sz w:val="19"/>
+                <w:szCs w:val="19"/>
+              </w:rPr>
+              <w:t xml:space="preserve">NFR-SEC-06</w:t>
+            </w:r>
+          </w:p>
+        </w:tc>
+        <w:tc>
+          <w:tcPr>
+            <w:tcW w:type="dxa" w:w="8246"/>
+            <w:tcBorders>
+              <w:top w:val="single" w:color="E3E3E4" w:sz="2"/>
+              <w:left w:val="single" w:color="E3E3E4" w:sz="2"/>
+              <w:bottom w:val="single" w:color="E3E3E4" w:sz="2"/>
+              <w:right w:val="single" w:color="E3E3E4" w:sz="2"/>
+            </w:tcBorders>
+            <w:shd w:fill="F2F2F3" w:val="clear"/>
+            <w:tcMar>
+              <w:top w:type="dxa" w:w="80"/>
+              <w:left w:type="dxa" w:w="100"/>
+              <w:bottom w:type="dxa" w:w="80"/>
+              <w:right w:type="dxa" w:w="100"/>
+            </w:tcMar>
+            <w:vAlign w:val="center"/>
+          </w:tcPr>
+          <w:p>
+            <w:r>
+              <w:rPr>
+                <w:rFonts w:ascii="Times New Roman" w:cs="Times New Roman" w:eastAsia="Times New Roman" w:hAnsi="Times New Roman"/>
+                <w:b w:val="false"/>
+                <w:bCs w:val="false"/>
+                <w:color w:val="58595B"/>
+                <w:sz w:val="19"/>
+                <w:szCs w:val="19"/>
+              </w:rPr>
+              <w:t xml:space="preserve">The one-Accountable-per-RACSI-activity rule (FR-RACSI-06) shall be enforced by a database-level constraint, not merely by disabling the option in the UI.</w:t>
+            </w:r>
+          </w:p>
+        </w:tc>
+      </w:tr>
     </w:tbl>
     <w:p>
       <w:pPr>
@@ -19089,7 +21025,7 @@
                 <w:sz w:val="19"/>
                 <w:szCs w:val="19"/>
               </w:rPr>
-              <w:t xml:space="preserve">A node in the Organizational Breakdown Structure tree (site/department/service/team).</w:t>
+              <w:t xml:space="preserve">A node in the Organizational Breakdown Structure tree (site/department/service/team); referenced by users, Sheets, Business Rules, Controls, Risks/Opportunities, and RACSI Activities as their owning org unit.</w:t>
             </w:r>
           </w:p>
         </w:tc>
@@ -20409,7 +22345,7 @@
                 <w:sz w:val="19"/>
                 <w:szCs w:val="19"/>
               </w:rPr>
-              <w:t xml:space="preserve">A governed IF/THEN process rule with severity and owner.</w:t>
+              <w:t xml:space="preserve">A governed IF/THEN process rule with severity, owner, and owning OBS node.</w:t>
             </w:r>
           </w:p>
         </w:tc>
@@ -20475,7 +22411,7 @@
                 <w:sz w:val="19"/>
                 <w:szCs w:val="19"/>
               </w:rPr>
-              <w:t xml:space="preserve">A COSO-classified internal control with type, frequency, effectiveness.</w:t>
+              <w:t xml:space="preserve">A COSO-classified internal control with type, frequency, effectiveness, and owning OBS node.</w:t>
             </w:r>
           </w:p>
         </w:tc>
@@ -20541,7 +22477,7 @@
                 <w:sz w:val="19"/>
                 <w:szCs w:val="19"/>
               </w:rPr>
-              <w:t xml:space="preserve">A risk or opportunity item with likelihood/impact scoring.</w:t>
+              <w:t xml:space="preserve">A risk or opportunity item with likelihood/impact scoring and owning OBS node.</w:t>
             </w:r>
           </w:p>
         </w:tc>
@@ -20608,6 +22544,138 @@
                 <w:szCs w:val="19"/>
               </w:rPr>
               <w:t xml:space="preserve">Join entity: controls mitigating a given risk/opportunity.</w:t>
+            </w:r>
+          </w:p>
+        </w:tc>
+      </w:tr>
+      <w:tr>
+        <w:tc>
+          <w:tcPr>
+            <w:tcW w:type="dxa" w:w="2400"/>
+            <w:tcBorders>
+              <w:top w:val="single" w:color="E3E3E4" w:sz="2"/>
+              <w:left w:val="single" w:color="E3E3E4" w:sz="2"/>
+              <w:bottom w:val="single" w:color="E3E3E4" w:sz="2"/>
+              <w:right w:val="single" w:color="E3E3E4" w:sz="2"/>
+            </w:tcBorders>
+            <w:shd w:fill="F2F2F3" w:val="clear"/>
+            <w:tcMar>
+              <w:top w:type="dxa" w:w="80"/>
+              <w:left w:type="dxa" w:w="100"/>
+              <w:bottom w:type="dxa" w:w="80"/>
+              <w:right w:type="dxa" w:w="100"/>
+            </w:tcMar>
+            <w:vAlign w:val="center"/>
+          </w:tcPr>
+          <w:p>
+            <w:r>
+              <w:rPr>
+                <w:rFonts w:ascii="Times New Roman" w:cs="Times New Roman" w:eastAsia="Times New Roman" w:hAnsi="Times New Roman"/>
+                <w:b w:val="false"/>
+                <w:bCs w:val="false"/>
+                <w:color w:val="58595B"/>
+                <w:sz w:val="19"/>
+                <w:szCs w:val="19"/>
+              </w:rPr>
+              <w:t xml:space="preserve">RacsiActivity</w:t>
+            </w:r>
+          </w:p>
+        </w:tc>
+        <w:tc>
+          <w:tcPr>
+            <w:tcW w:type="dxa" w:w="7346"/>
+            <w:tcBorders>
+              <w:top w:val="single" w:color="E3E3E4" w:sz="2"/>
+              <w:left w:val="single" w:color="E3E3E4" w:sz="2"/>
+              <w:bottom w:val="single" w:color="E3E3E4" w:sz="2"/>
+              <w:right w:val="single" w:color="E3E3E4" w:sz="2"/>
+            </w:tcBorders>
+            <w:shd w:fill="F2F2F3" w:val="clear"/>
+            <w:tcMar>
+              <w:top w:type="dxa" w:w="80"/>
+              <w:left w:type="dxa" w:w="100"/>
+              <w:bottom w:type="dxa" w:w="80"/>
+              <w:right w:type="dxa" w:w="100"/>
+            </w:tcMar>
+            <w:vAlign w:val="center"/>
+          </w:tcPr>
+          <w:p>
+            <w:r>
+              <w:rPr>
+                <w:rFonts w:ascii="Times New Roman" w:cs="Times New Roman" w:eastAsia="Times New Roman" w:hAnsi="Times New Roman"/>
+                <w:b w:val="false"/>
+                <w:bCs w:val="false"/>
+                <w:color w:val="58595B"/>
+                <w:sz w:val="19"/>
+                <w:szCs w:val="19"/>
+              </w:rPr>
+              <w:t xml:space="preserve">One of the 7 NCP process steps or a governance item linked to a Business Rule/Control/Risk record; carries an owning OBS node.</w:t>
+            </w:r>
+          </w:p>
+        </w:tc>
+      </w:tr>
+      <w:tr>
+        <w:tc>
+          <w:tcPr>
+            <w:tcW w:type="dxa" w:w="2400"/>
+            <w:tcBorders>
+              <w:top w:val="single" w:color="E3E3E4" w:sz="2"/>
+              <w:left w:val="single" w:color="E3E3E4" w:sz="2"/>
+              <w:bottom w:val="single" w:color="E3E3E4" w:sz="2"/>
+              <w:right w:val="single" w:color="E3E3E4" w:sz="2"/>
+            </w:tcBorders>
+            <w:shd w:fill="FFFFFF" w:val="clear"/>
+            <w:tcMar>
+              <w:top w:type="dxa" w:w="80"/>
+              <w:left w:type="dxa" w:w="100"/>
+              <w:bottom w:type="dxa" w:w="80"/>
+              <w:right w:type="dxa" w:w="100"/>
+            </w:tcMar>
+            <w:vAlign w:val="center"/>
+          </w:tcPr>
+          <w:p>
+            <w:r>
+              <w:rPr>
+                <w:rFonts w:ascii="Times New Roman" w:cs="Times New Roman" w:eastAsia="Times New Roman" w:hAnsi="Times New Roman"/>
+                <w:b w:val="false"/>
+                <w:bCs w:val="false"/>
+                <w:color w:val="58595B"/>
+                <w:sz w:val="19"/>
+                <w:szCs w:val="19"/>
+              </w:rPr>
+              <w:t xml:space="preserve">RacsiAssignment</w:t>
+            </w:r>
+          </w:p>
+        </w:tc>
+        <w:tc>
+          <w:tcPr>
+            <w:tcW w:type="dxa" w:w="7346"/>
+            <w:tcBorders>
+              <w:top w:val="single" w:color="E3E3E4" w:sz="2"/>
+              <w:left w:val="single" w:color="E3E3E4" w:sz="2"/>
+              <w:bottom w:val="single" w:color="E3E3E4" w:sz="2"/>
+              <w:right w:val="single" w:color="E3E3E4" w:sz="2"/>
+            </w:tcBorders>
+            <w:shd w:fill="FFFFFF" w:val="clear"/>
+            <w:tcMar>
+              <w:top w:type="dxa" w:w="80"/>
+              <w:left w:type="dxa" w:w="100"/>
+              <w:bottom w:type="dxa" w:w="80"/>
+              <w:right w:type="dxa" w:w="100"/>
+            </w:tcMar>
+            <w:vAlign w:val="center"/>
+          </w:tcPr>
+          <w:p>
+            <w:r>
+              <w:rPr>
+                <w:rFonts w:ascii="Times New Roman" w:cs="Times New Roman" w:eastAsia="Times New Roman" w:hAnsi="Times New Roman"/>
+                <w:b w:val="false"/>
+                <w:bCs w:val="false"/>
+                <w:color w:val="58595B"/>
+                <w:sz w:val="19"/>
+                <w:szCs w:val="19"/>
+              </w:rPr>
+              <w:t xml:space="preserve">One R/A/C/S/I assignment on a RacsiActivity, pointing to either a Role or a User; at most one Accountable per Activity.</w:t>
             </w:r>
           </w:p>
         </w:tc>
@@ -20650,7 +22718,7 @@
           <w:sz w:val="24"/>
           <w:szCs w:val="24"/>
         </w:rPr>
-        <w:t xml:space="preserve">The full permission matrix (role x permission) is administered live in the application's Permission Matrix screen and comprises approximately 60 permission codes across 20 modules (dashboard, fiche, action, rootcause, rex, standard, capitalization, user, role, hierarchy, obs, license, governance, aiUseCase, businessRule, control, riskOpportunity, report, alert, audit), each with up to five actions (view, create, edit, delete, and module-specific actions such as validate, close, assignTeam, updateOwn, evaluate, manageRoles, managePermissions, manage, export). Section 2.3 summarizes the resulting access per standard role; the live matrix is the system of record.</w:t>
+        <w:t xml:space="preserve">The full permission matrix (role x permission) is administered live in the application's Permission Matrix screen and comprises 72 permission codes across 22 modules (dashboard, help, fiche, action, rootcause, rex, standard, capitalization, user, role, hierarchy, obs, license, governance, aiUseCase, businessRule, control, riskOpportunity, racsi, report, alert, audit), each with up to five actions (view, create, edit, delete, and module-specific actions such as validate, close, assignTeam, updateOwn, evaluate, manageRoles, managePermissions, manage, export). Section 2.3 summarizes the resulting access per standard role; the live matrix is the system of record.</w:t>
       </w:r>
     </w:p>
     <w:p>
@@ -24499,7 +26567,7 @@
                 <w:sz w:val="19"/>
                 <w:szCs w:val="19"/>
               </w:rPr>
-              <w:t xml:space="preserve">Organizational Breakdown Structure - the site/department/service/team tree.</w:t>
+              <w:t xml:space="preserve">Organizational Breakdown Structure - the site/department/service/team tree; the shared source of roles and named people that other modules, including RACSI, point back to.</w:t>
             </w:r>
           </w:p>
         </w:tc>
@@ -24533,6 +26601,72 @@
                 <w:sz w:val="19"/>
                 <w:szCs w:val="19"/>
               </w:rPr>
+              <w:t xml:space="preserve">RACSI</w:t>
+            </w:r>
+          </w:p>
+        </w:tc>
+        <w:tc>
+          <w:tcPr>
+            <w:tcW w:type="dxa" w:w="7346"/>
+            <w:tcBorders>
+              <w:top w:val="single" w:color="E3E3E4" w:sz="2"/>
+              <w:left w:val="single" w:color="E3E3E4" w:sz="2"/>
+              <w:bottom w:val="single" w:color="E3E3E4" w:sz="2"/>
+              <w:right w:val="single" w:color="E3E3E4" w:sz="2"/>
+            </w:tcBorders>
+            <w:shd w:fill="FFFFFF" w:val="clear"/>
+            <w:tcMar>
+              <w:top w:type="dxa" w:w="80"/>
+              <w:left w:type="dxa" w:w="100"/>
+              <w:bottom w:type="dxa" w:w="80"/>
+              <w:right w:type="dxa" w:w="100"/>
+            </w:tcMar>
+            <w:vAlign w:val="center"/>
+          </w:tcPr>
+          <w:p>
+            <w:r>
+              <w:rPr>
+                <w:rFonts w:ascii="Times New Roman" w:cs="Times New Roman" w:eastAsia="Times New Roman" w:hAnsi="Times New Roman"/>
+                <w:b w:val="false"/>
+                <w:bCs w:val="false"/>
+                <w:color w:val="58595B"/>
+                <w:sz w:val="19"/>
+                <w:szCs w:val="19"/>
+              </w:rPr>
+              <w:t xml:space="preserve">Responsible, Accountable, Consulted, Support, Informed - a five-role extension of the classic RACI accountability model; exactly one Accountable per activity, the other four roles allow multiple assignees.</w:t>
+            </w:r>
+          </w:p>
+        </w:tc>
+      </w:tr>
+      <w:tr>
+        <w:tc>
+          <w:tcPr>
+            <w:tcW w:type="dxa" w:w="2400"/>
+            <w:tcBorders>
+              <w:top w:val="single" w:color="E3E3E4" w:sz="2"/>
+              <w:left w:val="single" w:color="E3E3E4" w:sz="2"/>
+              <w:bottom w:val="single" w:color="E3E3E4" w:sz="2"/>
+              <w:right w:val="single" w:color="E3E3E4" w:sz="2"/>
+            </w:tcBorders>
+            <w:shd w:fill="F2F2F3" w:val="clear"/>
+            <w:tcMar>
+              <w:top w:type="dxa" w:w="80"/>
+              <w:left w:type="dxa" w:w="100"/>
+              <w:bottom w:type="dxa" w:w="80"/>
+              <w:right w:type="dxa" w:w="100"/>
+            </w:tcMar>
+            <w:vAlign w:val="center"/>
+          </w:tcPr>
+          <w:p>
+            <w:r>
+              <w:rPr>
+                <w:rFonts w:ascii="Times New Roman" w:cs="Times New Roman" w:eastAsia="Times New Roman" w:hAnsi="Times New Roman"/>
+                <w:b w:val="false"/>
+                <w:bCs w:val="false"/>
+                <w:color w:val="58595B"/>
+                <w:sz w:val="19"/>
+                <w:szCs w:val="19"/>
+              </w:rPr>
               <w:t xml:space="preserve">Multi-Tenant</w:t>
             </w:r>
           </w:p>
@@ -24546,7 +26680,7 @@
               <w:bottom w:val="single" w:color="E3E3E4" w:sz="2"/>
               <w:right w:val="single" w:color="E3E3E4" w:sz="2"/>
             </w:tcBorders>
-            <w:shd w:fill="FFFFFF" w:val="clear"/>
+            <w:shd w:fill="F2F2F3" w:val="clear"/>
             <w:tcMar>
               <w:top w:type="dxa" w:w="80"/>
               <w:left w:type="dxa" w:w="100"/>
@@ -24580,7 +26714,7 @@
               <w:bottom w:val="single" w:color="E3E3E4" w:sz="2"/>
               <w:right w:val="single" w:color="E3E3E4" w:sz="2"/>
             </w:tcBorders>
-            <w:shd w:fill="F2F2F3" w:val="clear"/>
+            <w:shd w:fill="FFFFFF" w:val="clear"/>
             <w:tcMar>
               <w:top w:type="dxa" w:w="80"/>
               <w:left w:type="dxa" w:w="100"/>
@@ -24612,7 +26746,7 @@
               <w:bottom w:val="single" w:color="E3E3E4" w:sz="2"/>
               <w:right w:val="single" w:color="E3E3E4" w:sz="2"/>
             </w:tcBorders>
-            <w:shd w:fill="F2F2F3" w:val="clear"/>
+            <w:shd w:fill="FFFFFF" w:val="clear"/>
             <w:tcMar>
               <w:top w:type="dxa" w:w="80"/>
               <w:left w:type="dxa" w:w="100"/>

</xml_diff>

<commit_message>
Update SRS to v1.4: generic, one-per-step AI Use Cases Library
Reflects the AI Use Cases Library change: FR-AIUC-01 intro and a new
FR-AIUC-10 document that every Organization is now seeded with the same
seven generic AI Use Cases (one per NCP process step, documenting the
built-in AI Agents from section 3.10) rather than the four hypothetical,
sector-flavored roadmap ideas per sector used in v1.3.

Co-Authored-By: Claude Sonnet 5 <noreply@anthropic.com>
Claude-Session: https://claude.ai/code/session_01JawUecr4zdt3wAKeYty8P7
</commit_message>
<xml_diff>
--- a/ncp-solver/docs/NCP_Solver_SRS.docx
+++ b/ncp-solver/docs/NCP_Solver_SRS.docx
@@ -101,7 +101,7 @@
           <w:sz w:val="22"/>
           <w:szCs w:val="22"/>
         </w:rPr>
-        <w:t xml:space="preserve">Version 1.3</w:t>
+        <w:t xml:space="preserve">Version 1.4</w:t>
       </w:r>
     </w:p>
     <w:p>
@@ -10216,7 +10216,7 @@
           <w:sz w:val="19"/>
           <w:szCs w:val="19"/>
         </w:rPr>
-        <w:t xml:space="preserve">An independent catalog of AI use cases, unrelated to the Capitalization Library, with full version history.</w:t>
+        <w:t xml:space="preserve">An independent catalog of AI use cases, unrelated to the Capitalization Library, with full version history. The catalog is seeded generically rather than per sector: every Organization, regardless of industry, receives the same seven use cases, one per NCP process step, each documenting the corresponding built-in AI Agent from section 3.10 (Classification, Problem Structuring, Containment Advisor, Root Cause Mining, Action Recommendation, Evaluation Assistant, REX Generation) at maturity stage 5/Production, since these are shipped and running capabilities, not roadmap ideas.</w:t>
       </w:r>
     </w:p>
     <w:tbl>
@@ -10894,6 +10894,72 @@
                 <w:szCs w:val="19"/>
               </w:rPr>
               <w:t xml:space="preserve">The system shall allow an authorized user to toggle an AI Use Case between Active and Inactive status without deleting it or discarding its version history.</w:t>
+            </w:r>
+          </w:p>
+        </w:tc>
+      </w:tr>
+      <w:tr>
+        <w:tc>
+          <w:tcPr>
+            <w:tcW w:type="dxa" w:w="1500"/>
+            <w:tcBorders>
+              <w:top w:val="single" w:color="E3E3E4" w:sz="2"/>
+              <w:left w:val="single" w:color="E3E3E4" w:sz="2"/>
+              <w:bottom w:val="single" w:color="E3E3E4" w:sz="2"/>
+              <w:right w:val="single" w:color="E3E3E4" w:sz="2"/>
+            </w:tcBorders>
+            <w:shd w:fill="F2F2F3" w:val="clear"/>
+            <w:tcMar>
+              <w:top w:type="dxa" w:w="80"/>
+              <w:left w:type="dxa" w:w="100"/>
+              <w:bottom w:type="dxa" w:w="80"/>
+              <w:right w:type="dxa" w:w="100"/>
+            </w:tcMar>
+            <w:vAlign w:val="center"/>
+          </w:tcPr>
+          <w:p>
+            <w:r>
+              <w:rPr>
+                <w:rFonts w:ascii="Times New Roman" w:cs="Times New Roman" w:eastAsia="Times New Roman" w:hAnsi="Times New Roman"/>
+                <w:b w:val="false"/>
+                <w:bCs w:val="false"/>
+                <w:color w:val="58595B"/>
+                <w:sz w:val="19"/>
+                <w:szCs w:val="19"/>
+              </w:rPr>
+              <w:t xml:space="preserve">FR-AIUC-10</w:t>
+            </w:r>
+          </w:p>
+        </w:tc>
+        <w:tc>
+          <w:tcPr>
+            <w:tcW w:type="dxa" w:w="8246"/>
+            <w:tcBorders>
+              <w:top w:val="single" w:color="E3E3E4" w:sz="2"/>
+              <w:left w:val="single" w:color="E3E3E4" w:sz="2"/>
+              <w:bottom w:val="single" w:color="E3E3E4" w:sz="2"/>
+              <w:right w:val="single" w:color="E3E3E4" w:sz="2"/>
+            </w:tcBorders>
+            <w:shd w:fill="F2F2F3" w:val="clear"/>
+            <w:tcMar>
+              <w:top w:type="dxa" w:w="80"/>
+              <w:left w:type="dxa" w:w="100"/>
+              <w:bottom w:type="dxa" w:w="80"/>
+              <w:right w:type="dxa" w:w="100"/>
+            </w:tcMar>
+            <w:vAlign w:val="center"/>
+          </w:tcPr>
+          <w:p>
+            <w:r>
+              <w:rPr>
+                <w:rFonts w:ascii="Times New Roman" w:cs="Times New Roman" w:eastAsia="Times New Roman" w:hAnsi="Times New Roman"/>
+                <w:b w:val="false"/>
+                <w:bCs w:val="false"/>
+                <w:color w:val="58595B"/>
+                <w:sz w:val="19"/>
+                <w:szCs w:val="19"/>
+              </w:rPr>
+              <w:t xml:space="preserve">The system shall seed every Organization, on creation, with the same seven generic AI Use Cases — one per NCP process step (S1-S7) — rather than sector-specific entries, so the catalog documents the platform's own built-in AI Agents identically across every sector.</w:t>
             </w:r>
           </w:p>
         </w:tc>

</xml_diff>

<commit_message>
Add AI Use Case Library & Governance (tiers, activation, usage log, LLM connection)
Re-architects the AI Use Cases feature into a full governance module: a
two-tier Assistive/Augmented model (Autonomous explicitly out of scope),
a 14-use-case seeded catalog with trigger/output/human-checkpoint fields,
Organization-level activation plus per-Project tri-state override with
cascade-delete cleanup, an append-only AI Usage Log, and a browser-local
(never server-persisted) Real LLM Provider Connection that the S1-S7
agents can optionally draw on with automatic deterministic fallback and
RAG-grounding disclosure. Replaces the earlier server-persisted LLM
Configuration table/route/page/permissions entirely. Updates the SRS to
v1.5 to document the new module and removes the superseded LLM
Configuration section.

Co-Authored-By: Claude Sonnet 5 <noreply@anthropic.com>
Claude-Session: https://claude.ai/code/session_01JawUecr4zdt3wAKeYty8P7
</commit_message>
<xml_diff>
--- a/ncp-solver/docs/NCP_Solver_SRS.docx
+++ b/ncp-solver/docs/NCP_Solver_SRS.docx
@@ -101,7 +101,7 @@
           <w:sz w:val="22"/>
           <w:szCs w:val="22"/>
         </w:rPr>
-        <w:t xml:space="preserve">Version 1.4</w:t>
+        <w:t xml:space="preserve">Version 1.5</w:t>
       </w:r>
     </w:p>
     <w:p>
@@ -1356,7 +1356,7 @@
                 <w:sz w:val="19"/>
                 <w:szCs w:val="19"/>
               </w:rPr>
-              <w:t xml:space="preserve">Large Language Model - the class of AI model that the LLM / AI Provider Configuration module (section 3.23) prepares the system to integrate with; no live LLM call is made by this version.</w:t>
+              <w:t xml:space="preserve">Large Language Model - the class of AI model an AI Use Case may optionally call via a user's own Real LLM Provider Connection (section 3.11), stored only in that user's browser and forwarded once per generation request; every AI Use Case still computes its deterministic result and falls back to it automatically if the live call fails.</w:t>
             </w:r>
           </w:p>
         </w:tc>
@@ -1422,7 +1422,7 @@
                 <w:sz w:val="19"/>
                 <w:szCs w:val="19"/>
               </w:rPr>
-              <w:t xml:space="preserve">The chat-style Q&amp;A feature (section 3.24) offering RBAC-scoped data queries and application-help queries, distinct from both the per-stage AI Agents and the AI Use Cases Library.</w:t>
+              <w:t xml:space="preserve">The chat-style Q&amp;A feature (section 3.23) offering RBAC-scoped data queries and application-help queries, distinct from both the per-stage AI Agents and the AI Use Case Library.</w:t>
             </w:r>
           </w:p>
         </w:tc>
@@ -1456,6 +1456,72 @@
                 <w:sz w:val="19"/>
                 <w:szCs w:val="19"/>
               </w:rPr>
+              <w:t xml:space="preserve">Assistive / Augmented</w:t>
+            </w:r>
+          </w:p>
+        </w:tc>
+        <w:tc>
+          <w:tcPr>
+            <w:tcW w:type="dxa" w:w="7346"/>
+            <w:tcBorders>
+              <w:top w:val="single" w:color="E3E3E4" w:sz="2"/>
+              <w:left w:val="single" w:color="E3E3E4" w:sz="2"/>
+              <w:bottom w:val="single" w:color="E3E3E4" w:sz="2"/>
+              <w:right w:val="single" w:color="E3E3E4" w:sz="2"/>
+            </w:tcBorders>
+            <w:shd w:fill="FFFFFF" w:val="clear"/>
+            <w:tcMar>
+              <w:top w:type="dxa" w:w="80"/>
+              <w:left w:type="dxa" w:w="100"/>
+              <w:bottom w:type="dxa" w:w="80"/>
+              <w:right w:type="dxa" w:w="100"/>
+            </w:tcMar>
+            <w:vAlign w:val="center"/>
+          </w:tcPr>
+          <w:p>
+            <w:r>
+              <w:rPr>
+                <w:rFonts w:ascii="Times New Roman" w:cs="Times New Roman" w:eastAsia="Times New Roman" w:hAnsi="Times New Roman"/>
+                <w:b w:val="false"/>
+                <w:bCs w:val="false"/>
+                <w:color w:val="58595B"/>
+                <w:sz w:val="19"/>
+                <w:szCs w:val="19"/>
+              </w:rPr>
+              <w:t xml:space="preserve">The two AI Use Case tiers (section 3.11): Assistive means the AI only observes/analyzes/suggests while a human performs the task and decision; Augmented means the AI performs a substantial part of the task but a human must review, edit, and approve before it is finalized. A third tier, Autonomous, is explicitly out of scope.</w:t>
+            </w:r>
+          </w:p>
+        </w:tc>
+      </w:tr>
+      <w:tr>
+        <w:tc>
+          <w:tcPr>
+            <w:tcW w:type="dxa" w:w="2400"/>
+            <w:tcBorders>
+              <w:top w:val="single" w:color="E3E3E4" w:sz="2"/>
+              <w:left w:val="single" w:color="E3E3E4" w:sz="2"/>
+              <w:bottom w:val="single" w:color="E3E3E4" w:sz="2"/>
+              <w:right w:val="single" w:color="E3E3E4" w:sz="2"/>
+            </w:tcBorders>
+            <w:shd w:fill="F2F2F3" w:val="clear"/>
+            <w:tcMar>
+              <w:top w:type="dxa" w:w="80"/>
+              <w:left w:type="dxa" w:w="100"/>
+              <w:bottom w:type="dxa" w:w="80"/>
+              <w:right w:type="dxa" w:w="100"/>
+            </w:tcMar>
+            <w:vAlign w:val="center"/>
+          </w:tcPr>
+          <w:p>
+            <w:r>
+              <w:rPr>
+                <w:rFonts w:ascii="Times New Roman" w:cs="Times New Roman" w:eastAsia="Times New Roman" w:hAnsi="Times New Roman"/>
+                <w:b w:val="false"/>
+                <w:bCs w:val="false"/>
+                <w:color w:val="58595B"/>
+                <w:sz w:val="19"/>
+                <w:szCs w:val="19"/>
+              </w:rPr>
               <w:t xml:space="preserve">Multi-Tenant</w:t>
             </w:r>
           </w:p>
@@ -1469,7 +1535,7 @@
               <w:bottom w:val="single" w:color="E3E3E4" w:sz="2"/>
               <w:right w:val="single" w:color="E3E3E4" w:sz="2"/>
             </w:tcBorders>
-            <w:shd w:fill="FFFFFF" w:val="clear"/>
+            <w:shd w:fill="F2F2F3" w:val="clear"/>
             <w:tcMar>
               <w:top w:type="dxa" w:w="80"/>
               <w:left w:type="dxa" w:w="100"/>
@@ -1503,7 +1569,7 @@
               <w:bottom w:val="single" w:color="E3E3E4" w:sz="2"/>
               <w:right w:val="single" w:color="E3E3E4" w:sz="2"/>
             </w:tcBorders>
-            <w:shd w:fill="F2F2F3" w:val="clear"/>
+            <w:shd w:fill="FFFFFF" w:val="clear"/>
             <w:tcMar>
               <w:top w:type="dxa" w:w="80"/>
               <w:left w:type="dxa" w:w="100"/>
@@ -1535,7 +1601,7 @@
               <w:bottom w:val="single" w:color="E3E3E4" w:sz="2"/>
               <w:right w:val="single" w:color="E3E3E4" w:sz="2"/>
             </w:tcBorders>
-            <w:shd w:fill="F2F2F3" w:val="clear"/>
+            <w:shd w:fill="FFFFFF" w:val="clear"/>
             <w:tcMar>
               <w:top w:type="dxa" w:w="80"/>
               <w:left w:type="dxa" w:w="100"/>
@@ -2325,7 +2391,7 @@
                 <w:sz w:val="19"/>
                 <w:szCs w:val="19"/>
               </w:rPr>
-              <w:t xml:space="preserve">Full CRUD on all records; user &amp; RBAC management; tenant configuration; license, governance, and LLM configuration settings.</w:t>
+              <w:t xml:space="preserve">Full CRUD on all records; user &amp; RBAC management; tenant configuration; license, governance, and full AI Use Case Library governance (catalog CRUD, Organization activation, Project overrides, usage log).</w:t>
             </w:r>
           </w:p>
         </w:tc>
@@ -2423,7 +2489,7 @@
                 <w:sz w:val="19"/>
                 <w:szCs w:val="19"/>
               </w:rPr>
-              <w:t xml:space="preserve">Validates and closes Sheets; configures KPI thresholds; owns Controls and Business Rules; full CRUD on the RACSI matrix; compliance reporting; views and manages the LLM configuration.</w:t>
+              <w:t xml:space="preserve">Validates and closes Sheets; configures KPI thresholds; owns Controls and Business Rules; full CRUD on the RACSI matrix; compliance reporting; full AI Use Case Library governance (catalog CRUD, Organization activation, Project overrides, usage log).</w:t>
             </w:r>
           </w:p>
         </w:tc>
@@ -2521,7 +2587,7 @@
                 <w:sz w:val="19"/>
                 <w:szCs w:val="19"/>
               </w:rPr>
-              <w:t xml:space="preserve">Creates/edits/validates Sheets; approves action plans; manages REX; owns Business Rules and Risks/Opportunities in scope; creates/edits RACSI activities and assignments; views BPMN diagrams and the LLM configuration.</w:t>
+              <w:t xml:space="preserve">Creates/edits/validates Sheets; approves action plans; manages REX; owns Business Rules and Risks/Opportunities in scope; creates/edits RACSI activities and assignments; views BPMN diagrams; catalogs and edits AI Use Cases, sets Project-level AI overrides, and views the AI Usage Log.</w:t>
             </w:r>
           </w:p>
         </w:tc>
@@ -3109,7 +3175,7 @@
                 <w:sz w:val="19"/>
                 <w:szCs w:val="19"/>
               </w:rPr>
-              <w:t xml:space="preserve">Read-only access to Sheets, reports, Business Rules, Controls, Risks/Opportunities, the RACSI matrix, BPMN diagrams, the LLM configuration, and the full audit trail.</w:t>
+              <w:t xml:space="preserve">Read-only access to Sheets, reports, Business Rules, Controls, Risks/Opportunities, the RACSI matrix, BPMN diagrams, the AI Use Case Library and its AI Usage Log, and the full audit trail.</w:t>
             </w:r>
           </w:p>
         </w:tc>
@@ -9762,7 +9828,7 @@
           <w:sz w:val="19"/>
           <w:szCs w:val="19"/>
         </w:rPr>
-        <w:t xml:space="preserve">Rule-based, explainable assistants providing suggestions, never autonomous decisions: one for every NCP process step (KB-010) plus an always-on Monitoring &amp; Alert Agent. A separate pair of AI Assistant agents (RBAC-scoped data query and application help query) is specified in section 3.24.</w:t>
+        <w:t xml:space="preserve">Rule-based, explainable assistants providing suggestions, never autonomous decisions: one for every NCP process step (KB-010) plus an always-on Monitoring &amp; Alert Agent. Every one of these agents is itself a governed entry in the AI Use Case Library (section 3.11), which controls its activation, discloses its RAG grounding, and logs every outcome. A separate pair of AI Assistant agents (RBAC-scoped data query and application help query) is specified in section 3.23.</w:t>
       </w:r>
     </w:p>
     <w:tbl>
@@ -10200,7 +10266,7 @@
           <w:sz w:val="27"/>
           <w:szCs w:val="27"/>
         </w:rPr>
-        <w:t xml:space="preserve">3.11 AI Use Cases Library (with Version Management)</w:t>
+        <w:t xml:space="preserve">3.11 AI Use Case Library &amp; Governance</w:t>
       </w:r>
     </w:p>
     <w:p>
@@ -10216,7 +10282,7 @@
           <w:sz w:val="19"/>
           <w:szCs w:val="19"/>
         </w:rPr>
-        <w:t xml:space="preserve">An independent catalog of AI use cases, unrelated to the Capitalization Library, with full version history. The catalog is seeded generically rather than per sector: every Organization, regardless of industry, receives the same seven use cases, one per NCP process step, each documenting the corresponding built-in AI Agent from section 3.10 (Classification, Problem Structuring, Containment Advisor, Root Cause Mining, Action Recommendation, Evaluation Assistant, REX Generation) at maturity stage 5/Production, since these are shipped and running capabilities, not roadmap ideas.</w:t>
+        <w:t xml:space="preserve">The governed catalog and control plane for every AI capability in NCP Solver, independent of the Capitalization Library. Every use case sits in exactly one of two tiers — Assistive (the AI observes, analyzes, or suggests; a human performs the task and makes the decision) or Augmented (the AI performs a substantial part of the task — drafting, classifying, or summarizing at scale — but a human must review, edit, and approve the result before it is finalized or distributed). A third tier, Autonomous AI, in which the system would take an irreversible action without a human decision in the loop, is deliberately out of scope for this release and would require a separate, explicitly-gated tier in a future one. Each Organization is seeded with fourteen versioned AI Use Cases: the seven built-in process agents (S1-S7, section 3.10), the two AI Assistant modes (section 3.23), and five forward-looking, catalog-only entries (BPMN diagram documentation, risk narrative drafting, control test summarization, business rule drafting, and RACSI assignment recommendation) recorded at an early maturity stage with no live invocation, so the catalog honestly reflects what is shipped versus planned. The Library also hosts the optional Real LLM Provider Connection that every live AI Use Case can draw on (FR-AIUC-17 to FR-AIUC-19).</w:t>
       </w:r>
     </w:p>
     <w:tbl>
@@ -10365,7 +10431,7 @@
                 <w:sz w:val="19"/>
                 <w:szCs w:val="19"/>
               </w:rPr>
-              <w:t xml:space="preserve">The system shall support full CRUD on AI Use Cases, capturing title, description, sector, business function, AI technique, maturity stage (1-5), status (Idea/Pilot/Production/Retired), owner, expected impact, estimated ROI, and tags.</w:t>
+              <w:t xml:space="preserve">The system shall support full CRUD on AI Use Cases, capturing an id, name, tier (Assistive/Augmented), owning module, description, trigger condition, expected output, business function, AI technique, maturity stage (1-5), status (Idea/Pilot/Production/Retired), expected impact, estimated ROI, and tags.</w:t>
             </w:r>
           </w:p>
         </w:tc>
@@ -10431,7 +10497,7 @@
                 <w:sz w:val="19"/>
                 <w:szCs w:val="19"/>
               </w:rPr>
-              <w:t xml:space="preserve">The system shall version an AI Use Case's content independently of its metadata; content shall consist of five labeled sections: Inputs, Prompt, Expected Output, Constraints/Guardrails, and Model/Technique Notes.</w:t>
+              <w:t xml:space="preserve">The system shall capture, per AI Use Case, a trigger description (what causes it to run), an output description (what it produces), and a human checkpoint description (the point at which a person must review, edit, or approve its output before it has any effect) — distinct fields from the versioned prompt-template content of FR-AIUC-03.</w:t>
             </w:r>
           </w:p>
         </w:tc>
@@ -10497,6 +10563,72 @@
                 <w:sz w:val="19"/>
                 <w:szCs w:val="19"/>
               </w:rPr>
+              <w:t xml:space="preserve">The system shall version an AI Use Case's editable prompt-template content independently of its metadata; content shall consist of five labeled sections: Inputs, Prompt, Expected Output, Constraints/Guardrails, and Model/Technique Notes.</w:t>
+            </w:r>
+          </w:p>
+        </w:tc>
+      </w:tr>
+      <w:tr>
+        <w:tc>
+          <w:tcPr>
+            <w:tcW w:type="dxa" w:w="1500"/>
+            <w:tcBorders>
+              <w:top w:val="single" w:color="E3E3E4" w:sz="2"/>
+              <w:left w:val="single" w:color="E3E3E4" w:sz="2"/>
+              <w:bottom w:val="single" w:color="E3E3E4" w:sz="2"/>
+              <w:right w:val="single" w:color="E3E3E4" w:sz="2"/>
+            </w:tcBorders>
+            <w:shd w:fill="F2F2F3" w:val="clear"/>
+            <w:tcMar>
+              <w:top w:type="dxa" w:w="80"/>
+              <w:left w:type="dxa" w:w="100"/>
+              <w:bottom w:type="dxa" w:w="80"/>
+              <w:right w:type="dxa" w:w="100"/>
+            </w:tcMar>
+            <w:vAlign w:val="center"/>
+          </w:tcPr>
+          <w:p>
+            <w:r>
+              <w:rPr>
+                <w:rFonts w:ascii="Times New Roman" w:cs="Times New Roman" w:eastAsia="Times New Roman" w:hAnsi="Times New Roman"/>
+                <w:b w:val="false"/>
+                <w:bCs w:val="false"/>
+                <w:color w:val="58595B"/>
+                <w:sz w:val="19"/>
+                <w:szCs w:val="19"/>
+              </w:rPr>
+              <w:t xml:space="preserve">FR-AIUC-04</w:t>
+            </w:r>
+          </w:p>
+        </w:tc>
+        <w:tc>
+          <w:tcPr>
+            <w:tcW w:type="dxa" w:w="8246"/>
+            <w:tcBorders>
+              <w:top w:val="single" w:color="E3E3E4" w:sz="2"/>
+              <w:left w:val="single" w:color="E3E3E4" w:sz="2"/>
+              <w:bottom w:val="single" w:color="E3E3E4" w:sz="2"/>
+              <w:right w:val="single" w:color="E3E3E4" w:sz="2"/>
+            </w:tcBorders>
+            <w:shd w:fill="F2F2F3" w:val="clear"/>
+            <w:tcMar>
+              <w:top w:type="dxa" w:w="80"/>
+              <w:left w:type="dxa" w:w="100"/>
+              <w:bottom w:type="dxa" w:w="80"/>
+              <w:right w:type="dxa" w:w="100"/>
+            </w:tcMar>
+            <w:vAlign w:val="center"/>
+          </w:tcPr>
+          <w:p>
+            <w:r>
+              <w:rPr>
+                <w:rFonts w:ascii="Times New Roman" w:cs="Times New Roman" w:eastAsia="Times New Roman" w:hAnsi="Times New Roman"/>
+                <w:b w:val="false"/>
+                <w:bCs w:val="false"/>
+                <w:color w:val="58595B"/>
+                <w:sz w:val="19"/>
+                <w:szCs w:val="19"/>
+              </w:rPr>
               <w:t xml:space="preserve">The system shall create Version 1 of an AI Use Case automatically upon creation and mark it as the Default and Current version.</w:t>
             </w:r>
           </w:p>
@@ -10512,26 +10644,26 @@
               <w:bottom w:val="single" w:color="E3E3E4" w:sz="2"/>
               <w:right w:val="single" w:color="E3E3E4" w:sz="2"/>
             </w:tcBorders>
-            <w:shd w:fill="F2F2F3" w:val="clear"/>
-            <w:tcMar>
-              <w:top w:type="dxa" w:w="80"/>
-              <w:left w:type="dxa" w:w="100"/>
-              <w:bottom w:type="dxa" w:w="80"/>
-              <w:right w:type="dxa" w:w="100"/>
-            </w:tcMar>
-            <w:vAlign w:val="center"/>
-          </w:tcPr>
-          <w:p>
-            <w:r>
-              <w:rPr>
-                <w:rFonts w:ascii="Times New Roman" w:cs="Times New Roman" w:eastAsia="Times New Roman" w:hAnsi="Times New Roman"/>
-                <w:b w:val="false"/>
-                <w:bCs w:val="false"/>
-                <w:color w:val="58595B"/>
-                <w:sz w:val="19"/>
-                <w:szCs w:val="19"/>
-              </w:rPr>
-              <w:t xml:space="preserve">FR-AIUC-04</w:t>
+            <w:shd w:fill="FFFFFF" w:val="clear"/>
+            <w:tcMar>
+              <w:top w:type="dxa" w:w="80"/>
+              <w:left w:type="dxa" w:w="100"/>
+              <w:bottom w:type="dxa" w:w="80"/>
+              <w:right w:type="dxa" w:w="100"/>
+            </w:tcMar>
+            <w:vAlign w:val="center"/>
+          </w:tcPr>
+          <w:p>
+            <w:r>
+              <w:rPr>
+                <w:rFonts w:ascii="Times New Roman" w:cs="Times New Roman" w:eastAsia="Times New Roman" w:hAnsi="Times New Roman"/>
+                <w:b w:val="false"/>
+                <w:bCs w:val="false"/>
+                <w:color w:val="58595B"/>
+                <w:sz w:val="19"/>
+                <w:szCs w:val="19"/>
+              </w:rPr>
+              <w:t xml:space="preserve">FR-AIUC-05</w:t>
             </w:r>
           </w:p>
         </w:tc>
@@ -10544,7 +10676,7 @@
               <w:bottom w:val="single" w:color="E3E3E4" w:sz="2"/>
               <w:right w:val="single" w:color="E3E3E4" w:sz="2"/>
             </w:tcBorders>
-            <w:shd w:fill="F2F2F3" w:val="clear"/>
+            <w:shd w:fill="FFFFFF" w:val="clear"/>
             <w:tcMar>
               <w:top w:type="dxa" w:w="80"/>
               <w:left w:type="dxa" w:w="100"/>
@@ -10578,26 +10710,26 @@
               <w:bottom w:val="single" w:color="E3E3E4" w:sz="2"/>
               <w:right w:val="single" w:color="E3E3E4" w:sz="2"/>
             </w:tcBorders>
-            <w:shd w:fill="FFFFFF" w:val="clear"/>
-            <w:tcMar>
-              <w:top w:type="dxa" w:w="80"/>
-              <w:left w:type="dxa" w:w="100"/>
-              <w:bottom w:type="dxa" w:w="80"/>
-              <w:right w:type="dxa" w:w="100"/>
-            </w:tcMar>
-            <w:vAlign w:val="center"/>
-          </w:tcPr>
-          <w:p>
-            <w:r>
-              <w:rPr>
-                <w:rFonts w:ascii="Times New Roman" w:cs="Times New Roman" w:eastAsia="Times New Roman" w:hAnsi="Times New Roman"/>
-                <w:b w:val="false"/>
-                <w:bCs w:val="false"/>
-                <w:color w:val="58595B"/>
-                <w:sz w:val="19"/>
-                <w:szCs w:val="19"/>
-              </w:rPr>
-              <w:t xml:space="preserve">FR-AIUC-05</w:t>
+            <w:shd w:fill="F2F2F3" w:val="clear"/>
+            <w:tcMar>
+              <w:top w:type="dxa" w:w="80"/>
+              <w:left w:type="dxa" w:w="100"/>
+              <w:bottom w:type="dxa" w:w="80"/>
+              <w:right w:type="dxa" w:w="100"/>
+            </w:tcMar>
+            <w:vAlign w:val="center"/>
+          </w:tcPr>
+          <w:p>
+            <w:r>
+              <w:rPr>
+                <w:rFonts w:ascii="Times New Roman" w:cs="Times New Roman" w:eastAsia="Times New Roman" w:hAnsi="Times New Roman"/>
+                <w:b w:val="false"/>
+                <w:bCs w:val="false"/>
+                <w:color w:val="58595B"/>
+                <w:sz w:val="19"/>
+                <w:szCs w:val="19"/>
+              </w:rPr>
+              <w:t xml:space="preserve">FR-AIUC-06</w:t>
             </w:r>
           </w:p>
         </w:tc>
@@ -10610,26 +10742,26 @@
               <w:bottom w:val="single" w:color="E3E3E4" w:sz="2"/>
               <w:right w:val="single" w:color="E3E3E4" w:sz="2"/>
             </w:tcBorders>
-            <w:shd w:fill="FFFFFF" w:val="clear"/>
-            <w:tcMar>
-              <w:top w:type="dxa" w:w="80"/>
-              <w:left w:type="dxa" w:w="100"/>
-              <w:bottom w:type="dxa" w:w="80"/>
-              <w:right w:type="dxa" w:w="100"/>
-            </w:tcMar>
-            <w:vAlign w:val="center"/>
-          </w:tcPr>
-          <w:p>
-            <w:r>
-              <w:rPr>
-                <w:rFonts w:ascii="Times New Roman" w:cs="Times New Roman" w:eastAsia="Times New Roman" w:hAnsi="Times New Roman"/>
-                <w:b w:val="false"/>
-                <w:bCs w:val="false"/>
-                <w:color w:val="58595B"/>
-                <w:sz w:val="19"/>
-                <w:szCs w:val="19"/>
-              </w:rPr>
-              <w:t xml:space="preserve">The system shall display the full Version History for an AI Use Case, showing version number, author, timestamp, change note, and Default/Current status badges.</w:t>
+            <w:shd w:fill="F2F2F3" w:val="clear"/>
+            <w:tcMar>
+              <w:top w:type="dxa" w:w="80"/>
+              <w:left w:type="dxa" w:w="100"/>
+              <w:bottom w:type="dxa" w:w="80"/>
+              <w:right w:type="dxa" w:w="100"/>
+            </w:tcMar>
+            <w:vAlign w:val="center"/>
+          </w:tcPr>
+          <w:p>
+            <w:r>
+              <w:rPr>
+                <w:rFonts w:ascii="Times New Roman" w:cs="Times New Roman" w:eastAsia="Times New Roman" w:hAnsi="Times New Roman"/>
+                <w:b w:val="false"/>
+                <w:bCs w:val="false"/>
+                <w:color w:val="58595B"/>
+                <w:sz w:val="19"/>
+                <w:szCs w:val="19"/>
+              </w:rPr>
+              <w:t xml:space="preserve">The system shall display the full Version History for an AI Use Case, showing version number, author, timestamp, change note, and Default/Current status badges, and shall allow viewing the full labeled content of any historical version.</w:t>
             </w:r>
           </w:p>
         </w:tc>
@@ -10644,26 +10776,26 @@
               <w:bottom w:val="single" w:color="E3E3E4" w:sz="2"/>
               <w:right w:val="single" w:color="E3E3E4" w:sz="2"/>
             </w:tcBorders>
-            <w:shd w:fill="F2F2F3" w:val="clear"/>
-            <w:tcMar>
-              <w:top w:type="dxa" w:w="80"/>
-              <w:left w:type="dxa" w:w="100"/>
-              <w:bottom w:type="dxa" w:w="80"/>
-              <w:right w:type="dxa" w:w="100"/>
-            </w:tcMar>
-            <w:vAlign w:val="center"/>
-          </w:tcPr>
-          <w:p>
-            <w:r>
-              <w:rPr>
-                <w:rFonts w:ascii="Times New Roman" w:cs="Times New Roman" w:eastAsia="Times New Roman" w:hAnsi="Times New Roman"/>
-                <w:b w:val="false"/>
-                <w:bCs w:val="false"/>
-                <w:color w:val="58595B"/>
-                <w:sz w:val="19"/>
-                <w:szCs w:val="19"/>
-              </w:rPr>
-              <w:t xml:space="preserve">FR-AIUC-06</w:t>
+            <w:shd w:fill="FFFFFF" w:val="clear"/>
+            <w:tcMar>
+              <w:top w:type="dxa" w:w="80"/>
+              <w:left w:type="dxa" w:w="100"/>
+              <w:bottom w:type="dxa" w:w="80"/>
+              <w:right w:type="dxa" w:w="100"/>
+            </w:tcMar>
+            <w:vAlign w:val="center"/>
+          </w:tcPr>
+          <w:p>
+            <w:r>
+              <w:rPr>
+                <w:rFonts w:ascii="Times New Roman" w:cs="Times New Roman" w:eastAsia="Times New Roman" w:hAnsi="Times New Roman"/>
+                <w:b w:val="false"/>
+                <w:bCs w:val="false"/>
+                <w:color w:val="58595B"/>
+                <w:sz w:val="19"/>
+                <w:szCs w:val="19"/>
+              </w:rPr>
+              <w:t xml:space="preserve">FR-AIUC-07</w:t>
             </w:r>
           </w:p>
         </w:tc>
@@ -10676,26 +10808,26 @@
               <w:bottom w:val="single" w:color="E3E3E4" w:sz="2"/>
               <w:right w:val="single" w:color="E3E3E4" w:sz="2"/>
             </w:tcBorders>
-            <w:shd w:fill="F2F2F3" w:val="clear"/>
-            <w:tcMar>
-              <w:top w:type="dxa" w:w="80"/>
-              <w:left w:type="dxa" w:w="100"/>
-              <w:bottom w:type="dxa" w:w="80"/>
-              <w:right w:type="dxa" w:w="100"/>
-            </w:tcMar>
-            <w:vAlign w:val="center"/>
-          </w:tcPr>
-          <w:p>
-            <w:r>
-              <w:rPr>
-                <w:rFonts w:ascii="Times New Roman" w:cs="Times New Roman" w:eastAsia="Times New Roman" w:hAnsi="Times New Roman"/>
-                <w:b w:val="false"/>
-                <w:bCs w:val="false"/>
-                <w:color w:val="58595B"/>
-                <w:sz w:val="19"/>
-                <w:szCs w:val="19"/>
-              </w:rPr>
-              <w:t xml:space="preserve">The system shall allow an authorized user to view the full labeled content of any historical version.</w:t>
+            <w:shd w:fill="FFFFFF" w:val="clear"/>
+            <w:tcMar>
+              <w:top w:type="dxa" w:w="80"/>
+              <w:left w:type="dxa" w:w="100"/>
+              <w:bottom w:type="dxa" w:w="80"/>
+              <w:right w:type="dxa" w:w="100"/>
+            </w:tcMar>
+            <w:vAlign w:val="center"/>
+          </w:tcPr>
+          <w:p>
+            <w:r>
+              <w:rPr>
+                <w:rFonts w:ascii="Times New Roman" w:cs="Times New Roman" w:eastAsia="Times New Roman" w:hAnsi="Times New Roman"/>
+                <w:b w:val="false"/>
+                <w:bCs w:val="false"/>
+                <w:color w:val="58595B"/>
+                <w:sz w:val="19"/>
+                <w:szCs w:val="19"/>
+              </w:rPr>
+              <w:t xml:space="preserve">The system shall allow an authorized user to revert to any historical version; reverting shall duplicate that version's content into a brand-new version marked Current, never rewrite or delete history.</w:t>
             </w:r>
           </w:p>
         </w:tc>
@@ -10710,26 +10842,26 @@
               <w:bottom w:val="single" w:color="E3E3E4" w:sz="2"/>
               <w:right w:val="single" w:color="E3E3E4" w:sz="2"/>
             </w:tcBorders>
-            <w:shd w:fill="FFFFFF" w:val="clear"/>
-            <w:tcMar>
-              <w:top w:type="dxa" w:w="80"/>
-              <w:left w:type="dxa" w:w="100"/>
-              <w:bottom w:type="dxa" w:w="80"/>
-              <w:right w:type="dxa" w:w="100"/>
-            </w:tcMar>
-            <w:vAlign w:val="center"/>
-          </w:tcPr>
-          <w:p>
-            <w:r>
-              <w:rPr>
-                <w:rFonts w:ascii="Times New Roman" w:cs="Times New Roman" w:eastAsia="Times New Roman" w:hAnsi="Times New Roman"/>
-                <w:b w:val="false"/>
-                <w:bCs w:val="false"/>
-                <w:color w:val="58595B"/>
-                <w:sz w:val="19"/>
-                <w:szCs w:val="19"/>
-              </w:rPr>
-              <w:t xml:space="preserve">FR-AIUC-07</w:t>
+            <w:shd w:fill="F2F2F3" w:val="clear"/>
+            <w:tcMar>
+              <w:top w:type="dxa" w:w="80"/>
+              <w:left w:type="dxa" w:w="100"/>
+              <w:bottom w:type="dxa" w:w="80"/>
+              <w:right w:type="dxa" w:w="100"/>
+            </w:tcMar>
+            <w:vAlign w:val="center"/>
+          </w:tcPr>
+          <w:p>
+            <w:r>
+              <w:rPr>
+                <w:rFonts w:ascii="Times New Roman" w:cs="Times New Roman" w:eastAsia="Times New Roman" w:hAnsi="Times New Roman"/>
+                <w:b w:val="false"/>
+                <w:bCs w:val="false"/>
+                <w:color w:val="58595B"/>
+                <w:sz w:val="19"/>
+                <w:szCs w:val="19"/>
+              </w:rPr>
+              <w:t xml:space="preserve">FR-AIUC-08</w:t>
             </w:r>
           </w:p>
         </w:tc>
@@ -10742,26 +10874,26 @@
               <w:bottom w:val="single" w:color="E3E3E4" w:sz="2"/>
               <w:right w:val="single" w:color="E3E3E4" w:sz="2"/>
             </w:tcBorders>
-            <w:shd w:fill="FFFFFF" w:val="clear"/>
-            <w:tcMar>
-              <w:top w:type="dxa" w:w="80"/>
-              <w:left w:type="dxa" w:w="100"/>
-              <w:bottom w:type="dxa" w:w="80"/>
-              <w:right w:type="dxa" w:w="100"/>
-            </w:tcMar>
-            <w:vAlign w:val="center"/>
-          </w:tcPr>
-          <w:p>
-            <w:r>
-              <w:rPr>
-                <w:rFonts w:ascii="Times New Roman" w:cs="Times New Roman" w:eastAsia="Times New Roman" w:hAnsi="Times New Roman"/>
-                <w:b w:val="false"/>
-                <w:bCs w:val="false"/>
-                <w:color w:val="58595B"/>
-                <w:sz w:val="19"/>
-                <w:szCs w:val="19"/>
-              </w:rPr>
-              <w:t xml:space="preserve">The system shall allow an authorized user to revert to any historical version; reverting shall duplicate that version's content into a brand-new version marked Current, never rewrite or delete history.</w:t>
+            <w:shd w:fill="F2F2F3" w:val="clear"/>
+            <w:tcMar>
+              <w:top w:type="dxa" w:w="80"/>
+              <w:left w:type="dxa" w:w="100"/>
+              <w:bottom w:type="dxa" w:w="80"/>
+              <w:right w:type="dxa" w:w="100"/>
+            </w:tcMar>
+            <w:vAlign w:val="center"/>
+          </w:tcPr>
+          <w:p>
+            <w:r>
+              <w:rPr>
+                <w:rFonts w:ascii="Times New Roman" w:cs="Times New Roman" w:eastAsia="Times New Roman" w:hAnsi="Times New Roman"/>
+                <w:b w:val="false"/>
+                <w:bCs w:val="false"/>
+                <w:color w:val="58595B"/>
+                <w:sz w:val="19"/>
+                <w:szCs w:val="19"/>
+              </w:rPr>
+              <w:t xml:space="preserve">The system shall gate full CRUD on AI Use Cases and their version history — create, metadata edit, delete, and version revert — behind a single canManageAiUseCases capability (aiUseCase.create / aiUseCase.edit / aiUseCase.delete), distinct from the activation capabilities of FR-AIUC-11 and FR-AIUC-12.</w:t>
             </w:r>
           </w:p>
         </w:tc>
@@ -10776,26 +10908,26 @@
               <w:bottom w:val="single" w:color="E3E3E4" w:sz="2"/>
               <w:right w:val="single" w:color="E3E3E4" w:sz="2"/>
             </w:tcBorders>
-            <w:shd w:fill="F2F2F3" w:val="clear"/>
-            <w:tcMar>
-              <w:top w:type="dxa" w:w="80"/>
-              <w:left w:type="dxa" w:w="100"/>
-              <w:bottom w:type="dxa" w:w="80"/>
-              <w:right w:type="dxa" w:w="100"/>
-            </w:tcMar>
-            <w:vAlign w:val="center"/>
-          </w:tcPr>
-          <w:p>
-            <w:r>
-              <w:rPr>
-                <w:rFonts w:ascii="Times New Roman" w:cs="Times New Roman" w:eastAsia="Times New Roman" w:hAnsi="Times New Roman"/>
-                <w:b w:val="false"/>
-                <w:bCs w:val="false"/>
-                <w:color w:val="58595B"/>
-                <w:sz w:val="19"/>
-                <w:szCs w:val="19"/>
-              </w:rPr>
-              <w:t xml:space="preserve">FR-AIUC-08</w:t>
+            <w:shd w:fill="FFFFFF" w:val="clear"/>
+            <w:tcMar>
+              <w:top w:type="dxa" w:w="80"/>
+              <w:left w:type="dxa" w:w="100"/>
+              <w:bottom w:type="dxa" w:w="80"/>
+              <w:right w:type="dxa" w:w="100"/>
+            </w:tcMar>
+            <w:vAlign w:val="center"/>
+          </w:tcPr>
+          <w:p>
+            <w:r>
+              <w:rPr>
+                <w:rFonts w:ascii="Times New Roman" w:cs="Times New Roman" w:eastAsia="Times New Roman" w:hAnsi="Times New Roman"/>
+                <w:b w:val="false"/>
+                <w:bCs w:val="false"/>
+                <w:color w:val="58595B"/>
+                <w:sz w:val="19"/>
+                <w:szCs w:val="19"/>
+              </w:rPr>
+              <w:t xml:space="preserve">FR-AIUC-09</w:t>
             </w:r>
           </w:p>
         </w:tc>
@@ -10808,26 +10940,26 @@
               <w:bottom w:val="single" w:color="E3E3E4" w:sz="2"/>
               <w:right w:val="single" w:color="E3E3E4" w:sz="2"/>
             </w:tcBorders>
-            <w:shd w:fill="F2F2F3" w:val="clear"/>
-            <w:tcMar>
-              <w:top w:type="dxa" w:w="80"/>
-              <w:left w:type="dxa" w:w="100"/>
-              <w:bottom w:type="dxa" w:w="80"/>
-              <w:right w:type="dxa" w:w="100"/>
-            </w:tcMar>
-            <w:vAlign w:val="center"/>
-          </w:tcPr>
-          <w:p>
-            <w:r>
-              <w:rPr>
-                <w:rFonts w:ascii="Times New Roman" w:cs="Times New Roman" w:eastAsia="Times New Roman" w:hAnsi="Times New Roman"/>
-                <w:b w:val="false"/>
-                <w:bCs w:val="false"/>
-                <w:color w:val="58595B"/>
-                <w:sz w:val="19"/>
-                <w:szCs w:val="19"/>
-              </w:rPr>
-              <w:t xml:space="preserve">The system shall record who created each version and an optional free-text change note.</w:t>
+            <w:shd w:fill="FFFFFF" w:val="clear"/>
+            <w:tcMar>
+              <w:top w:type="dxa" w:w="80"/>
+              <w:left w:type="dxa" w:w="100"/>
+              <w:bottom w:type="dxa" w:w="80"/>
+              <w:right w:type="dxa" w:w="100"/>
+            </w:tcMar>
+            <w:vAlign w:val="center"/>
+          </w:tcPr>
+          <w:p>
+            <w:r>
+              <w:rPr>
+                <w:rFonts w:ascii="Times New Roman" w:cs="Times New Roman" w:eastAsia="Times New Roman" w:hAnsi="Times New Roman"/>
+                <w:b w:val="false"/>
+                <w:bCs w:val="false"/>
+                <w:color w:val="58595B"/>
+                <w:sz w:val="19"/>
+                <w:szCs w:val="19"/>
+              </w:rPr>
+              <w:t xml:space="preserve">The system shall seed every Organization, on creation, with the same fourteen AI Use Cases described in the section intro, so the catalog is identical in shape across every tenant regardless of sector.</w:t>
             </w:r>
           </w:p>
         </w:tc>
@@ -10842,26 +10974,26 @@
               <w:bottom w:val="single" w:color="E3E3E4" w:sz="2"/>
               <w:right w:val="single" w:color="E3E3E4" w:sz="2"/>
             </w:tcBorders>
-            <w:shd w:fill="FFFFFF" w:val="clear"/>
-            <w:tcMar>
-              <w:top w:type="dxa" w:w="80"/>
-              <w:left w:type="dxa" w:w="100"/>
-              <w:bottom w:type="dxa" w:w="80"/>
-              <w:right w:type="dxa" w:w="100"/>
-            </w:tcMar>
-            <w:vAlign w:val="center"/>
-          </w:tcPr>
-          <w:p>
-            <w:r>
-              <w:rPr>
-                <w:rFonts w:ascii="Times New Roman" w:cs="Times New Roman" w:eastAsia="Times New Roman" w:hAnsi="Times New Roman"/>
-                <w:b w:val="false"/>
-                <w:bCs w:val="false"/>
-                <w:color w:val="58595B"/>
-                <w:sz w:val="19"/>
-                <w:szCs w:val="19"/>
-              </w:rPr>
-              <w:t xml:space="preserve">FR-AIUC-09</w:t>
+            <w:shd w:fill="F2F2F3" w:val="clear"/>
+            <w:tcMar>
+              <w:top w:type="dxa" w:w="80"/>
+              <w:left w:type="dxa" w:w="100"/>
+              <w:bottom w:type="dxa" w:w="80"/>
+              <w:right w:type="dxa" w:w="100"/>
+            </w:tcMar>
+            <w:vAlign w:val="center"/>
+          </w:tcPr>
+          <w:p>
+            <w:r>
+              <w:rPr>
+                <w:rFonts w:ascii="Times New Roman" w:cs="Times New Roman" w:eastAsia="Times New Roman" w:hAnsi="Times New Roman"/>
+                <w:b w:val="false"/>
+                <w:bCs w:val="false"/>
+                <w:color w:val="58595B"/>
+                <w:sz w:val="19"/>
+                <w:szCs w:val="19"/>
+              </w:rPr>
+              <w:t xml:space="preserve">FR-AIUC-10</w:t>
             </w:r>
           </w:p>
         </w:tc>
@@ -10874,26 +11006,26 @@
               <w:bottom w:val="single" w:color="E3E3E4" w:sz="2"/>
               <w:right w:val="single" w:color="E3E3E4" w:sz="2"/>
             </w:tcBorders>
-            <w:shd w:fill="FFFFFF" w:val="clear"/>
-            <w:tcMar>
-              <w:top w:type="dxa" w:w="80"/>
-              <w:left w:type="dxa" w:w="100"/>
-              <w:bottom w:type="dxa" w:w="80"/>
-              <w:right w:type="dxa" w:w="100"/>
-            </w:tcMar>
-            <w:vAlign w:val="center"/>
-          </w:tcPr>
-          <w:p>
-            <w:r>
-              <w:rPr>
-                <w:rFonts w:ascii="Times New Roman" w:cs="Times New Roman" w:eastAsia="Times New Roman" w:hAnsi="Times New Roman"/>
-                <w:b w:val="false"/>
-                <w:bCs w:val="false"/>
-                <w:color w:val="58595B"/>
-                <w:sz w:val="19"/>
-                <w:szCs w:val="19"/>
-              </w:rPr>
-              <w:t xml:space="preserve">The system shall allow an authorized user to toggle an AI Use Case between Active and Inactive status without deleting it or discarding its version history.</w:t>
+            <w:shd w:fill="F2F2F3" w:val="clear"/>
+            <w:tcMar>
+              <w:top w:type="dxa" w:w="80"/>
+              <w:left w:type="dxa" w:w="100"/>
+              <w:bottom w:type="dxa" w:w="80"/>
+              <w:right w:type="dxa" w:w="100"/>
+            </w:tcMar>
+            <w:vAlign w:val="center"/>
+          </w:tcPr>
+          <w:p>
+            <w:r>
+              <w:rPr>
+                <w:rFonts w:ascii="Times New Roman" w:cs="Times New Roman" w:eastAsia="Times New Roman" w:hAnsi="Times New Roman"/>
+                <w:b w:val="false"/>
+                <w:bCs w:val="false"/>
+                <w:color w:val="58595B"/>
+                <w:sz w:val="19"/>
+                <w:szCs w:val="19"/>
+              </w:rPr>
+              <w:t xml:space="preserve">The system shall allow an Organization Administrator holding canActivateAiForOrg (aiUseCase.activate) to activate or deactivate any AI Use Case for the whole Organization, independently of editing its metadata or content.</w:t>
             </w:r>
           </w:p>
         </w:tc>
@@ -10908,26 +11040,26 @@
               <w:bottom w:val="single" w:color="E3E3E4" w:sz="2"/>
               <w:right w:val="single" w:color="E3E3E4" w:sz="2"/>
             </w:tcBorders>
-            <w:shd w:fill="F2F2F3" w:val="clear"/>
-            <w:tcMar>
-              <w:top w:type="dxa" w:w="80"/>
-              <w:left w:type="dxa" w:w="100"/>
-              <w:bottom w:type="dxa" w:w="80"/>
-              <w:right w:type="dxa" w:w="100"/>
-            </w:tcMar>
-            <w:vAlign w:val="center"/>
-          </w:tcPr>
-          <w:p>
-            <w:r>
-              <w:rPr>
-                <w:rFonts w:ascii="Times New Roman" w:cs="Times New Roman" w:eastAsia="Times New Roman" w:hAnsi="Times New Roman"/>
-                <w:b w:val="false"/>
-                <w:bCs w:val="false"/>
-                <w:color w:val="58595B"/>
-                <w:sz w:val="19"/>
-                <w:szCs w:val="19"/>
-              </w:rPr>
-              <w:t xml:space="preserve">FR-AIUC-10</w:t>
+            <w:shd w:fill="FFFFFF" w:val="clear"/>
+            <w:tcMar>
+              <w:top w:type="dxa" w:w="80"/>
+              <w:left w:type="dxa" w:w="100"/>
+              <w:bottom w:type="dxa" w:w="80"/>
+              <w:right w:type="dxa" w:w="100"/>
+            </w:tcMar>
+            <w:vAlign w:val="center"/>
+          </w:tcPr>
+          <w:p>
+            <w:r>
+              <w:rPr>
+                <w:rFonts w:ascii="Times New Roman" w:cs="Times New Roman" w:eastAsia="Times New Roman" w:hAnsi="Times New Roman"/>
+                <w:b w:val="false"/>
+                <w:bCs w:val="false"/>
+                <w:color w:val="58595B"/>
+                <w:sz w:val="19"/>
+                <w:szCs w:val="19"/>
+              </w:rPr>
+              <w:t xml:space="preserve">FR-AIUC-11</w:t>
             </w:r>
           </w:p>
         </w:tc>
@@ -10940,26 +11072,686 @@
               <w:bottom w:val="single" w:color="E3E3E4" w:sz="2"/>
               <w:right w:val="single" w:color="E3E3E4" w:sz="2"/>
             </w:tcBorders>
-            <w:shd w:fill="F2F2F3" w:val="clear"/>
-            <w:tcMar>
-              <w:top w:type="dxa" w:w="80"/>
-              <w:left w:type="dxa" w:w="100"/>
-              <w:bottom w:type="dxa" w:w="80"/>
-              <w:right w:type="dxa" w:w="100"/>
-            </w:tcMar>
-            <w:vAlign w:val="center"/>
-          </w:tcPr>
-          <w:p>
-            <w:r>
-              <w:rPr>
-                <w:rFonts w:ascii="Times New Roman" w:cs="Times New Roman" w:eastAsia="Times New Roman" w:hAnsi="Times New Roman"/>
-                <w:b w:val="false"/>
-                <w:bCs w:val="false"/>
-                <w:color w:val="58595B"/>
-                <w:sz w:val="19"/>
-                <w:szCs w:val="19"/>
-              </w:rPr>
-              <w:t xml:space="preserve">The system shall seed every Organization, on creation, with the same seven generic AI Use Cases — one per NCP process step (S1-S7) — rather than sector-specific entries, so the catalog documents the platform's own built-in AI Agents identically across every sector.</w:t>
+            <w:shd w:fill="FFFFFF" w:val="clear"/>
+            <w:tcMar>
+              <w:top w:type="dxa" w:w="80"/>
+              <w:left w:type="dxa" w:w="100"/>
+              <w:bottom w:type="dxa" w:w="80"/>
+              <w:right w:type="dxa" w:w="100"/>
+            </w:tcMar>
+            <w:vAlign w:val="center"/>
+          </w:tcPr>
+          <w:p>
+            <w:r>
+              <w:rPr>
+                <w:rFonts w:ascii="Times New Roman" w:cs="Times New Roman" w:eastAsia="Times New Roman" w:hAnsi="Times New Roman"/>
+                <w:b w:val="false"/>
+                <w:bCs w:val="false"/>
+                <w:color w:val="58595B"/>
+                <w:sz w:val="19"/>
+                <w:szCs w:val="19"/>
+              </w:rPr>
+              <w:t xml:space="preserve">The system shall allow a user holding canRequestProjectAiOverride (aiUseCase.projectOverride) to set a per-Project override on any AI Use Case as one of three states: Inherit, On, or Off.</w:t>
+            </w:r>
+          </w:p>
+        </w:tc>
+      </w:tr>
+      <w:tr>
+        <w:tc>
+          <w:tcPr>
+            <w:tcW w:type="dxa" w:w="1500"/>
+            <w:tcBorders>
+              <w:top w:val="single" w:color="E3E3E4" w:sz="2"/>
+              <w:left w:val="single" w:color="E3E3E4" w:sz="2"/>
+              <w:bottom w:val="single" w:color="E3E3E4" w:sz="2"/>
+              <w:right w:val="single" w:color="E3E3E4" w:sz="2"/>
+            </w:tcBorders>
+            <w:shd w:fill="F2F2F3" w:val="clear"/>
+            <w:tcMar>
+              <w:top w:type="dxa" w:w="80"/>
+              <w:left w:type="dxa" w:w="100"/>
+              <w:bottom w:type="dxa" w:w="80"/>
+              <w:right w:type="dxa" w:w="100"/>
+            </w:tcMar>
+            <w:vAlign w:val="center"/>
+          </w:tcPr>
+          <w:p>
+            <w:r>
+              <w:rPr>
+                <w:rFonts w:ascii="Times New Roman" w:cs="Times New Roman" w:eastAsia="Times New Roman" w:hAnsi="Times New Roman"/>
+                <w:b w:val="false"/>
+                <w:bCs w:val="false"/>
+                <w:color w:val="58595B"/>
+                <w:sz w:val="19"/>
+                <w:szCs w:val="19"/>
+              </w:rPr>
+              <w:t xml:space="preserve">FR-AIUC-12</w:t>
+            </w:r>
+          </w:p>
+        </w:tc>
+        <w:tc>
+          <w:tcPr>
+            <w:tcW w:type="dxa" w:w="8246"/>
+            <w:tcBorders>
+              <w:top w:val="single" w:color="E3E3E4" w:sz="2"/>
+              <w:left w:val="single" w:color="E3E3E4" w:sz="2"/>
+              <w:bottom w:val="single" w:color="E3E3E4" w:sz="2"/>
+              <w:right w:val="single" w:color="E3E3E4" w:sz="2"/>
+            </w:tcBorders>
+            <w:shd w:fill="F2F2F3" w:val="clear"/>
+            <w:tcMar>
+              <w:top w:type="dxa" w:w="80"/>
+              <w:left w:type="dxa" w:w="100"/>
+              <w:bottom w:type="dxa" w:w="80"/>
+              <w:right w:type="dxa" w:w="100"/>
+            </w:tcMar>
+            <w:vAlign w:val="center"/>
+          </w:tcPr>
+          <w:p>
+            <w:r>
+              <w:rPr>
+                <w:rFonts w:ascii="Times New Roman" w:cs="Times New Roman" w:eastAsia="Times New Roman" w:hAnsi="Times New Roman"/>
+                <w:b w:val="false"/>
+                <w:bCs w:val="false"/>
+                <w:color w:val="58595B"/>
+                <w:sz w:val="19"/>
+                <w:szCs w:val="19"/>
+              </w:rPr>
+              <w:t xml:space="preserve">The system shall compute an AI Use Case's effective activation state, for a given Project context, as that Project's override when set to On or Off, and as the Organization's activation state (FR-AIUC-10) when the Project override is Inherit or unset.</w:t>
+            </w:r>
+          </w:p>
+        </w:tc>
+      </w:tr>
+      <w:tr>
+        <w:tc>
+          <w:tcPr>
+            <w:tcW w:type="dxa" w:w="1500"/>
+            <w:tcBorders>
+              <w:top w:val="single" w:color="E3E3E4" w:sz="2"/>
+              <w:left w:val="single" w:color="E3E3E4" w:sz="2"/>
+              <w:bottom w:val="single" w:color="E3E3E4" w:sz="2"/>
+              <w:right w:val="single" w:color="E3E3E4" w:sz="2"/>
+            </w:tcBorders>
+            <w:shd w:fill="FFFFFF" w:val="clear"/>
+            <w:tcMar>
+              <w:top w:type="dxa" w:w="80"/>
+              <w:left w:type="dxa" w:w="100"/>
+              <w:bottom w:type="dxa" w:w="80"/>
+              <w:right w:type="dxa" w:w="100"/>
+            </w:tcMar>
+            <w:vAlign w:val="center"/>
+          </w:tcPr>
+          <w:p>
+            <w:r>
+              <w:rPr>
+                <w:rFonts w:ascii="Times New Roman" w:cs="Times New Roman" w:eastAsia="Times New Roman" w:hAnsi="Times New Roman"/>
+                <w:b w:val="false"/>
+                <w:bCs w:val="false"/>
+                <w:color w:val="58595B"/>
+                <w:sz w:val="19"/>
+                <w:szCs w:val="19"/>
+              </w:rPr>
+              <w:t xml:space="preserve">FR-AIUC-13</w:t>
+            </w:r>
+          </w:p>
+        </w:tc>
+        <w:tc>
+          <w:tcPr>
+            <w:tcW w:type="dxa" w:w="8246"/>
+            <w:tcBorders>
+              <w:top w:val="single" w:color="E3E3E4" w:sz="2"/>
+              <w:left w:val="single" w:color="E3E3E4" w:sz="2"/>
+              <w:bottom w:val="single" w:color="E3E3E4" w:sz="2"/>
+              <w:right w:val="single" w:color="E3E3E4" w:sz="2"/>
+            </w:tcBorders>
+            <w:shd w:fill="FFFFFF" w:val="clear"/>
+            <w:tcMar>
+              <w:top w:type="dxa" w:w="80"/>
+              <w:left w:type="dxa" w:w="100"/>
+              <w:bottom w:type="dxa" w:w="80"/>
+              <w:right w:type="dxa" w:w="100"/>
+            </w:tcMar>
+            <w:vAlign w:val="center"/>
+          </w:tcPr>
+          <w:p>
+            <w:r>
+              <w:rPr>
+                <w:rFonts w:ascii="Times New Roman" w:cs="Times New Roman" w:eastAsia="Times New Roman" w:hAnsi="Times New Roman"/>
+                <w:b w:val="false"/>
+                <w:bCs w:val="false"/>
+                <w:color w:val="58595B"/>
+                <w:sz w:val="19"/>
+                <w:szCs w:val="19"/>
+              </w:rPr>
+              <w:t xml:space="preserve">The system shall block, server-side, any new AI suggestion from a deactivated AI Use Case (by its effective state) immediately upon deactivation, while never retroactively hiding, unlabeling, or removing content a human already reviewed and approved before deactivation.</w:t>
+            </w:r>
+          </w:p>
+        </w:tc>
+      </w:tr>
+      <w:tr>
+        <w:tc>
+          <w:tcPr>
+            <w:tcW w:type="dxa" w:w="1500"/>
+            <w:tcBorders>
+              <w:top w:val="single" w:color="E3E3E4" w:sz="2"/>
+              <w:left w:val="single" w:color="E3E3E4" w:sz="2"/>
+              <w:bottom w:val="single" w:color="E3E3E4" w:sz="2"/>
+              <w:right w:val="single" w:color="E3E3E4" w:sz="2"/>
+            </w:tcBorders>
+            <w:shd w:fill="F2F2F3" w:val="clear"/>
+            <w:tcMar>
+              <w:top w:type="dxa" w:w="80"/>
+              <w:left w:type="dxa" w:w="100"/>
+              <w:bottom w:type="dxa" w:w="80"/>
+              <w:right w:type="dxa" w:w="100"/>
+            </w:tcMar>
+            <w:vAlign w:val="center"/>
+          </w:tcPr>
+          <w:p>
+            <w:r>
+              <w:rPr>
+                <w:rFonts w:ascii="Times New Roman" w:cs="Times New Roman" w:eastAsia="Times New Roman" w:hAnsi="Times New Roman"/>
+                <w:b w:val="false"/>
+                <w:bCs w:val="false"/>
+                <w:color w:val="58595B"/>
+                <w:sz w:val="19"/>
+                <w:szCs w:val="19"/>
+              </w:rPr>
+              <w:t xml:space="preserve">FR-AIUC-14</w:t>
+            </w:r>
+          </w:p>
+        </w:tc>
+        <w:tc>
+          <w:tcPr>
+            <w:tcW w:type="dxa" w:w="8246"/>
+            <w:tcBorders>
+              <w:top w:val="single" w:color="E3E3E4" w:sz="2"/>
+              <w:left w:val="single" w:color="E3E3E4" w:sz="2"/>
+              <w:bottom w:val="single" w:color="E3E3E4" w:sz="2"/>
+              <w:right w:val="single" w:color="E3E3E4" w:sz="2"/>
+            </w:tcBorders>
+            <w:shd w:fill="F2F2F3" w:val="clear"/>
+            <w:tcMar>
+              <w:top w:type="dxa" w:w="80"/>
+              <w:left w:type="dxa" w:w="100"/>
+              <w:bottom w:type="dxa" w:w="80"/>
+              <w:right w:type="dxa" w:w="100"/>
+            </w:tcMar>
+            <w:vAlign w:val="center"/>
+          </w:tcPr>
+          <w:p>
+            <w:r>
+              <w:rPr>
+                <w:rFonts w:ascii="Times New Roman" w:cs="Times New Roman" w:eastAsia="Times New Roman" w:hAnsi="Times New Roman"/>
+                <w:b w:val="false"/>
+                <w:bCs w:val="false"/>
+                <w:color w:val="58595B"/>
+                <w:sz w:val="19"/>
+                <w:szCs w:val="19"/>
+              </w:rPr>
+              <w:t xml:space="preserve">The system shall visually label every AI-generated output, wherever it is shown, as AI-generated and requiring human review, alongside its tier (Assistive/Augmented).</w:t>
+            </w:r>
+          </w:p>
+        </w:tc>
+      </w:tr>
+      <w:tr>
+        <w:tc>
+          <w:tcPr>
+            <w:tcW w:type="dxa" w:w="1500"/>
+            <w:tcBorders>
+              <w:top w:val="single" w:color="E3E3E4" w:sz="2"/>
+              <w:left w:val="single" w:color="E3E3E4" w:sz="2"/>
+              <w:bottom w:val="single" w:color="E3E3E4" w:sz="2"/>
+              <w:right w:val="single" w:color="E3E3E4" w:sz="2"/>
+            </w:tcBorders>
+            <w:shd w:fill="FFFFFF" w:val="clear"/>
+            <w:tcMar>
+              <w:top w:type="dxa" w:w="80"/>
+              <w:left w:type="dxa" w:w="100"/>
+              <w:bottom w:type="dxa" w:w="80"/>
+              <w:right w:type="dxa" w:w="100"/>
+            </w:tcMar>
+            <w:vAlign w:val="center"/>
+          </w:tcPr>
+          <w:p>
+            <w:r>
+              <w:rPr>
+                <w:rFonts w:ascii="Times New Roman" w:cs="Times New Roman" w:eastAsia="Times New Roman" w:hAnsi="Times New Roman"/>
+                <w:b w:val="false"/>
+                <w:bCs w:val="false"/>
+                <w:color w:val="58595B"/>
+                <w:sz w:val="19"/>
+                <w:szCs w:val="19"/>
+              </w:rPr>
+              <w:t xml:space="preserve">FR-AIUC-15</w:t>
+            </w:r>
+          </w:p>
+        </w:tc>
+        <w:tc>
+          <w:tcPr>
+            <w:tcW w:type="dxa" w:w="8246"/>
+            <w:tcBorders>
+              <w:top w:val="single" w:color="E3E3E4" w:sz="2"/>
+              <w:left w:val="single" w:color="E3E3E4" w:sz="2"/>
+              <w:bottom w:val="single" w:color="E3E3E4" w:sz="2"/>
+              <w:right w:val="single" w:color="E3E3E4" w:sz="2"/>
+            </w:tcBorders>
+            <w:shd w:fill="FFFFFF" w:val="clear"/>
+            <w:tcMar>
+              <w:top w:type="dxa" w:w="80"/>
+              <w:left w:type="dxa" w:w="100"/>
+              <w:bottom w:type="dxa" w:w="80"/>
+              <w:right w:type="dxa" w:w="100"/>
+            </w:tcMar>
+            <w:vAlign w:val="center"/>
+          </w:tcPr>
+          <w:p>
+            <w:r>
+              <w:rPr>
+                <w:rFonts w:ascii="Times New Roman" w:cs="Times New Roman" w:eastAsia="Times New Roman" w:hAnsi="Times New Roman"/>
+                <w:b w:val="false"/>
+                <w:bCs w:val="false"/>
+                <w:color w:val="58595B"/>
+                <w:sz w:val="19"/>
+                <w:szCs w:val="19"/>
+              </w:rPr>
+              <w:t xml:space="preserve">The system shall write an append-only AI Usage Log entry for every AI suggestion's outcome — Accepted, Edited, or Rejected — capturing the AI Use Case, Organization, Project (if any), the record it applied to, an output summary, the acting user, and a timestamp; the system shall expose no edit or delete route or UI control for this log.</w:t>
+            </w:r>
+          </w:p>
+        </w:tc>
+      </w:tr>
+      <w:tr>
+        <w:tc>
+          <w:tcPr>
+            <w:tcW w:type="dxa" w:w="1500"/>
+            <w:tcBorders>
+              <w:top w:val="single" w:color="E3E3E4" w:sz="2"/>
+              <w:left w:val="single" w:color="E3E3E4" w:sz="2"/>
+              <w:bottom w:val="single" w:color="E3E3E4" w:sz="2"/>
+              <w:right w:val="single" w:color="E3E3E4" w:sz="2"/>
+            </w:tcBorders>
+            <w:shd w:fill="F2F2F3" w:val="clear"/>
+            <w:tcMar>
+              <w:top w:type="dxa" w:w="80"/>
+              <w:left w:type="dxa" w:w="100"/>
+              <w:bottom w:type="dxa" w:w="80"/>
+              <w:right w:type="dxa" w:w="100"/>
+            </w:tcMar>
+            <w:vAlign w:val="center"/>
+          </w:tcPr>
+          <w:p>
+            <w:r>
+              <w:rPr>
+                <w:rFonts w:ascii="Times New Roman" w:cs="Times New Roman" w:eastAsia="Times New Roman" w:hAnsi="Times New Roman"/>
+                <w:b w:val="false"/>
+                <w:bCs w:val="false"/>
+                <w:color w:val="58595B"/>
+                <w:sz w:val="19"/>
+                <w:szCs w:val="19"/>
+              </w:rPr>
+              <w:t xml:space="preserve">FR-AIUC-16</w:t>
+            </w:r>
+          </w:p>
+        </w:tc>
+        <w:tc>
+          <w:tcPr>
+            <w:tcW w:type="dxa" w:w="8246"/>
+            <w:tcBorders>
+              <w:top w:val="single" w:color="E3E3E4" w:sz="2"/>
+              <w:left w:val="single" w:color="E3E3E4" w:sz="2"/>
+              <w:bottom w:val="single" w:color="E3E3E4" w:sz="2"/>
+              <w:right w:val="single" w:color="E3E3E4" w:sz="2"/>
+            </w:tcBorders>
+            <w:shd w:fill="F2F2F3" w:val="clear"/>
+            <w:tcMar>
+              <w:top w:type="dxa" w:w="80"/>
+              <w:left w:type="dxa" w:w="100"/>
+              <w:bottom w:type="dxa" w:w="80"/>
+              <w:right w:type="dxa" w:w="100"/>
+            </w:tcMar>
+            <w:vAlign w:val="center"/>
+          </w:tcPr>
+          <w:p>
+            <w:r>
+              <w:rPr>
+                <w:rFonts w:ascii="Times New Roman" w:cs="Times New Roman" w:eastAsia="Times New Roman" w:hAnsi="Times New Roman"/>
+                <w:b w:val="false"/>
+                <w:bCs w:val="false"/>
+                <w:color w:val="58595B"/>
+                <w:sz w:val="19"/>
+                <w:szCs w:val="19"/>
+              </w:rPr>
+              <w:t xml:space="preserve">The system shall, on deleting an AI Use Case, purge every Organization activation entry and every Project-override entry that reference it, so no orphaned activation-map key can outlive its use case.</w:t>
+            </w:r>
+          </w:p>
+        </w:tc>
+      </w:tr>
+      <w:tr>
+        <w:tc>
+          <w:tcPr>
+            <w:tcW w:type="dxa" w:w="1500"/>
+            <w:tcBorders>
+              <w:top w:val="single" w:color="E3E3E4" w:sz="2"/>
+              <w:left w:val="single" w:color="E3E3E4" w:sz="2"/>
+              <w:bottom w:val="single" w:color="E3E3E4" w:sz="2"/>
+              <w:right w:val="single" w:color="E3E3E4" w:sz="2"/>
+            </w:tcBorders>
+            <w:shd w:fill="FFFFFF" w:val="clear"/>
+            <w:tcMar>
+              <w:top w:type="dxa" w:w="80"/>
+              <w:left w:type="dxa" w:w="100"/>
+              <w:bottom w:type="dxa" w:w="80"/>
+              <w:right w:type="dxa" w:w="100"/>
+            </w:tcMar>
+            <w:vAlign w:val="center"/>
+          </w:tcPr>
+          <w:p>
+            <w:r>
+              <w:rPr>
+                <w:rFonts w:ascii="Times New Roman" w:cs="Times New Roman" w:eastAsia="Times New Roman" w:hAnsi="Times New Roman"/>
+                <w:b w:val="false"/>
+                <w:bCs w:val="false"/>
+                <w:color w:val="58595B"/>
+                <w:sz w:val="19"/>
+                <w:szCs w:val="19"/>
+              </w:rPr>
+              <w:t xml:space="preserve">FR-AIUC-17</w:t>
+            </w:r>
+          </w:p>
+        </w:tc>
+        <w:tc>
+          <w:tcPr>
+            <w:tcW w:type="dxa" w:w="8246"/>
+            <w:tcBorders>
+              <w:top w:val="single" w:color="E3E3E4" w:sz="2"/>
+              <w:left w:val="single" w:color="E3E3E4" w:sz="2"/>
+              <w:bottom w:val="single" w:color="E3E3E4" w:sz="2"/>
+              <w:right w:val="single" w:color="E3E3E4" w:sz="2"/>
+            </w:tcBorders>
+            <w:shd w:fill="FFFFFF" w:val="clear"/>
+            <w:tcMar>
+              <w:top w:type="dxa" w:w="80"/>
+              <w:left w:type="dxa" w:w="100"/>
+              <w:bottom w:type="dxa" w:w="80"/>
+              <w:right w:type="dxa" w:w="100"/>
+            </w:tcMar>
+            <w:vAlign w:val="center"/>
+          </w:tcPr>
+          <w:p>
+            <w:r>
+              <w:rPr>
+                <w:rFonts w:ascii="Times New Roman" w:cs="Times New Roman" w:eastAsia="Times New Roman" w:hAnsi="Times New Roman"/>
+                <w:b w:val="false"/>
+                <w:bCs w:val="false"/>
+                <w:color w:val="58595B"/>
+                <w:sz w:val="19"/>
+                <w:szCs w:val="19"/>
+              </w:rPr>
+              <w:t xml:space="preserve">The system shall allow a user to configure a Real LLM Provider Connection (provider, model, endpoint URL, and API key) and shall persist it only in the user's own browser local storage, in a namespace separate from every other cached or exportable application state.</w:t>
+            </w:r>
+          </w:p>
+        </w:tc>
+      </w:tr>
+      <w:tr>
+        <w:tc>
+          <w:tcPr>
+            <w:tcW w:type="dxa" w:w="1500"/>
+            <w:tcBorders>
+              <w:top w:val="single" w:color="E3E3E4" w:sz="2"/>
+              <w:left w:val="single" w:color="E3E3E4" w:sz="2"/>
+              <w:bottom w:val="single" w:color="E3E3E4" w:sz="2"/>
+              <w:right w:val="single" w:color="E3E3E4" w:sz="2"/>
+            </w:tcBorders>
+            <w:shd w:fill="F2F2F3" w:val="clear"/>
+            <w:tcMar>
+              <w:top w:type="dxa" w:w="80"/>
+              <w:left w:type="dxa" w:w="100"/>
+              <w:bottom w:type="dxa" w:w="80"/>
+              <w:right w:type="dxa" w:w="100"/>
+            </w:tcMar>
+            <w:vAlign w:val="center"/>
+          </w:tcPr>
+          <w:p>
+            <w:r>
+              <w:rPr>
+                <w:rFonts w:ascii="Times New Roman" w:cs="Times New Roman" w:eastAsia="Times New Roman" w:hAnsi="Times New Roman"/>
+                <w:b w:val="false"/>
+                <w:bCs w:val="false"/>
+                <w:color w:val="58595B"/>
+                <w:sz w:val="19"/>
+                <w:szCs w:val="19"/>
+              </w:rPr>
+              <w:t xml:space="preserve">FR-AIUC-18</w:t>
+            </w:r>
+          </w:p>
+        </w:tc>
+        <w:tc>
+          <w:tcPr>
+            <w:tcW w:type="dxa" w:w="8246"/>
+            <w:tcBorders>
+              <w:top w:val="single" w:color="E3E3E4" w:sz="2"/>
+              <w:left w:val="single" w:color="E3E3E4" w:sz="2"/>
+              <w:bottom w:val="single" w:color="E3E3E4" w:sz="2"/>
+              <w:right w:val="single" w:color="E3E3E4" w:sz="2"/>
+            </w:tcBorders>
+            <w:shd w:fill="F2F2F3" w:val="clear"/>
+            <w:tcMar>
+              <w:top w:type="dxa" w:w="80"/>
+              <w:left w:type="dxa" w:w="100"/>
+              <w:bottom w:type="dxa" w:w="80"/>
+              <w:right w:type="dxa" w:w="100"/>
+            </w:tcMar>
+            <w:vAlign w:val="center"/>
+          </w:tcPr>
+          <w:p>
+            <w:r>
+              <w:rPr>
+                <w:rFonts w:ascii="Times New Roman" w:cs="Times New Roman" w:eastAsia="Times New Roman" w:hAnsi="Times New Roman"/>
+                <w:b w:val="false"/>
+                <w:bCs w:val="false"/>
+                <w:color w:val="58595B"/>
+                <w:sz w:val="19"/>
+                <w:szCs w:val="19"/>
+              </w:rPr>
+              <w:t xml:space="preserve">The system shall never include the Real LLM Provider Connection, in whole or in part, in any data export, and shall never synchronize, cache, or persist it on the backend beyond the single generation request it is forwarded with; the connection shall survive a Reset Demo Data operation, since that operation resets only server-side tenant data.</w:t>
+            </w:r>
+          </w:p>
+        </w:tc>
+      </w:tr>
+      <w:tr>
+        <w:tc>
+          <w:tcPr>
+            <w:tcW w:type="dxa" w:w="1500"/>
+            <w:tcBorders>
+              <w:top w:val="single" w:color="E3E3E4" w:sz="2"/>
+              <w:left w:val="single" w:color="E3E3E4" w:sz="2"/>
+              <w:bottom w:val="single" w:color="E3E3E4" w:sz="2"/>
+              <w:right w:val="single" w:color="E3E3E4" w:sz="2"/>
+            </w:tcBorders>
+            <w:shd w:fill="FFFFFF" w:val="clear"/>
+            <w:tcMar>
+              <w:top w:type="dxa" w:w="80"/>
+              <w:left w:type="dxa" w:w="100"/>
+              <w:bottom w:type="dxa" w:w="80"/>
+              <w:right w:type="dxa" w:w="100"/>
+            </w:tcMar>
+            <w:vAlign w:val="center"/>
+          </w:tcPr>
+          <w:p>
+            <w:r>
+              <w:rPr>
+                <w:rFonts w:ascii="Times New Roman" w:cs="Times New Roman" w:eastAsia="Times New Roman" w:hAnsi="Times New Roman"/>
+                <w:b w:val="false"/>
+                <w:bCs w:val="false"/>
+                <w:color w:val="58595B"/>
+                <w:sz w:val="19"/>
+                <w:szCs w:val="19"/>
+              </w:rPr>
+              <w:t xml:space="preserve">FR-AIUC-19</w:t>
+            </w:r>
+          </w:p>
+        </w:tc>
+        <w:tc>
+          <w:tcPr>
+            <w:tcW w:type="dxa" w:w="8246"/>
+            <w:tcBorders>
+              <w:top w:val="single" w:color="E3E3E4" w:sz="2"/>
+              <w:left w:val="single" w:color="E3E3E4" w:sz="2"/>
+              <w:bottom w:val="single" w:color="E3E3E4" w:sz="2"/>
+              <w:right w:val="single" w:color="E3E3E4" w:sz="2"/>
+            </w:tcBorders>
+            <w:shd w:fill="FFFFFF" w:val="clear"/>
+            <w:tcMar>
+              <w:top w:type="dxa" w:w="80"/>
+              <w:left w:type="dxa" w:w="100"/>
+              <w:bottom w:type="dxa" w:w="80"/>
+              <w:right w:type="dxa" w:w="100"/>
+            </w:tcMar>
+            <w:vAlign w:val="center"/>
+          </w:tcPr>
+          <w:p>
+            <w:r>
+              <w:rPr>
+                <w:rFonts w:ascii="Times New Roman" w:cs="Times New Roman" w:eastAsia="Times New Roman" w:hAnsi="Times New Roman"/>
+                <w:b w:val="false"/>
+                <w:bCs w:val="false"/>
+                <w:color w:val="58595B"/>
+                <w:sz w:val="19"/>
+                <w:szCs w:val="19"/>
+              </w:rPr>
+              <w:t xml:space="preserve">The system shall, on any failure of a live LLM call — network error, authentication failure, timeout, or an unsupported provider — fall back automatically to its deterministic built-in generator for that same request, so a misconfigured or unreachable connection never blocks a suggestion from being produced.</w:t>
+            </w:r>
+          </w:p>
+        </w:tc>
+      </w:tr>
+      <w:tr>
+        <w:tc>
+          <w:tcPr>
+            <w:tcW w:type="dxa" w:w="1500"/>
+            <w:tcBorders>
+              <w:top w:val="single" w:color="E3E3E4" w:sz="2"/>
+              <w:left w:val="single" w:color="E3E3E4" w:sz="2"/>
+              <w:bottom w:val="single" w:color="E3E3E4" w:sz="2"/>
+              <w:right w:val="single" w:color="E3E3E4" w:sz="2"/>
+            </w:tcBorders>
+            <w:shd w:fill="F2F2F3" w:val="clear"/>
+            <w:tcMar>
+              <w:top w:type="dxa" w:w="80"/>
+              <w:left w:type="dxa" w:w="100"/>
+              <w:bottom w:type="dxa" w:w="80"/>
+              <w:right w:type="dxa" w:w="100"/>
+            </w:tcMar>
+            <w:vAlign w:val="center"/>
+          </w:tcPr>
+          <w:p>
+            <w:r>
+              <w:rPr>
+                <w:rFonts w:ascii="Times New Roman" w:cs="Times New Roman" w:eastAsia="Times New Roman" w:hAnsi="Times New Roman"/>
+                <w:b w:val="false"/>
+                <w:bCs w:val="false"/>
+                <w:color w:val="58595B"/>
+                <w:sz w:val="19"/>
+                <w:szCs w:val="19"/>
+              </w:rPr>
+              <w:t xml:space="preserve">FR-AIUC-20</w:t>
+            </w:r>
+          </w:p>
+        </w:tc>
+        <w:tc>
+          <w:tcPr>
+            <w:tcW w:type="dxa" w:w="8246"/>
+            <w:tcBorders>
+              <w:top w:val="single" w:color="E3E3E4" w:sz="2"/>
+              <w:left w:val="single" w:color="E3E3E4" w:sz="2"/>
+              <w:bottom w:val="single" w:color="E3E3E4" w:sz="2"/>
+              <w:right w:val="single" w:color="E3E3E4" w:sz="2"/>
+            </w:tcBorders>
+            <w:shd w:fill="F2F2F3" w:val="clear"/>
+            <w:tcMar>
+              <w:top w:type="dxa" w:w="80"/>
+              <w:left w:type="dxa" w:w="100"/>
+              <w:bottom w:type="dxa" w:w="80"/>
+              <w:right w:type="dxa" w:w="100"/>
+            </w:tcMar>
+            <w:vAlign w:val="center"/>
+          </w:tcPr>
+          <w:p>
+            <w:r>
+              <w:rPr>
+                <w:rFonts w:ascii="Times New Roman" w:cs="Times New Roman" w:eastAsia="Times New Roman" w:hAnsi="Times New Roman"/>
+                <w:b w:val="false"/>
+                <w:bCs w:val="false"/>
+                <w:color w:val="58595B"/>
+                <w:sz w:val="19"/>
+                <w:szCs w:val="19"/>
+              </w:rPr>
+              <w:t xml:space="preserve">The system shall ensure an AI Use Case's activation, tier, or generation never grants a user visibility into any data beyond what their RBAC role and permissions already allow.</w:t>
+            </w:r>
+          </w:p>
+        </w:tc>
+      </w:tr>
+      <w:tr>
+        <w:tc>
+          <w:tcPr>
+            <w:tcW w:type="dxa" w:w="1500"/>
+            <w:tcBorders>
+              <w:top w:val="single" w:color="E3E3E4" w:sz="2"/>
+              <w:left w:val="single" w:color="E3E3E4" w:sz="2"/>
+              <w:bottom w:val="single" w:color="E3E3E4" w:sz="2"/>
+              <w:right w:val="single" w:color="E3E3E4" w:sz="2"/>
+            </w:tcBorders>
+            <w:shd w:fill="FFFFFF" w:val="clear"/>
+            <w:tcMar>
+              <w:top w:type="dxa" w:w="80"/>
+              <w:left w:type="dxa" w:w="100"/>
+              <w:bottom w:type="dxa" w:w="80"/>
+              <w:right w:type="dxa" w:w="100"/>
+            </w:tcMar>
+            <w:vAlign w:val="center"/>
+          </w:tcPr>
+          <w:p>
+            <w:r>
+              <w:rPr>
+                <w:rFonts w:ascii="Times New Roman" w:cs="Times New Roman" w:eastAsia="Times New Roman" w:hAnsi="Times New Roman"/>
+                <w:b w:val="false"/>
+                <w:bCs w:val="false"/>
+                <w:color w:val="58595B"/>
+                <w:sz w:val="19"/>
+                <w:szCs w:val="19"/>
+              </w:rPr>
+              <w:t xml:space="preserve">FR-AIUC-21</w:t>
+            </w:r>
+          </w:p>
+        </w:tc>
+        <w:tc>
+          <w:tcPr>
+            <w:tcW w:type="dxa" w:w="8246"/>
+            <w:tcBorders>
+              <w:top w:val="single" w:color="E3E3E4" w:sz="2"/>
+              <w:left w:val="single" w:color="E3E3E4" w:sz="2"/>
+              <w:bottom w:val="single" w:color="E3E3E4" w:sz="2"/>
+              <w:right w:val="single" w:color="E3E3E4" w:sz="2"/>
+            </w:tcBorders>
+            <w:shd w:fill="FFFFFF" w:val="clear"/>
+            <w:tcMar>
+              <w:top w:type="dxa" w:w="80"/>
+              <w:left w:type="dxa" w:w="100"/>
+              <w:bottom w:type="dxa" w:w="80"/>
+              <w:right w:type="dxa" w:w="100"/>
+            </w:tcMar>
+            <w:vAlign w:val="center"/>
+          </w:tcPr>
+          <w:p>
+            <w:r>
+              <w:rPr>
+                <w:rFonts w:ascii="Times New Roman" w:cs="Times New Roman" w:eastAsia="Times New Roman" w:hAnsi="Times New Roman"/>
+                <w:b w:val="false"/>
+                <w:bCs w:val="false"/>
+                <w:color w:val="58595B"/>
+                <w:sz w:val="19"/>
+                <w:szCs w:val="19"/>
+              </w:rPr>
+              <w:t xml:space="preserve">The system shall, before generating any suggestion, retrieve the top-matching methodology reference definitions (Standards) for the record at hand via its RAG engine, instruct the underlying model (real or deterministic) to stay strictly within NCP Solver's own stage and category vocabulary (S1-S7, AR/AE, the 6M causes) and to state no number, score, or name that is not present in the retrieved references or the record's own data, and disclose the retrieved definitions to the user alongside the output.</w:t>
             </w:r>
           </w:p>
         </w:tc>
@@ -13229,7 +14021,7 @@
                 <w:sz w:val="19"/>
                 <w:szCs w:val="19"/>
               </w:rPr>
-              <w:t xml:space="preserve">The system shall provide an in-app Help screen presenting a set of topic articles covering: getting started, the S1-S7 NCP process, Hierarchy &amp; OBS, Identity &amp; RBAC, Governance/Risk/Compliance, the RACSI matrix, the AI Use Cases Library, the Capitalization Library &amp; AI agents, BPMN process diagrams, the AI Assistant &amp; LLM Configuration, Alerts &amp; Reports, and a FAQ.</w:t>
+              <w:t xml:space="preserve">The system shall provide an in-app Help screen presenting a set of topic articles covering: getting started, the S1-S7 NCP process, Hierarchy &amp; OBS, Identity &amp; RBAC, Governance/Risk/Compliance, the RACSI matrix, the AI Use Case Library &amp; Governance, the Capitalization Library &amp; AI agents, BPMN process diagrams, the AI Assistant, Alerts &amp; Reports, and a FAQ.</w:t>
             </w:r>
           </w:p>
         </w:tc>
@@ -16110,7 +16902,7 @@
           <w:sz w:val="27"/>
           <w:szCs w:val="27"/>
         </w:rPr>
-        <w:t xml:space="preserve">3.23 LLM / AI Provider Configuration</w:t>
+        <w:t xml:space="preserve">3.23 AI Assistant (Data Query &amp; Application Help)</w:t>
       </w:r>
     </w:p>
     <w:p>
@@ -16126,659 +16918,7 @@
           <w:sz w:val="19"/>
           <w:szCs w:val="19"/>
         </w:rPr>
-        <w:t xml:space="preserve">A Governance-group settings screen, one configuration per Organization, where an administrator selects and stores connection details for a Large Language Model (LLM) provider intended to power future generative AI features. This screen stores configuration only; as of this version it does not itself place any outbound call to the configured provider (see NFR-MAINT-04 and section 4.5).</w:t>
-      </w:r>
-    </w:p>
-    <w:tbl>
-      <w:tblPr>
-        <w:tblW w:type="dxa" w:w="9746"/>
-        <w:tblBorders>
-          <w:top w:val="single" w:color="auto" w:sz="4"/>
-          <w:left w:val="single" w:color="auto" w:sz="4"/>
-          <w:bottom w:val="single" w:color="auto" w:sz="4"/>
-          <w:right w:val="single" w:color="auto" w:sz="4"/>
-          <w:insideH w:val="single" w:color="auto" w:sz="4"/>
-          <w:insideV w:val="single" w:color="auto" w:sz="4"/>
-        </w:tblBorders>
-      </w:tblPr>
-      <w:tblGrid>
-        <w:gridCol w:w="1500"/>
-        <w:gridCol w:w="8246"/>
-      </w:tblGrid>
-      <w:tr>
-        <w:trPr>
-          <w:tblHeader/>
-        </w:trPr>
-        <w:tc>
-          <w:tcPr>
-            <w:tcW w:type="dxa" w:w="1500"/>
-            <w:tcBorders>
-              <w:top w:val="single" w:color="E3E3E4" w:sz="2"/>
-              <w:left w:val="single" w:color="E3E3E4" w:sz="2"/>
-              <w:bottom w:val="single" w:color="E3E3E4" w:sz="2"/>
-              <w:right w:val="single" w:color="E3E3E4" w:sz="2"/>
-            </w:tcBorders>
-            <w:shd w:fill="F8931D" w:val="clear"/>
-            <w:tcMar>
-              <w:top w:type="dxa" w:w="80"/>
-              <w:left w:type="dxa" w:w="100"/>
-              <w:bottom w:type="dxa" w:w="80"/>
-              <w:right w:type="dxa" w:w="100"/>
-            </w:tcMar>
-            <w:vAlign w:val="center"/>
-          </w:tcPr>
-          <w:p>
-            <w:r>
-              <w:rPr>
-                <w:rFonts w:ascii="Times New Roman" w:cs="Times New Roman" w:eastAsia="Times New Roman" w:hAnsi="Times New Roman"/>
-                <w:b/>
-                <w:bCs/>
-                <w:color w:val="FFFFFF"/>
-                <w:sz w:val="19"/>
-                <w:szCs w:val="19"/>
-              </w:rPr>
-              <w:t xml:space="preserve">ID</w:t>
-            </w:r>
-          </w:p>
-        </w:tc>
-        <w:tc>
-          <w:tcPr>
-            <w:tcW w:type="dxa" w:w="8246"/>
-            <w:tcBorders>
-              <w:top w:val="single" w:color="E3E3E4" w:sz="2"/>
-              <w:left w:val="single" w:color="E3E3E4" w:sz="2"/>
-              <w:bottom w:val="single" w:color="E3E3E4" w:sz="2"/>
-              <w:right w:val="single" w:color="E3E3E4" w:sz="2"/>
-            </w:tcBorders>
-            <w:shd w:fill="F8931D" w:val="clear"/>
-            <w:tcMar>
-              <w:top w:type="dxa" w:w="80"/>
-              <w:left w:type="dxa" w:w="100"/>
-              <w:bottom w:type="dxa" w:w="80"/>
-              <w:right w:type="dxa" w:w="100"/>
-            </w:tcMar>
-            <w:vAlign w:val="center"/>
-          </w:tcPr>
-          <w:p>
-            <w:r>
-              <w:rPr>
-                <w:rFonts w:ascii="Times New Roman" w:cs="Times New Roman" w:eastAsia="Times New Roman" w:hAnsi="Times New Roman"/>
-                <w:b/>
-                <w:bCs/>
-                <w:color w:val="FFFFFF"/>
-                <w:sz w:val="19"/>
-                <w:szCs w:val="19"/>
-              </w:rPr>
-              <w:t xml:space="preserve">Requirement</w:t>
-            </w:r>
-          </w:p>
-        </w:tc>
-      </w:tr>
-      <w:tr>
-        <w:tc>
-          <w:tcPr>
-            <w:tcW w:type="dxa" w:w="1500"/>
-            <w:tcBorders>
-              <w:top w:val="single" w:color="E3E3E4" w:sz="2"/>
-              <w:left w:val="single" w:color="E3E3E4" w:sz="2"/>
-              <w:bottom w:val="single" w:color="E3E3E4" w:sz="2"/>
-              <w:right w:val="single" w:color="E3E3E4" w:sz="2"/>
-            </w:tcBorders>
-            <w:shd w:fill="FFFFFF" w:val="clear"/>
-            <w:tcMar>
-              <w:top w:type="dxa" w:w="80"/>
-              <w:left w:type="dxa" w:w="100"/>
-              <w:bottom w:type="dxa" w:w="80"/>
-              <w:right w:type="dxa" w:w="100"/>
-            </w:tcMar>
-            <w:vAlign w:val="center"/>
-          </w:tcPr>
-          <w:p>
-            <w:r>
-              <w:rPr>
-                <w:rFonts w:ascii="Times New Roman" w:cs="Times New Roman" w:eastAsia="Times New Roman" w:hAnsi="Times New Roman"/>
-                <w:b w:val="false"/>
-                <w:bCs w:val="false"/>
-                <w:color w:val="58595B"/>
-                <w:sz w:val="19"/>
-                <w:szCs w:val="19"/>
-              </w:rPr>
-              <w:t xml:space="preserve">FR-LLM-01</w:t>
-            </w:r>
-          </w:p>
-        </w:tc>
-        <w:tc>
-          <w:tcPr>
-            <w:tcW w:type="dxa" w:w="8246"/>
-            <w:tcBorders>
-              <w:top w:val="single" w:color="E3E3E4" w:sz="2"/>
-              <w:left w:val="single" w:color="E3E3E4" w:sz="2"/>
-              <w:bottom w:val="single" w:color="E3E3E4" w:sz="2"/>
-              <w:right w:val="single" w:color="E3E3E4" w:sz="2"/>
-            </w:tcBorders>
-            <w:shd w:fill="FFFFFF" w:val="clear"/>
-            <w:tcMar>
-              <w:top w:type="dxa" w:w="80"/>
-              <w:left w:type="dxa" w:w="100"/>
-              <w:bottom w:type="dxa" w:w="80"/>
-              <w:right w:type="dxa" w:w="100"/>
-            </w:tcMar>
-            <w:vAlign w:val="center"/>
-          </w:tcPr>
-          <w:p>
-            <w:r>
-              <w:rPr>
-                <w:rFonts w:ascii="Times New Roman" w:cs="Times New Roman" w:eastAsia="Times New Roman" w:hAnsi="Times New Roman"/>
-                <w:b w:val="false"/>
-                <w:bCs w:val="false"/>
-                <w:color w:val="58595B"/>
-                <w:sz w:val="19"/>
-                <w:szCs w:val="19"/>
-              </w:rPr>
-              <w:t xml:space="preserve">The system shall maintain exactly one LLM configuration record per Organization (a singleton), auto-created with safe defaults (provider "anthropic", disabled) on first access.</w:t>
-            </w:r>
-          </w:p>
-        </w:tc>
-      </w:tr>
-      <w:tr>
-        <w:tc>
-          <w:tcPr>
-            <w:tcW w:type="dxa" w:w="1500"/>
-            <w:tcBorders>
-              <w:top w:val="single" w:color="E3E3E4" w:sz="2"/>
-              <w:left w:val="single" w:color="E3E3E4" w:sz="2"/>
-              <w:bottom w:val="single" w:color="E3E3E4" w:sz="2"/>
-              <w:right w:val="single" w:color="E3E3E4" w:sz="2"/>
-            </w:tcBorders>
-            <w:shd w:fill="F2F2F3" w:val="clear"/>
-            <w:tcMar>
-              <w:top w:type="dxa" w:w="80"/>
-              <w:left w:type="dxa" w:w="100"/>
-              <w:bottom w:type="dxa" w:w="80"/>
-              <w:right w:type="dxa" w:w="100"/>
-            </w:tcMar>
-            <w:vAlign w:val="center"/>
-          </w:tcPr>
-          <w:p>
-            <w:r>
-              <w:rPr>
-                <w:rFonts w:ascii="Times New Roman" w:cs="Times New Roman" w:eastAsia="Times New Roman" w:hAnsi="Times New Roman"/>
-                <w:b w:val="false"/>
-                <w:bCs w:val="false"/>
-                <w:color w:val="58595B"/>
-                <w:sz w:val="19"/>
-                <w:szCs w:val="19"/>
-              </w:rPr>
-              <w:t xml:space="preserve">FR-LLM-02</w:t>
-            </w:r>
-          </w:p>
-        </w:tc>
-        <w:tc>
-          <w:tcPr>
-            <w:tcW w:type="dxa" w:w="8246"/>
-            <w:tcBorders>
-              <w:top w:val="single" w:color="E3E3E4" w:sz="2"/>
-              <w:left w:val="single" w:color="E3E3E4" w:sz="2"/>
-              <w:bottom w:val="single" w:color="E3E3E4" w:sz="2"/>
-              <w:right w:val="single" w:color="E3E3E4" w:sz="2"/>
-            </w:tcBorders>
-            <w:shd w:fill="F2F2F3" w:val="clear"/>
-            <w:tcMar>
-              <w:top w:type="dxa" w:w="80"/>
-              <w:left w:type="dxa" w:w="100"/>
-              <w:bottom w:type="dxa" w:w="80"/>
-              <w:right w:type="dxa" w:w="100"/>
-            </w:tcMar>
-            <w:vAlign w:val="center"/>
-          </w:tcPr>
-          <w:p>
-            <w:r>
-              <w:rPr>
-                <w:rFonts w:ascii="Times New Roman" w:cs="Times New Roman" w:eastAsia="Times New Roman" w:hAnsi="Times New Roman"/>
-                <w:b w:val="false"/>
-                <w:bCs w:val="false"/>
-                <w:color w:val="58595B"/>
-                <w:sz w:val="19"/>
-                <w:szCs w:val="19"/>
-              </w:rPr>
-              <w:t xml:space="preserve">The system shall present a predefined list of the ten most common LLM providers to choose from: Anthropic (Claude), OpenAI (GPT), Google (Gemini), Azure OpenAI Service, AWS Bedrock, Mistral AI, Cohere, Meta Llama (via a hosting provider), Ollama (self-hosted/local), and a Custom/OpenAI-compatible endpoint.</w:t>
-            </w:r>
-          </w:p>
-        </w:tc>
-      </w:tr>
-      <w:tr>
-        <w:tc>
-          <w:tcPr>
-            <w:tcW w:type="dxa" w:w="1500"/>
-            <w:tcBorders>
-              <w:top w:val="single" w:color="E3E3E4" w:sz="2"/>
-              <w:left w:val="single" w:color="E3E3E4" w:sz="2"/>
-              <w:bottom w:val="single" w:color="E3E3E4" w:sz="2"/>
-              <w:right w:val="single" w:color="E3E3E4" w:sz="2"/>
-            </w:tcBorders>
-            <w:shd w:fill="FFFFFF" w:val="clear"/>
-            <w:tcMar>
-              <w:top w:type="dxa" w:w="80"/>
-              <w:left w:type="dxa" w:w="100"/>
-              <w:bottom w:type="dxa" w:w="80"/>
-              <w:right w:type="dxa" w:w="100"/>
-            </w:tcMar>
-            <w:vAlign w:val="center"/>
-          </w:tcPr>
-          <w:p>
-            <w:r>
-              <w:rPr>
-                <w:rFonts w:ascii="Times New Roman" w:cs="Times New Roman" w:eastAsia="Times New Roman" w:hAnsi="Times New Roman"/>
-                <w:b w:val="false"/>
-                <w:bCs w:val="false"/>
-                <w:color w:val="58595B"/>
-                <w:sz w:val="19"/>
-                <w:szCs w:val="19"/>
-              </w:rPr>
-              <w:t xml:space="preserve">FR-LLM-03</w:t>
-            </w:r>
-          </w:p>
-        </w:tc>
-        <w:tc>
-          <w:tcPr>
-            <w:tcW w:type="dxa" w:w="8246"/>
-            <w:tcBorders>
-              <w:top w:val="single" w:color="E3E3E4" w:sz="2"/>
-              <w:left w:val="single" w:color="E3E3E4" w:sz="2"/>
-              <w:bottom w:val="single" w:color="E3E3E4" w:sz="2"/>
-              <w:right w:val="single" w:color="E3E3E4" w:sz="2"/>
-            </w:tcBorders>
-            <w:shd w:fill="FFFFFF" w:val="clear"/>
-            <w:tcMar>
-              <w:top w:type="dxa" w:w="80"/>
-              <w:left w:type="dxa" w:w="100"/>
-              <w:bottom w:type="dxa" w:w="80"/>
-              <w:right w:type="dxa" w:w="100"/>
-            </w:tcMar>
-            <w:vAlign w:val="center"/>
-          </w:tcPr>
-          <w:p>
-            <w:r>
-              <w:rPr>
-                <w:rFonts w:ascii="Times New Roman" w:cs="Times New Roman" w:eastAsia="Times New Roman" w:hAnsi="Times New Roman"/>
-                <w:b w:val="false"/>
-                <w:bCs w:val="false"/>
-                <w:color w:val="58595B"/>
-                <w:sz w:val="19"/>
-                <w:szCs w:val="19"/>
-              </w:rPr>
-              <w:t xml:space="preserve">The system shall offer illustrative example model names for the selected provider as input suggestions (not an enforced list), reflecting that provider model catalogs change frequently.</w:t>
-            </w:r>
-          </w:p>
-        </w:tc>
-      </w:tr>
-      <w:tr>
-        <w:tc>
-          <w:tcPr>
-            <w:tcW w:type="dxa" w:w="1500"/>
-            <w:tcBorders>
-              <w:top w:val="single" w:color="E3E3E4" w:sz="2"/>
-              <w:left w:val="single" w:color="E3E3E4" w:sz="2"/>
-              <w:bottom w:val="single" w:color="E3E3E4" w:sz="2"/>
-              <w:right w:val="single" w:color="E3E3E4" w:sz="2"/>
-            </w:tcBorders>
-            <w:shd w:fill="F2F2F3" w:val="clear"/>
-            <w:tcMar>
-              <w:top w:type="dxa" w:w="80"/>
-              <w:left w:type="dxa" w:w="100"/>
-              <w:bottom w:type="dxa" w:w="80"/>
-              <w:right w:type="dxa" w:w="100"/>
-            </w:tcMar>
-            <w:vAlign w:val="center"/>
-          </w:tcPr>
-          <w:p>
-            <w:r>
-              <w:rPr>
-                <w:rFonts w:ascii="Times New Roman" w:cs="Times New Roman" w:eastAsia="Times New Roman" w:hAnsi="Times New Roman"/>
-                <w:b w:val="false"/>
-                <w:bCs w:val="false"/>
-                <w:color w:val="58595B"/>
-                <w:sz w:val="19"/>
-                <w:szCs w:val="19"/>
-              </w:rPr>
-              <w:t xml:space="preserve">FR-LLM-04</w:t>
-            </w:r>
-          </w:p>
-        </w:tc>
-        <w:tc>
-          <w:tcPr>
-            <w:tcW w:type="dxa" w:w="8246"/>
-            <w:tcBorders>
-              <w:top w:val="single" w:color="E3E3E4" w:sz="2"/>
-              <w:left w:val="single" w:color="E3E3E4" w:sz="2"/>
-              <w:bottom w:val="single" w:color="E3E3E4" w:sz="2"/>
-              <w:right w:val="single" w:color="E3E3E4" w:sz="2"/>
-            </w:tcBorders>
-            <w:shd w:fill="F2F2F3" w:val="clear"/>
-            <w:tcMar>
-              <w:top w:type="dxa" w:w="80"/>
-              <w:left w:type="dxa" w:w="100"/>
-              <w:bottom w:type="dxa" w:w="80"/>
-              <w:right w:type="dxa" w:w="100"/>
-            </w:tcMar>
-            <w:vAlign w:val="center"/>
-          </w:tcPr>
-          <w:p>
-            <w:r>
-              <w:rPr>
-                <w:rFonts w:ascii="Times New Roman" w:cs="Times New Roman" w:eastAsia="Times New Roman" w:hAnsi="Times New Roman"/>
-                <w:b w:val="false"/>
-                <w:bCs w:val="false"/>
-                <w:color w:val="58595B"/>
-                <w:sz w:val="19"/>
-                <w:szCs w:val="19"/>
-              </w:rPr>
-              <w:t xml:space="preserve">The system shall capture, per configuration, a free-text model identifier, an endpoint URL (required for providers whose provider metadata flags needsEndpoint), an API key, and an enabled/disabled toggle.</w:t>
-            </w:r>
-          </w:p>
-        </w:tc>
-      </w:tr>
-      <w:tr>
-        <w:tc>
-          <w:tcPr>
-            <w:tcW w:type="dxa" w:w="1500"/>
-            <w:tcBorders>
-              <w:top w:val="single" w:color="E3E3E4" w:sz="2"/>
-              <w:left w:val="single" w:color="E3E3E4" w:sz="2"/>
-              <w:bottom w:val="single" w:color="E3E3E4" w:sz="2"/>
-              <w:right w:val="single" w:color="E3E3E4" w:sz="2"/>
-            </w:tcBorders>
-            <w:shd w:fill="FFFFFF" w:val="clear"/>
-            <w:tcMar>
-              <w:top w:type="dxa" w:w="80"/>
-              <w:left w:type="dxa" w:w="100"/>
-              <w:bottom w:type="dxa" w:w="80"/>
-              <w:right w:type="dxa" w:w="100"/>
-            </w:tcMar>
-            <w:vAlign w:val="center"/>
-          </w:tcPr>
-          <w:p>
-            <w:r>
-              <w:rPr>
-                <w:rFonts w:ascii="Times New Roman" w:cs="Times New Roman" w:eastAsia="Times New Roman" w:hAnsi="Times New Roman"/>
-                <w:b w:val="false"/>
-                <w:bCs w:val="false"/>
-                <w:color w:val="58595B"/>
-                <w:sz w:val="19"/>
-                <w:szCs w:val="19"/>
-              </w:rPr>
-              <w:t xml:space="preserve">FR-LLM-05</w:t>
-            </w:r>
-          </w:p>
-        </w:tc>
-        <w:tc>
-          <w:tcPr>
-            <w:tcW w:type="dxa" w:w="8246"/>
-            <w:tcBorders>
-              <w:top w:val="single" w:color="E3E3E4" w:sz="2"/>
-              <w:left w:val="single" w:color="E3E3E4" w:sz="2"/>
-              <w:bottom w:val="single" w:color="E3E3E4" w:sz="2"/>
-              <w:right w:val="single" w:color="E3E3E4" w:sz="2"/>
-            </w:tcBorders>
-            <w:shd w:fill="FFFFFF" w:val="clear"/>
-            <w:tcMar>
-              <w:top w:type="dxa" w:w="80"/>
-              <w:left w:type="dxa" w:w="100"/>
-              <w:bottom w:type="dxa" w:w="80"/>
-              <w:right w:type="dxa" w:w="100"/>
-            </w:tcMar>
-            <w:vAlign w:val="center"/>
-          </w:tcPr>
-          <w:p>
-            <w:r>
-              <w:rPr>
-                <w:rFonts w:ascii="Times New Roman" w:cs="Times New Roman" w:eastAsia="Times New Roman" w:hAnsi="Times New Roman"/>
-                <w:b w:val="false"/>
-                <w:bCs w:val="false"/>
-                <w:color w:val="58595B"/>
-                <w:sz w:val="19"/>
-                <w:szCs w:val="19"/>
-              </w:rPr>
-              <w:t xml:space="preserve">The system shall never return a previously stored API key in any API response; a read of the configuration shall expose only a boolean has_api_key flag and, when set, the key's last four characters.</w:t>
-            </w:r>
-          </w:p>
-        </w:tc>
-      </w:tr>
-      <w:tr>
-        <w:tc>
-          <w:tcPr>
-            <w:tcW w:type="dxa" w:w="1500"/>
-            <w:tcBorders>
-              <w:top w:val="single" w:color="E3E3E4" w:sz="2"/>
-              <w:left w:val="single" w:color="E3E3E4" w:sz="2"/>
-              <w:bottom w:val="single" w:color="E3E3E4" w:sz="2"/>
-              <w:right w:val="single" w:color="E3E3E4" w:sz="2"/>
-            </w:tcBorders>
-            <w:shd w:fill="F2F2F3" w:val="clear"/>
-            <w:tcMar>
-              <w:top w:type="dxa" w:w="80"/>
-              <w:left w:type="dxa" w:w="100"/>
-              <w:bottom w:type="dxa" w:w="80"/>
-              <w:right w:type="dxa" w:w="100"/>
-            </w:tcMar>
-            <w:vAlign w:val="center"/>
-          </w:tcPr>
-          <w:p>
-            <w:r>
-              <w:rPr>
-                <w:rFonts w:ascii="Times New Roman" w:cs="Times New Roman" w:eastAsia="Times New Roman" w:hAnsi="Times New Roman"/>
-                <w:b w:val="false"/>
-                <w:bCs w:val="false"/>
-                <w:color w:val="58595B"/>
-                <w:sz w:val="19"/>
-                <w:szCs w:val="19"/>
-              </w:rPr>
-              <w:t xml:space="preserve">FR-LLM-06</w:t>
-            </w:r>
-          </w:p>
-        </w:tc>
-        <w:tc>
-          <w:tcPr>
-            <w:tcW w:type="dxa" w:w="8246"/>
-            <w:tcBorders>
-              <w:top w:val="single" w:color="E3E3E4" w:sz="2"/>
-              <w:left w:val="single" w:color="E3E3E4" w:sz="2"/>
-              <w:bottom w:val="single" w:color="E3E3E4" w:sz="2"/>
-              <w:right w:val="single" w:color="E3E3E4" w:sz="2"/>
-            </w:tcBorders>
-            <w:shd w:fill="F2F2F3" w:val="clear"/>
-            <w:tcMar>
-              <w:top w:type="dxa" w:w="80"/>
-              <w:left w:type="dxa" w:w="100"/>
-              <w:bottom w:type="dxa" w:w="80"/>
-              <w:right w:type="dxa" w:w="100"/>
-            </w:tcMar>
-            <w:vAlign w:val="center"/>
-          </w:tcPr>
-          <w:p>
-            <w:r>
-              <w:rPr>
-                <w:rFonts w:ascii="Times New Roman" w:cs="Times New Roman" w:eastAsia="Times New Roman" w:hAnsi="Times New Roman"/>
-                <w:b w:val="false"/>
-                <w:bCs w:val="false"/>
-                <w:color w:val="58595B"/>
-                <w:sz w:val="19"/>
-                <w:szCs w:val="19"/>
-              </w:rPr>
-              <w:t xml:space="preserve">The system shall allow an authorized user to clear a stored API key independent of updating any other field.</w:t>
-            </w:r>
-          </w:p>
-        </w:tc>
-      </w:tr>
-      <w:tr>
-        <w:tc>
-          <w:tcPr>
-            <w:tcW w:type="dxa" w:w="1500"/>
-            <w:tcBorders>
-              <w:top w:val="single" w:color="E3E3E4" w:sz="2"/>
-              <w:left w:val="single" w:color="E3E3E4" w:sz="2"/>
-              <w:bottom w:val="single" w:color="E3E3E4" w:sz="2"/>
-              <w:right w:val="single" w:color="E3E3E4" w:sz="2"/>
-            </w:tcBorders>
-            <w:shd w:fill="FFFFFF" w:val="clear"/>
-            <w:tcMar>
-              <w:top w:type="dxa" w:w="80"/>
-              <w:left w:type="dxa" w:w="100"/>
-              <w:bottom w:type="dxa" w:w="80"/>
-              <w:right w:type="dxa" w:w="100"/>
-            </w:tcMar>
-            <w:vAlign w:val="center"/>
-          </w:tcPr>
-          <w:p>
-            <w:r>
-              <w:rPr>
-                <w:rFonts w:ascii="Times New Roman" w:cs="Times New Roman" w:eastAsia="Times New Roman" w:hAnsi="Times New Roman"/>
-                <w:b w:val="false"/>
-                <w:bCs w:val="false"/>
-                <w:color w:val="58595B"/>
-                <w:sz w:val="19"/>
-                <w:szCs w:val="19"/>
-              </w:rPr>
-              <w:t xml:space="preserve">FR-LLM-07</w:t>
-            </w:r>
-          </w:p>
-        </w:tc>
-        <w:tc>
-          <w:tcPr>
-            <w:tcW w:type="dxa" w:w="8246"/>
-            <w:tcBorders>
-              <w:top w:val="single" w:color="E3E3E4" w:sz="2"/>
-              <w:left w:val="single" w:color="E3E3E4" w:sz="2"/>
-              <w:bottom w:val="single" w:color="E3E3E4" w:sz="2"/>
-              <w:right w:val="single" w:color="E3E3E4" w:sz="2"/>
-            </w:tcBorders>
-            <w:shd w:fill="FFFFFF" w:val="clear"/>
-            <w:tcMar>
-              <w:top w:type="dxa" w:w="80"/>
-              <w:left w:type="dxa" w:w="100"/>
-              <w:bottom w:type="dxa" w:w="80"/>
-              <w:right w:type="dxa" w:w="100"/>
-            </w:tcMar>
-            <w:vAlign w:val="center"/>
-          </w:tcPr>
-          <w:p>
-            <w:r>
-              <w:rPr>
-                <w:rFonts w:ascii="Times New Roman" w:cs="Times New Roman" w:eastAsia="Times New Roman" w:hAnsi="Times New Roman"/>
-                <w:b w:val="false"/>
-                <w:bCs w:val="false"/>
-                <w:color w:val="58595B"/>
-                <w:sz w:val="19"/>
-                <w:szCs w:val="19"/>
-              </w:rPr>
-              <w:t xml:space="preserve">The system shall restrict viewing the LLM configuration to users holding llmConfig.view and restrict editing it to users holding llmConfig.manage.</w:t>
-            </w:r>
-          </w:p>
-        </w:tc>
-      </w:tr>
-      <w:tr>
-        <w:tc>
-          <w:tcPr>
-            <w:tcW w:type="dxa" w:w="1500"/>
-            <w:tcBorders>
-              <w:top w:val="single" w:color="E3E3E4" w:sz="2"/>
-              <w:left w:val="single" w:color="E3E3E4" w:sz="2"/>
-              <w:bottom w:val="single" w:color="E3E3E4" w:sz="2"/>
-              <w:right w:val="single" w:color="E3E3E4" w:sz="2"/>
-            </w:tcBorders>
-            <w:shd w:fill="F2F2F3" w:val="clear"/>
-            <w:tcMar>
-              <w:top w:type="dxa" w:w="80"/>
-              <w:left w:type="dxa" w:w="100"/>
-              <w:bottom w:type="dxa" w:w="80"/>
-              <w:right w:type="dxa" w:w="100"/>
-            </w:tcMar>
-            <w:vAlign w:val="center"/>
-          </w:tcPr>
-          <w:p>
-            <w:r>
-              <w:rPr>
-                <w:rFonts w:ascii="Times New Roman" w:cs="Times New Roman" w:eastAsia="Times New Roman" w:hAnsi="Times New Roman"/>
-                <w:b w:val="false"/>
-                <w:bCs w:val="false"/>
-                <w:color w:val="58595B"/>
-                <w:sz w:val="19"/>
-                <w:szCs w:val="19"/>
-              </w:rPr>
-              <w:t xml:space="preserve">FR-LLM-08</w:t>
-            </w:r>
-          </w:p>
-        </w:tc>
-        <w:tc>
-          <w:tcPr>
-            <w:tcW w:type="dxa" w:w="8246"/>
-            <w:tcBorders>
-              <w:top w:val="single" w:color="E3E3E4" w:sz="2"/>
-              <w:left w:val="single" w:color="E3E3E4" w:sz="2"/>
-              <w:bottom w:val="single" w:color="E3E3E4" w:sz="2"/>
-              <w:right w:val="single" w:color="E3E3E4" w:sz="2"/>
-            </w:tcBorders>
-            <w:shd w:fill="F2F2F3" w:val="clear"/>
-            <w:tcMar>
-              <w:top w:type="dxa" w:w="80"/>
-              <w:left w:type="dxa" w:w="100"/>
-              <w:bottom w:type="dxa" w:w="80"/>
-              <w:right w:type="dxa" w:w="100"/>
-            </w:tcMar>
-            <w:vAlign w:val="center"/>
-          </w:tcPr>
-          <w:p>
-            <w:r>
-              <w:rPr>
-                <w:rFonts w:ascii="Times New Roman" w:cs="Times New Roman" w:eastAsia="Times New Roman" w:hAnsi="Times New Roman"/>
-                <w:b w:val="false"/>
-                <w:bCs w:val="false"/>
-                <w:color w:val="58595B"/>
-                <w:sz w:val="19"/>
-                <w:szCs w:val="19"/>
-              </w:rPr>
-              <w:t xml:space="preserve">The system shall write an audit log entry for every change to the LLM configuration, with the API key redacted in both the before and after snapshots.</w:t>
-            </w:r>
-          </w:p>
-        </w:tc>
-      </w:tr>
-    </w:tbl>
-    <w:p>
-      <w:pPr>
-        <w:spacing w:after="120"/>
-      </w:pPr>
-    </w:p>
-    <w:p>
-      <w:pPr>
-        <w:pStyle w:val="Heading2"/>
-        <w:spacing w:after="140" w:before="300"/>
-      </w:pPr>
-      <w:r>
-        <w:rPr>
-          <w:rFonts w:ascii="Times New Roman" w:cs="Times New Roman" w:eastAsia="Times New Roman" w:hAnsi="Times New Roman"/>
-          <w:b/>
-          <w:bCs/>
-          <w:color w:val="3A3A3C"/>
-          <w:sz w:val="27"/>
-          <w:szCs w:val="27"/>
-        </w:rPr>
-        <w:t xml:space="preserve">3.24 AI Assistant (Data Query &amp; Application Help)</w:t>
-      </w:r>
-    </w:p>
-    <w:p>
-      <w:pPr>
-        <w:spacing w:after="200" w:before="60"/>
-      </w:pPr>
-      <w:r>
-        <w:rPr>
-          <w:rFonts w:ascii="Times New Roman" w:cs="Times New Roman" w:eastAsia="Times New Roman" w:hAnsi="Times New Roman"/>
-          <w:i/>
-          <w:iCs/>
-          <w:color w:val="58595B"/>
-          <w:sz w:val="19"/>
-          <w:szCs w:val="19"/>
-        </w:rPr>
-        <w:t xml:space="preserve">A chat-style Q&amp;A screen, open to every authenticated user (assistant.view is granted to all 9 standard roles), offering two independent, rule-based agents: a permission-scoped data query agent, and an application-help query agent grounded in a static FAQ knowledge base. Neither mode requires an AI Use Case to be activated, and neither places a live call to an external LLM.</w:t>
+        <w:t xml:space="preserve">A chat-style Q&amp;A screen, open to every authenticated user (assistant.view is granted to all 9 standard roles), offering two independent, rule-based agents: a permission-scoped data query agent, and an application-help query agent grounded in a static FAQ knowledge base. Both modes are cataloged in the AI Use Case Library (section 3.11) at Production/Assistive, but neither requires an AI Use Case to be activated to run, and neither places a live call to an external LLM — the safer deterministic/RAG path is used by design, since a live model risks asserting a number or fact not present in the tenant's own data.</w:t>
       </w:r>
     </w:p>
     <w:tbl>
@@ -18165,7 +18305,7 @@
                 <w:sz w:val="19"/>
                 <w:szCs w:val="19"/>
               </w:rPr>
-              <w:t xml:space="preserve">AI Use Cases Library (list)</w:t>
+              <w:t xml:space="preserve">AI Use Case Library (list)</w:t>
             </w:r>
           </w:p>
         </w:tc>
@@ -18197,7 +18337,7 @@
                 <w:sz w:val="19"/>
                 <w:szCs w:val="19"/>
               </w:rPr>
-              <w:t xml:space="preserve">Card grid of AI use cases with maturity/status badges and an Active/Inactive toggle.</w:t>
+              <w:t xml:space="preserve">Card grid of 14 AI use cases with tier/maturity/status badges, an Organization Active/Inactive toggle per card, and the browser-local Real LLM Provider Connection panel.</w:t>
             </w:r>
           </w:p>
         </w:tc>
@@ -18263,7 +18403,7 @@
                 <w:sz w:val="19"/>
                 <w:szCs w:val="19"/>
               </w:rPr>
-              <w:t xml:space="preserve">Metadata editor, current-version labeled-section editor, version history with revert.</w:t>
+              <w:t xml:space="preserve">Metadata editor (tier, module, trigger, output, human checkpoint), current-version labeled-section editor, version history with revert, Organization activation card, per-Project override list, and the AI Usage Log.</w:t>
             </w:r>
           </w:p>
         </w:tc>
@@ -18759,7 +18899,7 @@
                 <w:sz w:val="19"/>
                 <w:szCs w:val="19"/>
               </w:rPr>
-              <w:t xml:space="preserve">LLM Configuration</w:t>
+              <w:t xml:space="preserve">Reports</w:t>
             </w:r>
           </w:p>
         </w:tc>
@@ -18791,7 +18931,7 @@
                 <w:sz w:val="19"/>
                 <w:szCs w:val="19"/>
               </w:rPr>
-              <w:t xml:space="preserve">Provider dropdown (10 predefined providers), model, endpoint, API key (write-only), and enabled toggle.</w:t>
+              <w:t xml:space="preserve">4 standard reports in a tabbed view.</w:t>
             </w:r>
           </w:p>
         </w:tc>
@@ -18825,7 +18965,7 @@
                 <w:sz w:val="19"/>
                 <w:szCs w:val="19"/>
               </w:rPr>
-              <w:t xml:space="preserve">Reports</w:t>
+              <w:t xml:space="preserve">Alerts</w:t>
             </w:r>
           </w:p>
         </w:tc>
@@ -18857,7 +18997,7 @@
                 <w:sz w:val="19"/>
                 <w:szCs w:val="19"/>
               </w:rPr>
-              <w:t xml:space="preserve">4 standard reports in a tabbed view.</w:t>
+              <w:t xml:space="preserve">Alert inbox with manual "Run Monitoring Agent" trigger.</w:t>
             </w:r>
           </w:p>
         </w:tc>
@@ -18891,7 +19031,7 @@
                 <w:sz w:val="19"/>
                 <w:szCs w:val="19"/>
               </w:rPr>
-              <w:t xml:space="preserve">Alerts</w:t>
+              <w:t xml:space="preserve">Hierarchy</w:t>
             </w:r>
           </w:p>
         </w:tc>
@@ -18923,7 +19063,7 @@
                 <w:sz w:val="19"/>
                 <w:szCs w:val="19"/>
               </w:rPr>
-              <w:t xml:space="preserve">Alert inbox with manual "Run Monitoring Agent" trigger.</w:t>
+              <w:t xml:space="preserve">Group / Organization / Project management.</w:t>
             </w:r>
           </w:p>
         </w:tc>
@@ -18957,7 +19097,7 @@
                 <w:sz w:val="19"/>
                 <w:szCs w:val="19"/>
               </w:rPr>
-              <w:t xml:space="preserve">Hierarchy</w:t>
+              <w:t xml:space="preserve">Organizational Breakdown (OBS)</w:t>
             </w:r>
           </w:p>
         </w:tc>
@@ -18989,7 +19129,7 @@
                 <w:sz w:val="19"/>
                 <w:szCs w:val="19"/>
               </w:rPr>
-              <w:t xml:space="preserve">Group / Organization / Project management.</w:t>
+              <w:t xml:space="preserve">Site/department/service/team tree management, with live linked-item counts per node.</w:t>
             </w:r>
           </w:p>
         </w:tc>
@@ -19023,7 +19163,7 @@
                 <w:sz w:val="19"/>
                 <w:szCs w:val="19"/>
               </w:rPr>
-              <w:t xml:space="preserve">Organizational Breakdown (OBS)</w:t>
+              <w:t xml:space="preserve">Users &amp; Scope</w:t>
             </w:r>
           </w:p>
         </w:tc>
@@ -19055,7 +19195,7 @@
                 <w:sz w:val="19"/>
                 <w:szCs w:val="19"/>
               </w:rPr>
-              <w:t xml:space="preserve">Site/department/service/team tree management, with live linked-item counts per node.</w:t>
+              <w:t xml:space="preserve">User directory and role assignment, scoped to an OBS node.</w:t>
             </w:r>
           </w:p>
         </w:tc>
@@ -19089,7 +19229,7 @@
                 <w:sz w:val="19"/>
                 <w:szCs w:val="19"/>
               </w:rPr>
-              <w:t xml:space="preserve">Users &amp; Scope</w:t>
+              <w:t xml:space="preserve">Permission Matrix</w:t>
             </w:r>
           </w:p>
         </w:tc>
@@ -19121,7 +19261,7 @@
                 <w:sz w:val="19"/>
                 <w:szCs w:val="19"/>
               </w:rPr>
-              <w:t xml:space="preserve">User directory and role assignment, scoped to an OBS node.</w:t>
+              <w:t xml:space="preserve">Full role x permission grid editor.</w:t>
             </w:r>
           </w:p>
         </w:tc>
@@ -19155,7 +19295,7 @@
                 <w:sz w:val="19"/>
                 <w:szCs w:val="19"/>
               </w:rPr>
-              <w:t xml:space="preserve">Permission Matrix</w:t>
+              <w:t xml:space="preserve">Governance Settings</w:t>
             </w:r>
           </w:p>
         </w:tc>
@@ -19187,7 +19327,7 @@
                 <w:sz w:val="19"/>
                 <w:szCs w:val="19"/>
               </w:rPr>
-              <w:t xml:space="preserve">Full role x permission grid editor.</w:t>
+              <w:t xml:space="preserve">KPI thresholds, alert toggles, RCA default, REX policy.</w:t>
             </w:r>
           </w:p>
         </w:tc>
@@ -19221,7 +19361,7 @@
                 <w:sz w:val="19"/>
                 <w:szCs w:val="19"/>
               </w:rPr>
-              <w:t xml:space="preserve">Governance Settings</w:t>
+              <w:t xml:space="preserve">License &amp; Plan</w:t>
             </w:r>
           </w:p>
         </w:tc>
@@ -19253,7 +19393,7 @@
                 <w:sz w:val="19"/>
                 <w:szCs w:val="19"/>
               </w:rPr>
-              <w:t xml:space="preserve">KPI thresholds, alert toggles, RCA default, REX policy.</w:t>
+              <w:t xml:space="preserve">Plan tier, deployment model, seats, billing.</w:t>
             </w:r>
           </w:p>
         </w:tc>
@@ -19287,7 +19427,7 @@
                 <w:sz w:val="19"/>
                 <w:szCs w:val="19"/>
               </w:rPr>
-              <w:t xml:space="preserve">License &amp; Plan</w:t>
+              <w:t xml:space="preserve">Help</w:t>
             </w:r>
           </w:p>
         </w:tc>
@@ -19301,72 +19441,6 @@
               <w:right w:val="single" w:color="E3E3E4" w:sz="2"/>
             </w:tcBorders>
             <w:shd w:fill="F2F2F3" w:val="clear"/>
-            <w:tcMar>
-              <w:top w:type="dxa" w:w="80"/>
-              <w:left w:type="dxa" w:w="100"/>
-              <w:bottom w:type="dxa" w:w="80"/>
-              <w:right w:type="dxa" w:w="100"/>
-            </w:tcMar>
-            <w:vAlign w:val="center"/>
-          </w:tcPr>
-          <w:p>
-            <w:r>
-              <w:rPr>
-                <w:rFonts w:ascii="Times New Roman" w:cs="Times New Roman" w:eastAsia="Times New Roman" w:hAnsi="Times New Roman"/>
-                <w:b w:val="false"/>
-                <w:bCs w:val="false"/>
-                <w:color w:val="58595B"/>
-                <w:sz w:val="19"/>
-                <w:szCs w:val="19"/>
-              </w:rPr>
-              <w:t xml:space="preserve">Plan tier, deployment model, seats, billing.</w:t>
-            </w:r>
-          </w:p>
-        </w:tc>
-      </w:tr>
-      <w:tr>
-        <w:tc>
-          <w:tcPr>
-            <w:tcW w:type="dxa" w:w="2600"/>
-            <w:tcBorders>
-              <w:top w:val="single" w:color="E3E3E4" w:sz="2"/>
-              <w:left w:val="single" w:color="E3E3E4" w:sz="2"/>
-              <w:bottom w:val="single" w:color="E3E3E4" w:sz="2"/>
-              <w:right w:val="single" w:color="E3E3E4" w:sz="2"/>
-            </w:tcBorders>
-            <w:shd w:fill="FFFFFF" w:val="clear"/>
-            <w:tcMar>
-              <w:top w:type="dxa" w:w="80"/>
-              <w:left w:type="dxa" w:w="100"/>
-              <w:bottom w:type="dxa" w:w="80"/>
-              <w:right w:type="dxa" w:w="100"/>
-            </w:tcMar>
-            <w:vAlign w:val="center"/>
-          </w:tcPr>
-          <w:p>
-            <w:r>
-              <w:rPr>
-                <w:rFonts w:ascii="Times New Roman" w:cs="Times New Roman" w:eastAsia="Times New Roman" w:hAnsi="Times New Roman"/>
-                <w:b w:val="false"/>
-                <w:bCs w:val="false"/>
-                <w:color w:val="58595B"/>
-                <w:sz w:val="19"/>
-                <w:szCs w:val="19"/>
-              </w:rPr>
-              <w:t xml:space="preserve">Help</w:t>
-            </w:r>
-          </w:p>
-        </w:tc>
-        <w:tc>
-          <w:tcPr>
-            <w:tcW w:type="dxa" w:w="7146"/>
-            <w:tcBorders>
-              <w:top w:val="single" w:color="E3E3E4" w:sz="2"/>
-              <w:left w:val="single" w:color="E3E3E4" w:sz="2"/>
-              <w:bottom w:val="single" w:color="E3E3E4" w:sz="2"/>
-              <w:right w:val="single" w:color="E3E3E4" w:sz="2"/>
-            </w:tcBorders>
-            <w:shd w:fill="FFFFFF" w:val="clear"/>
             <w:tcMar>
               <w:top w:type="dxa" w:w="80"/>
               <w:left w:type="dxa" w:w="100"/>
@@ -20432,7 +20506,7 @@
                 <w:sz w:val="19"/>
                 <w:szCs w:val="19"/>
               </w:rPr>
-              <w:t xml:space="preserve">GET|POST /api/ai-use-cases, GET|PUT|DELETE /api/ai-use-cases/:id, GET|POST /api/ai-use-cases/:id/versions, GET /api/ai-use-cases/:id/versions/:versionId, POST /api/ai-use-cases/:id/versions/:versionId/revert</w:t>
+              <w:t xml:space="preserve">GET|POST /api/ai-use-cases, GET|PUT|DELETE /api/ai-use-cases/:id, GET /api/ai-use-cases/providers, PUT /api/ai-use-cases/:id/activation, PUT /api/ai-use-cases/:id/project-override/:projectId, GET|POST /api/ai-use-cases/:id/versions, GET /api/ai-use-cases/:id/versions/:versionId, POST /api/ai-use-cases/:id/versions/:versionId/revert</w:t>
             </w:r>
           </w:p>
         </w:tc>
@@ -20466,6 +20540,72 @@
                 <w:sz w:val="19"/>
                 <w:szCs w:val="19"/>
               </w:rPr>
+              <w:t xml:space="preserve">AI Usage Log</w:t>
+            </w:r>
+          </w:p>
+        </w:tc>
+        <w:tc>
+          <w:tcPr>
+            <w:tcW w:type="dxa" w:w="7746"/>
+            <w:tcBorders>
+              <w:top w:val="single" w:color="E3E3E4" w:sz="2"/>
+              <w:left w:val="single" w:color="E3E3E4" w:sz="2"/>
+              <w:bottom w:val="single" w:color="E3E3E4" w:sz="2"/>
+              <w:right w:val="single" w:color="E3E3E4" w:sz="2"/>
+            </w:tcBorders>
+            <w:shd w:fill="FFFFFF" w:val="clear"/>
+            <w:tcMar>
+              <w:top w:type="dxa" w:w="80"/>
+              <w:left w:type="dxa" w:w="100"/>
+              <w:bottom w:type="dxa" w:w="80"/>
+              <w:right w:type="dxa" w:w="100"/>
+            </w:tcMar>
+            <w:vAlign w:val="center"/>
+          </w:tcPr>
+          <w:p>
+            <w:r>
+              <w:rPr>
+                <w:rFonts w:ascii="Times New Roman" w:cs="Times New Roman" w:eastAsia="Times New Roman" w:hAnsi="Times New Roman"/>
+                <w:b w:val="false"/>
+                <w:bCs w:val="false"/>
+                <w:color w:val="58595B"/>
+                <w:sz w:val="19"/>
+                <w:szCs w:val="19"/>
+              </w:rPr>
+              <w:t xml:space="preserve">GET /api/ai-usage-log (optional ?useCaseId=), POST /api/ai-usage-log — append-only, no PUT/PATCH/DELETE route exists</w:t>
+            </w:r>
+          </w:p>
+        </w:tc>
+      </w:tr>
+      <w:tr>
+        <w:tc>
+          <w:tcPr>
+            <w:tcW w:type="dxa" w:w="2000"/>
+            <w:tcBorders>
+              <w:top w:val="single" w:color="E3E3E4" w:sz="2"/>
+              <w:left w:val="single" w:color="E3E3E4" w:sz="2"/>
+              <w:bottom w:val="single" w:color="E3E3E4" w:sz="2"/>
+              <w:right w:val="single" w:color="E3E3E4" w:sz="2"/>
+            </w:tcBorders>
+            <w:shd w:fill="F2F2F3" w:val="clear"/>
+            <w:tcMar>
+              <w:top w:type="dxa" w:w="80"/>
+              <w:left w:type="dxa" w:w="100"/>
+              <w:bottom w:type="dxa" w:w="80"/>
+              <w:right w:type="dxa" w:w="100"/>
+            </w:tcMar>
+            <w:vAlign w:val="center"/>
+          </w:tcPr>
+          <w:p>
+            <w:r>
+              <w:rPr>
+                <w:rFonts w:ascii="Times New Roman" w:cs="Times New Roman" w:eastAsia="Times New Roman" w:hAnsi="Times New Roman"/>
+                <w:b w:val="false"/>
+                <w:bCs w:val="false"/>
+                <w:color w:val="58595B"/>
+                <w:sz w:val="19"/>
+                <w:szCs w:val="19"/>
+              </w:rPr>
               <w:t xml:space="preserve">Business Rules</w:t>
             </w:r>
           </w:p>
@@ -20479,7 +20619,7 @@
               <w:bottom w:val="single" w:color="E3E3E4" w:sz="2"/>
               <w:right w:val="single" w:color="E3E3E4" w:sz="2"/>
             </w:tcBorders>
-            <w:shd w:fill="FFFFFF" w:val="clear"/>
+            <w:shd w:fill="F2F2F3" w:val="clear"/>
             <w:tcMar>
               <w:top w:type="dxa" w:w="80"/>
               <w:left w:type="dxa" w:w="100"/>
@@ -20513,7 +20653,7 @@
               <w:bottom w:val="single" w:color="E3E3E4" w:sz="2"/>
               <w:right w:val="single" w:color="E3E3E4" w:sz="2"/>
             </w:tcBorders>
-            <w:shd w:fill="F2F2F3" w:val="clear"/>
+            <w:shd w:fill="FFFFFF" w:val="clear"/>
             <w:tcMar>
               <w:top w:type="dxa" w:w="80"/>
               <w:left w:type="dxa" w:w="100"/>
@@ -20545,7 +20685,7 @@
               <w:bottom w:val="single" w:color="E3E3E4" w:sz="2"/>
               <w:right w:val="single" w:color="E3E3E4" w:sz="2"/>
             </w:tcBorders>
-            <w:shd w:fill="F2F2F3" w:val="clear"/>
+            <w:shd w:fill="FFFFFF" w:val="clear"/>
             <w:tcMar>
               <w:top w:type="dxa" w:w="80"/>
               <w:left w:type="dxa" w:w="100"/>
@@ -20579,7 +20719,7 @@
               <w:bottom w:val="single" w:color="E3E3E4" w:sz="2"/>
               <w:right w:val="single" w:color="E3E3E4" w:sz="2"/>
             </w:tcBorders>
-            <w:shd w:fill="FFFFFF" w:val="clear"/>
+            <w:shd w:fill="F2F2F3" w:val="clear"/>
             <w:tcMar>
               <w:top w:type="dxa" w:w="80"/>
               <w:left w:type="dxa" w:w="100"/>
@@ -20611,7 +20751,7 @@
               <w:bottom w:val="single" w:color="E3E3E4" w:sz="2"/>
               <w:right w:val="single" w:color="E3E3E4" w:sz="2"/>
             </w:tcBorders>
-            <w:shd w:fill="FFFFFF" w:val="clear"/>
+            <w:shd w:fill="F2F2F3" w:val="clear"/>
             <w:tcMar>
               <w:top w:type="dxa" w:w="80"/>
               <w:left w:type="dxa" w:w="100"/>
@@ -20645,7 +20785,7 @@
               <w:bottom w:val="single" w:color="E3E3E4" w:sz="2"/>
               <w:right w:val="single" w:color="E3E3E4" w:sz="2"/>
             </w:tcBorders>
-            <w:shd w:fill="F2F2F3" w:val="clear"/>
+            <w:shd w:fill="FFFFFF" w:val="clear"/>
             <w:tcMar>
               <w:top w:type="dxa" w:w="80"/>
               <w:left w:type="dxa" w:w="100"/>
@@ -20677,7 +20817,7 @@
               <w:bottom w:val="single" w:color="E3E3E4" w:sz="2"/>
               <w:right w:val="single" w:color="E3E3E4" w:sz="2"/>
             </w:tcBorders>
-            <w:shd w:fill="F2F2F3" w:val="clear"/>
+            <w:shd w:fill="FFFFFF" w:val="clear"/>
             <w:tcMar>
               <w:top w:type="dxa" w:w="80"/>
               <w:left w:type="dxa" w:w="100"/>
@@ -20711,7 +20851,7 @@
               <w:bottom w:val="single" w:color="E3E3E4" w:sz="2"/>
               <w:right w:val="single" w:color="E3E3E4" w:sz="2"/>
             </w:tcBorders>
-            <w:shd w:fill="FFFFFF" w:val="clear"/>
+            <w:shd w:fill="F2F2F3" w:val="clear"/>
             <w:tcMar>
               <w:top w:type="dxa" w:w="80"/>
               <w:left w:type="dxa" w:w="100"/>
@@ -20743,7 +20883,7 @@
               <w:bottom w:val="single" w:color="E3E3E4" w:sz="2"/>
               <w:right w:val="single" w:color="E3E3E4" w:sz="2"/>
             </w:tcBorders>
-            <w:shd w:fill="FFFFFF" w:val="clear"/>
+            <w:shd w:fill="F2F2F3" w:val="clear"/>
             <w:tcMar>
               <w:top w:type="dxa" w:w="80"/>
               <w:left w:type="dxa" w:w="100"/>
@@ -20763,72 +20903,6 @@
                 <w:szCs w:val="19"/>
               </w:rPr>
               <w:t xml:space="preserve">GET|POST /api/bpmn, GET|PUT|DELETE /api/bpmn/:id</w:t>
-            </w:r>
-          </w:p>
-        </w:tc>
-      </w:tr>
-      <w:tr>
-        <w:tc>
-          <w:tcPr>
-            <w:tcW w:type="dxa" w:w="2000"/>
-            <w:tcBorders>
-              <w:top w:val="single" w:color="E3E3E4" w:sz="2"/>
-              <w:left w:val="single" w:color="E3E3E4" w:sz="2"/>
-              <w:bottom w:val="single" w:color="E3E3E4" w:sz="2"/>
-              <w:right w:val="single" w:color="E3E3E4" w:sz="2"/>
-            </w:tcBorders>
-            <w:shd w:fill="F2F2F3" w:val="clear"/>
-            <w:tcMar>
-              <w:top w:type="dxa" w:w="80"/>
-              <w:left w:type="dxa" w:w="100"/>
-              <w:bottom w:type="dxa" w:w="80"/>
-              <w:right w:type="dxa" w:w="100"/>
-            </w:tcMar>
-            <w:vAlign w:val="center"/>
-          </w:tcPr>
-          <w:p>
-            <w:r>
-              <w:rPr>
-                <w:rFonts w:ascii="Times New Roman" w:cs="Times New Roman" w:eastAsia="Times New Roman" w:hAnsi="Times New Roman"/>
-                <w:b w:val="false"/>
-                <w:bCs w:val="false"/>
-                <w:color w:val="58595B"/>
-                <w:sz w:val="19"/>
-                <w:szCs w:val="19"/>
-              </w:rPr>
-              <w:t xml:space="preserve">LLM Configuration</w:t>
-            </w:r>
-          </w:p>
-        </w:tc>
-        <w:tc>
-          <w:tcPr>
-            <w:tcW w:type="dxa" w:w="7746"/>
-            <w:tcBorders>
-              <w:top w:val="single" w:color="E3E3E4" w:sz="2"/>
-              <w:left w:val="single" w:color="E3E3E4" w:sz="2"/>
-              <w:bottom w:val="single" w:color="E3E3E4" w:sz="2"/>
-              <w:right w:val="single" w:color="E3E3E4" w:sz="2"/>
-            </w:tcBorders>
-            <w:shd w:fill="F2F2F3" w:val="clear"/>
-            <w:tcMar>
-              <w:top w:type="dxa" w:w="80"/>
-              <w:left w:type="dxa" w:w="100"/>
-              <w:bottom w:type="dxa" w:w="80"/>
-              <w:right w:type="dxa" w:w="100"/>
-            </w:tcMar>
-            <w:vAlign w:val="center"/>
-          </w:tcPr>
-          <w:p>
-            <w:r>
-              <w:rPr>
-                <w:rFonts w:ascii="Times New Roman" w:cs="Times New Roman" w:eastAsia="Times New Roman" w:hAnsi="Times New Roman"/>
-                <w:b w:val="false"/>
-                <w:bCs w:val="false"/>
-                <w:color w:val="58595B"/>
-                <w:sz w:val="19"/>
-                <w:szCs w:val="19"/>
-              </w:rPr>
-              <w:t xml:space="preserve">GET /api/llm-config/providers, GET|PUT /api/llm-config</w:t>
             </w:r>
           </w:p>
         </w:tc>
@@ -21391,7 +21465,7 @@
           <w:sz w:val="24"/>
           <w:szCs w:val="24"/>
         </w:rPr>
-        <w:t xml:space="preserve">LLM / AI Provider APIs — Configuration implemented; live calls not yet made</w:t>
+        <w:t xml:space="preserve">LLM / AI Provider APIs — Implemented (optional, user-configured)</w:t>
       </w:r>
     </w:p>
     <w:p>
@@ -21406,7 +21480,7 @@
           <w:sz w:val="24"/>
           <w:szCs w:val="24"/>
         </w:rPr>
-        <w:t xml:space="preserve">The LLM / AI Provider Configuration module (section 3.23) is the implemented, designated integration point: an administrator can select and store credentials for any of ten common providers (Anthropic, OpenAI, Google, Azure OpenAI, AWS Bedrock, Mistral, Cohere, Meta Llama, Ollama, or a custom OpenAI-compatible endpoint). As of this version, no module places a live outbound call using that configuration — the AI Agents (3.10) and the AI Assistant (3.24) are deterministic, rule-based, and RAG-grounded, per NFR-DATA-01. NFR-MAINT-03 and NFR-MAINT-04 together specify that when a live LLM call is added, it shall read its credentials only from this module.</w:t>
+        <w:t xml:space="preserve">The AI Use Case Library's generation service (section 3.11) is the single, designated server-side integration point for a live LLM call, per NFR-MAINT-04. A user configures their own Real LLM Provider Connection entirely client-side (stored only in browser local storage, per FR-AIUC-17/18) and it is forwarded once per generation request; the server places exactly one outbound call for that request and never persists the connection (NFR-SEC-08). Five providers have a working native REST implementation in this version — Anthropic, OpenAI, Azure OpenAI, Mistral, and a self-hosted/local Ollama endpoint, plus any OpenAI-compatible Custom endpoint — while Google, AWS Bedrock, Cohere, and Meta Llama are listed in the provider catalog but not yet wired to a live call. Every AI Use Case always computes its deterministic, RAG-grounded result first (per NFR-DATA-01) and falls back to it automatically on any live-call failure, so this integration is a supplementary enhancement, never a dependency.</w:t>
       </w:r>
     </w:p>
     <w:p>
@@ -22331,7 +22405,73 @@
                 <w:sz w:val="19"/>
                 <w:szCs w:val="19"/>
               </w:rPr>
-              <w:t xml:space="preserve">A stored LLM provider API key (FR-LLM-05) shall never be included in any API response, log line, or client-side application state once saved; it shall be treated with the same never-returned discipline as a password hash.</w:t>
+              <w:t xml:space="preserve">A Real LLM Provider Connection's API key (FR-AIUC-17) shall be captured and stored only in the user's browser local storage; the backend shall never persist it to any table, write it to any log line, or return it in any API response.</w:t>
+            </w:r>
+          </w:p>
+        </w:tc>
+      </w:tr>
+      <w:tr>
+        <w:tc>
+          <w:tcPr>
+            <w:tcW w:type="dxa" w:w="1500"/>
+            <w:tcBorders>
+              <w:top w:val="single" w:color="E3E3E4" w:sz="2"/>
+              <w:left w:val="single" w:color="E3E3E4" w:sz="2"/>
+              <w:bottom w:val="single" w:color="E3E3E4" w:sz="2"/>
+              <w:right w:val="single" w:color="E3E3E4" w:sz="2"/>
+            </w:tcBorders>
+            <w:shd w:fill="F2F2F3" w:val="clear"/>
+            <w:tcMar>
+              <w:top w:type="dxa" w:w="80"/>
+              <w:left w:type="dxa" w:w="100"/>
+              <w:bottom w:type="dxa" w:w="80"/>
+              <w:right w:type="dxa" w:w="100"/>
+            </w:tcMar>
+            <w:vAlign w:val="center"/>
+          </w:tcPr>
+          <w:p>
+            <w:r>
+              <w:rPr>
+                <w:rFonts w:ascii="Times New Roman" w:cs="Times New Roman" w:eastAsia="Times New Roman" w:hAnsi="Times New Roman"/>
+                <w:b w:val="false"/>
+                <w:bCs w:val="false"/>
+                <w:color w:val="58595B"/>
+                <w:sz w:val="19"/>
+                <w:szCs w:val="19"/>
+              </w:rPr>
+              <w:t xml:space="preserve">NFR-SEC-08</w:t>
+            </w:r>
+          </w:p>
+        </w:tc>
+        <w:tc>
+          <w:tcPr>
+            <w:tcW w:type="dxa" w:w="8246"/>
+            <w:tcBorders>
+              <w:top w:val="single" w:color="E3E3E4" w:sz="2"/>
+              <w:left w:val="single" w:color="E3E3E4" w:sz="2"/>
+              <w:bottom w:val="single" w:color="E3E3E4" w:sz="2"/>
+              <w:right w:val="single" w:color="E3E3E4" w:sz="2"/>
+            </w:tcBorders>
+            <w:shd w:fill="F2F2F3" w:val="clear"/>
+            <w:tcMar>
+              <w:top w:type="dxa" w:w="80"/>
+              <w:left w:type="dxa" w:w="100"/>
+              <w:bottom w:type="dxa" w:w="80"/>
+              <w:right w:type="dxa" w:w="100"/>
+            </w:tcMar>
+            <w:vAlign w:val="center"/>
+          </w:tcPr>
+          <w:p>
+            <w:r>
+              <w:rPr>
+                <w:rFonts w:ascii="Times New Roman" w:cs="Times New Roman" w:eastAsia="Times New Roman" w:hAnsi="Times New Roman"/>
+                <w:b w:val="false"/>
+                <w:bCs w:val="false"/>
+                <w:color w:val="58595B"/>
+                <w:sz w:val="19"/>
+                <w:szCs w:val="19"/>
+              </w:rPr>
+              <w:t xml:space="preserve">When a generation request forwards a Real LLM Provider Connection, the server shall use it for exactly one outbound call to the configured provider and shall never write, log, cache, or hold it beyond that single request; an optional server-side fallback API key, if configured via environment variable, shall apply only to the AI Assistant's data-query and application-help modes (section 3.23), never to the AI Use Case Library's own generation calls, which always prefer the user's own browser-stored connection.</w:t>
             </w:r>
           </w:p>
         </w:tc>
@@ -23555,7 +23695,7 @@
                 <w:sz w:val="19"/>
                 <w:szCs w:val="19"/>
               </w:rPr>
-              <w:t xml:space="preserve">The LLM / AI Provider Configuration module (section 3.23) shall be the single designated integration point for a future live LLM call; no other module shall embed provider-specific credentials or endpoint logic.</w:t>
+              <w:t xml:space="preserve">The AI Use Case Library's generation service (section 3.11) shall be the single designated server-side integration point for a live LLM call and its provider-specific credential and endpoint logic; no other module shall embed its own LLM provider client.</w:t>
             </w:r>
           </w:p>
         </w:tc>
@@ -24035,7 +24175,7 @@
                 <w:sz w:val="19"/>
                 <w:szCs w:val="19"/>
               </w:rPr>
-              <w:t xml:space="preserve">The system shall not transmit tenant data to any third-party service by default; AI agent processing (including both AI Assistant modes) shall run entirely within the deployment's own infrastructure using only rule-based/statistical methods, not a live external LLM call.</w:t>
+              <w:t xml:space="preserve">By default, and whenever no Real LLM Provider Connection is configured, the system shall not transmit tenant data to any third-party service; every AI Use Case shall run entirely within the deployment's own infrastructure using rule-based/statistical methods and RAG grounding. Only when a user has explicitly configured and forwarded their own browser-stored Real LLM Provider Connection (FR-AIUC-17) may that single generation request be sent to that user-selected third-party provider; this is opt-in per browser, never enabled by default, and never applies to the AI Assistant's data-query mode.</w:t>
             </w:r>
           </w:p>
         </w:tc>
@@ -25684,7 +25824,7 @@
                 <w:sz w:val="19"/>
                 <w:szCs w:val="19"/>
               </w:rPr>
-              <w:t xml:space="preserve">Metadata for an AI use case (stable across versions), including its Active/Inactive flag.</w:t>
+              <w:t xml:space="preserve">Metadata for an AI use case (stable across versions): tier (Assistive/Augmented), owning module key, trigger/output/human-checkpoint descriptions, and its Organization-level Active/Inactive flag.</w:t>
             </w:r>
           </w:p>
         </w:tc>
@@ -25784,6 +25924,138 @@
                 <w:sz w:val="19"/>
                 <w:szCs w:val="19"/>
               </w:rPr>
+              <w:t xml:space="preserve">AIUseCaseProjectOverride</w:t>
+            </w:r>
+          </w:p>
+        </w:tc>
+        <w:tc>
+          <w:tcPr>
+            <w:tcW w:type="dxa" w:w="7346"/>
+            <w:tcBorders>
+              <w:top w:val="single" w:color="E3E3E4" w:sz="2"/>
+              <w:left w:val="single" w:color="E3E3E4" w:sz="2"/>
+              <w:bottom w:val="single" w:color="E3E3E4" w:sz="2"/>
+              <w:right w:val="single" w:color="E3E3E4" w:sz="2"/>
+            </w:tcBorders>
+            <w:shd w:fill="F2F2F3" w:val="clear"/>
+            <w:tcMar>
+              <w:top w:type="dxa" w:w="80"/>
+              <w:left w:type="dxa" w:w="100"/>
+              <w:bottom w:type="dxa" w:w="80"/>
+              <w:right w:type="dxa" w:w="100"/>
+            </w:tcMar>
+            <w:vAlign w:val="center"/>
+          </w:tcPr>
+          <w:p>
+            <w:r>
+              <w:rPr>
+                <w:rFonts w:ascii="Times New Roman" w:cs="Times New Roman" w:eastAsia="Times New Roman" w:hAnsi="Times New Roman"/>
+                <w:b w:val="false"/>
+                <w:bCs w:val="false"/>
+                <w:color w:val="58595B"/>
+                <w:sz w:val="19"/>
+                <w:szCs w:val="19"/>
+              </w:rPr>
+              <w:t xml:space="preserve">A per-Project, tri-state (Inherit/On/Off) activation override on an AI Use Case; deleted automatically (cascade) when its AI Use Case is deleted.</w:t>
+            </w:r>
+          </w:p>
+        </w:tc>
+      </w:tr>
+      <w:tr>
+        <w:tc>
+          <w:tcPr>
+            <w:tcW w:type="dxa" w:w="2400"/>
+            <w:tcBorders>
+              <w:top w:val="single" w:color="E3E3E4" w:sz="2"/>
+              <w:left w:val="single" w:color="E3E3E4" w:sz="2"/>
+              <w:bottom w:val="single" w:color="E3E3E4" w:sz="2"/>
+              <w:right w:val="single" w:color="E3E3E4" w:sz="2"/>
+            </w:tcBorders>
+            <w:shd w:fill="FFFFFF" w:val="clear"/>
+            <w:tcMar>
+              <w:top w:type="dxa" w:w="80"/>
+              <w:left w:type="dxa" w:w="100"/>
+              <w:bottom w:type="dxa" w:w="80"/>
+              <w:right w:type="dxa" w:w="100"/>
+            </w:tcMar>
+            <w:vAlign w:val="center"/>
+          </w:tcPr>
+          <w:p>
+            <w:r>
+              <w:rPr>
+                <w:rFonts w:ascii="Times New Roman" w:cs="Times New Roman" w:eastAsia="Times New Roman" w:hAnsi="Times New Roman"/>
+                <w:b w:val="false"/>
+                <w:bCs w:val="false"/>
+                <w:color w:val="58595B"/>
+                <w:sz w:val="19"/>
+                <w:szCs w:val="19"/>
+              </w:rPr>
+              <w:t xml:space="preserve">AIUsageLog</w:t>
+            </w:r>
+          </w:p>
+        </w:tc>
+        <w:tc>
+          <w:tcPr>
+            <w:tcW w:type="dxa" w:w="7346"/>
+            <w:tcBorders>
+              <w:top w:val="single" w:color="E3E3E4" w:sz="2"/>
+              <w:left w:val="single" w:color="E3E3E4" w:sz="2"/>
+              <w:bottom w:val="single" w:color="E3E3E4" w:sz="2"/>
+              <w:right w:val="single" w:color="E3E3E4" w:sz="2"/>
+            </w:tcBorders>
+            <w:shd w:fill="FFFFFF" w:val="clear"/>
+            <w:tcMar>
+              <w:top w:type="dxa" w:w="80"/>
+              <w:left w:type="dxa" w:w="100"/>
+              <w:bottom w:type="dxa" w:w="80"/>
+              <w:right w:type="dxa" w:w="100"/>
+            </w:tcMar>
+            <w:vAlign w:val="center"/>
+          </w:tcPr>
+          <w:p>
+            <w:r>
+              <w:rPr>
+                <w:rFonts w:ascii="Times New Roman" w:cs="Times New Roman" w:eastAsia="Times New Roman" w:hAnsi="Times New Roman"/>
+                <w:b w:val="false"/>
+                <w:bCs w:val="false"/>
+                <w:color w:val="58595B"/>
+                <w:sz w:val="19"/>
+                <w:szCs w:val="19"/>
+              </w:rPr>
+              <w:t xml:space="preserve">Append-only record of one AI suggestion outcome (Accepted/Edited/Rejected), linking the AI Use Case, Organization, Project, acting user, and an output summary; deleted automatically (cascade) when its AI Use Case is deleted.</w:t>
+            </w:r>
+          </w:p>
+        </w:tc>
+      </w:tr>
+      <w:tr>
+        <w:tc>
+          <w:tcPr>
+            <w:tcW w:type="dxa" w:w="2400"/>
+            <w:tcBorders>
+              <w:top w:val="single" w:color="E3E3E4" w:sz="2"/>
+              <w:left w:val="single" w:color="E3E3E4" w:sz="2"/>
+              <w:bottom w:val="single" w:color="E3E3E4" w:sz="2"/>
+              <w:right w:val="single" w:color="E3E3E4" w:sz="2"/>
+            </w:tcBorders>
+            <w:shd w:fill="F2F2F3" w:val="clear"/>
+            <w:tcMar>
+              <w:top w:type="dxa" w:w="80"/>
+              <w:left w:type="dxa" w:w="100"/>
+              <w:bottom w:type="dxa" w:w="80"/>
+              <w:right w:type="dxa" w:w="100"/>
+            </w:tcMar>
+            <w:vAlign w:val="center"/>
+          </w:tcPr>
+          <w:p>
+            <w:r>
+              <w:rPr>
+                <w:rFonts w:ascii="Times New Roman" w:cs="Times New Roman" w:eastAsia="Times New Roman" w:hAnsi="Times New Roman"/>
+                <w:b w:val="false"/>
+                <w:bCs w:val="false"/>
+                <w:color w:val="58595B"/>
+                <w:sz w:val="19"/>
+                <w:szCs w:val="19"/>
+              </w:rPr>
               <w:t xml:space="preserve">BusinessRule</w:t>
             </w:r>
           </w:p>
@@ -26213,72 +26485,6 @@
                 <w:szCs w:val="19"/>
               </w:rPr>
               <w:t xml:space="preserve">A stored BPMN 2.0 process diagram (code, title, description, XML payload), owned by an OBS node; rendered/edited in-browser.</w:t>
-            </w:r>
-          </w:p>
-        </w:tc>
-      </w:tr>
-      <w:tr>
-        <w:tc>
-          <w:tcPr>
-            <w:tcW w:type="dxa" w:w="2400"/>
-            <w:tcBorders>
-              <w:top w:val="single" w:color="E3E3E4" w:sz="2"/>
-              <w:left w:val="single" w:color="E3E3E4" w:sz="2"/>
-              <w:bottom w:val="single" w:color="E3E3E4" w:sz="2"/>
-              <w:right w:val="single" w:color="E3E3E4" w:sz="2"/>
-            </w:tcBorders>
-            <w:shd w:fill="FFFFFF" w:val="clear"/>
-            <w:tcMar>
-              <w:top w:type="dxa" w:w="80"/>
-              <w:left w:type="dxa" w:w="100"/>
-              <w:bottom w:type="dxa" w:w="80"/>
-              <w:right w:type="dxa" w:w="100"/>
-            </w:tcMar>
-            <w:vAlign w:val="center"/>
-          </w:tcPr>
-          <w:p>
-            <w:r>
-              <w:rPr>
-                <w:rFonts w:ascii="Times New Roman" w:cs="Times New Roman" w:eastAsia="Times New Roman" w:hAnsi="Times New Roman"/>
-                <w:b w:val="false"/>
-                <w:bCs w:val="false"/>
-                <w:color w:val="58595B"/>
-                <w:sz w:val="19"/>
-                <w:szCs w:val="19"/>
-              </w:rPr>
-              <w:t xml:space="preserve">LlmConfiguration</w:t>
-            </w:r>
-          </w:p>
-        </w:tc>
-        <w:tc>
-          <w:tcPr>
-            <w:tcW w:type="dxa" w:w="7346"/>
-            <w:tcBorders>
-              <w:top w:val="single" w:color="E3E3E4" w:sz="2"/>
-              <w:left w:val="single" w:color="E3E3E4" w:sz="2"/>
-              <w:bottom w:val="single" w:color="E3E3E4" w:sz="2"/>
-              <w:right w:val="single" w:color="E3E3E4" w:sz="2"/>
-            </w:tcBorders>
-            <w:shd w:fill="FFFFFF" w:val="clear"/>
-            <w:tcMar>
-              <w:top w:type="dxa" w:w="80"/>
-              <w:left w:type="dxa" w:w="100"/>
-              <w:bottom w:type="dxa" w:w="80"/>
-              <w:right w:type="dxa" w:w="100"/>
-            </w:tcMar>
-            <w:vAlign w:val="center"/>
-          </w:tcPr>
-          <w:p>
-            <w:r>
-              <w:rPr>
-                <w:rFonts w:ascii="Times New Roman" w:cs="Times New Roman" w:eastAsia="Times New Roman" w:hAnsi="Times New Roman"/>
-                <w:b w:val="false"/>
-                <w:bCs w:val="false"/>
-                <w:color w:val="58595B"/>
-                <w:sz w:val="19"/>
-                <w:szCs w:val="19"/>
-              </w:rPr>
-              <w:t xml:space="preserve">A singleton per Organization: selected provider, model, endpoint URL, API key (never returned by the API), and an enabled flag.</w:t>
             </w:r>
           </w:p>
         </w:tc>
@@ -26321,7 +26527,7 @@
           <w:sz w:val="24"/>
           <w:szCs w:val="24"/>
         </w:rPr>
-        <w:t xml:space="preserve">The full permission matrix (role x permission) is administered live in the application's Permission Matrix screen and comprises 79 permission codes across 25 modules (dashboard, help, fiche, action, rootcause, rex, standard, capitalization, user, role, hierarchy, obs, license, governance, aiUseCase, businessRule, control, riskOpportunity, racsi, bpmn, llmConfig, assistant, report, alert, audit), each with up to five actions (view, create, edit, delete, and module-specific actions such as validate, close, assignTeam, updateOwn, evaluate, manageRoles, managePermissions, manage, export). Section 2.3 summarizes the resulting access per standard role; the live matrix is the system of record.</w:t>
+        <w:t xml:space="preserve">The full permission matrix (role x permission) is administered live in the application's Permission Matrix screen and comprises 80 permission codes across 24 modules (dashboard, help, fiche, action, rootcause, rex, standard, capitalization, user, role, hierarchy, obs, license, governance, aiUseCase, businessRule, control, riskOpportunity, racsi, bpmn, assistant, report, alert, audit), each with up to five actions (view, create, edit, delete, and module-specific actions such as validate, close, assignTeam, updateOwn, evaluate, manageRoles, managePermissions, activate, projectOverride, viewUsageLog, manage, export). Section 2.3 summarizes the resulting access per standard role; the live matrix is the system of record.</w:t>
       </w:r>
     </w:p>
     <w:p>
@@ -30368,7 +30574,7 @@
                 <w:sz w:val="19"/>
                 <w:szCs w:val="19"/>
               </w:rPr>
-              <w:t xml:space="preserve">Large Language Model - the class of AI model that the LLM / AI Provider Configuration module (section 3.23) prepares the system to integrate with; no live LLM call is made by this version.</w:t>
+              <w:t xml:space="preserve">Large Language Model - the class of AI model an AI Use Case may optionally call via a user's own Real LLM Provider Connection (section 3.11), stored only in that user's browser and forwarded once per generation request; every AI Use Case still computes its deterministic result and falls back to it automatically if the live call fails.</w:t>
             </w:r>
           </w:p>
         </w:tc>
@@ -30434,7 +30640,7 @@
                 <w:sz w:val="19"/>
                 <w:szCs w:val="19"/>
               </w:rPr>
-              <w:t xml:space="preserve">The chat-style Q&amp;A feature (section 3.24) offering RBAC-scoped data queries and application-help queries, distinct from both the per-stage AI Agents and the AI Use Cases Library.</w:t>
+              <w:t xml:space="preserve">The chat-style Q&amp;A feature (section 3.23) offering RBAC-scoped data queries and application-help queries, distinct from both the per-stage AI Agents and the AI Use Case Library.</w:t>
             </w:r>
           </w:p>
         </w:tc>
@@ -30468,6 +30674,72 @@
                 <w:sz w:val="19"/>
                 <w:szCs w:val="19"/>
               </w:rPr>
+              <w:t xml:space="preserve">Assistive / Augmented</w:t>
+            </w:r>
+          </w:p>
+        </w:tc>
+        <w:tc>
+          <w:tcPr>
+            <w:tcW w:type="dxa" w:w="7346"/>
+            <w:tcBorders>
+              <w:top w:val="single" w:color="E3E3E4" w:sz="2"/>
+              <w:left w:val="single" w:color="E3E3E4" w:sz="2"/>
+              <w:bottom w:val="single" w:color="E3E3E4" w:sz="2"/>
+              <w:right w:val="single" w:color="E3E3E4" w:sz="2"/>
+            </w:tcBorders>
+            <w:shd w:fill="FFFFFF" w:val="clear"/>
+            <w:tcMar>
+              <w:top w:type="dxa" w:w="80"/>
+              <w:left w:type="dxa" w:w="100"/>
+              <w:bottom w:type="dxa" w:w="80"/>
+              <w:right w:type="dxa" w:w="100"/>
+            </w:tcMar>
+            <w:vAlign w:val="center"/>
+          </w:tcPr>
+          <w:p>
+            <w:r>
+              <w:rPr>
+                <w:rFonts w:ascii="Times New Roman" w:cs="Times New Roman" w:eastAsia="Times New Roman" w:hAnsi="Times New Roman"/>
+                <w:b w:val="false"/>
+                <w:bCs w:val="false"/>
+                <w:color w:val="58595B"/>
+                <w:sz w:val="19"/>
+                <w:szCs w:val="19"/>
+              </w:rPr>
+              <w:t xml:space="preserve">The two AI Use Case tiers (section 3.11): Assistive means the AI only observes/analyzes/suggests while a human performs the task and decision; Augmented means the AI performs a substantial part of the task but a human must review, edit, and approve before it is finalized. A third tier, Autonomous, is explicitly out of scope.</w:t>
+            </w:r>
+          </w:p>
+        </w:tc>
+      </w:tr>
+      <w:tr>
+        <w:tc>
+          <w:tcPr>
+            <w:tcW w:type="dxa" w:w="2400"/>
+            <w:tcBorders>
+              <w:top w:val="single" w:color="E3E3E4" w:sz="2"/>
+              <w:left w:val="single" w:color="E3E3E4" w:sz="2"/>
+              <w:bottom w:val="single" w:color="E3E3E4" w:sz="2"/>
+              <w:right w:val="single" w:color="E3E3E4" w:sz="2"/>
+            </w:tcBorders>
+            <w:shd w:fill="F2F2F3" w:val="clear"/>
+            <w:tcMar>
+              <w:top w:type="dxa" w:w="80"/>
+              <w:left w:type="dxa" w:w="100"/>
+              <w:bottom w:type="dxa" w:w="80"/>
+              <w:right w:type="dxa" w:w="100"/>
+            </w:tcMar>
+            <w:vAlign w:val="center"/>
+          </w:tcPr>
+          <w:p>
+            <w:r>
+              <w:rPr>
+                <w:rFonts w:ascii="Times New Roman" w:cs="Times New Roman" w:eastAsia="Times New Roman" w:hAnsi="Times New Roman"/>
+                <w:b w:val="false"/>
+                <w:bCs w:val="false"/>
+                <w:color w:val="58595B"/>
+                <w:sz w:val="19"/>
+                <w:szCs w:val="19"/>
+              </w:rPr>
               <w:t xml:space="preserve">Multi-Tenant</w:t>
             </w:r>
           </w:p>
@@ -30481,7 +30753,7 @@
               <w:bottom w:val="single" w:color="E3E3E4" w:sz="2"/>
               <w:right w:val="single" w:color="E3E3E4" w:sz="2"/>
             </w:tcBorders>
-            <w:shd w:fill="FFFFFF" w:val="clear"/>
+            <w:shd w:fill="F2F2F3" w:val="clear"/>
             <w:tcMar>
               <w:top w:type="dxa" w:w="80"/>
               <w:left w:type="dxa" w:w="100"/>
@@ -30515,7 +30787,7 @@
               <w:bottom w:val="single" w:color="E3E3E4" w:sz="2"/>
               <w:right w:val="single" w:color="E3E3E4" w:sz="2"/>
             </w:tcBorders>
-            <w:shd w:fill="F2F2F3" w:val="clear"/>
+            <w:shd w:fill="FFFFFF" w:val="clear"/>
             <w:tcMar>
               <w:top w:type="dxa" w:w="80"/>
               <w:left w:type="dxa" w:w="100"/>
@@ -30547,7 +30819,7 @@
               <w:bottom w:val="single" w:color="E3E3E4" w:sz="2"/>
               <w:right w:val="single" w:color="E3E3E4" w:sz="2"/>
             </w:tcBorders>
-            <w:shd w:fill="F2F2F3" w:val="clear"/>
+            <w:shd w:fill="FFFFFF" w:val="clear"/>
             <w:tcMar>
               <w:top w:type="dxa" w:w="80"/>
               <w:left w:type="dxa" w:w="100"/>

</xml_diff>